<commit_message>
feat: Implementar lan├ºamento de notas em massa no Django Admin
</commit_message>
<xml_diff>
--- a/docs/TCC-PAP-Projecto-Fim-Curso-Gestao-Declaracao.docx
+++ b/docs/TCC-PAP-Projecto-Fim-Curso-Gestao-Declaracao.docx
@@ -2086,12 +2086,14 @@
         <w:rPr>
           <w:rFonts w:cs="Arial"/>
           <w:color w:val="000000" w:themeColor="text1"/>
+          <w:lang w:val="en-US"/>
         </w:rPr>
       </w:pPr>
       <w:r>
         <w:rPr>
           <w:rFonts w:cs="Arial"/>
           <w:color w:val="000000" w:themeColor="text1"/>
+          <w:lang w:val="en-US"/>
         </w:rPr>
         <w:t>UX</w:t>
       </w:r>
@@ -2099,6 +2101,7 @@
         <w:rPr>
           <w:rFonts w:cs="Arial"/>
           <w:color w:val="000000" w:themeColor="text1"/>
+          <w:lang w:val="en-US"/>
         </w:rPr>
         <w:tab/>
       </w:r>
@@ -2106,6 +2109,7 @@
         <w:rPr>
           <w:rFonts w:cs="Arial"/>
           <w:color w:val="000000" w:themeColor="text1"/>
+          <w:lang w:val="en-US"/>
         </w:rPr>
         <w:tab/>
         <w:t>Expires User</w:t>
@@ -2116,12 +2120,14 @@
         <w:rPr>
           <w:rFonts w:cs="Arial"/>
           <w:color w:val="000000" w:themeColor="text1"/>
+          <w:lang w:val="en-US"/>
         </w:rPr>
       </w:pPr>
       <w:r>
         <w:rPr>
           <w:rFonts w:cs="Arial"/>
           <w:color w:val="000000" w:themeColor="text1"/>
+          <w:lang w:val="en-US"/>
         </w:rPr>
         <w:t>HTML</w:t>
       </w:r>
@@ -2129,6 +2135,7 @@
         <w:rPr>
           <w:rFonts w:cs="Arial"/>
           <w:color w:val="000000" w:themeColor="text1"/>
+          <w:lang w:val="en-US"/>
         </w:rPr>
         <w:tab/>
       </w:r>
@@ -2136,15 +2143,27 @@
         <w:rPr>
           <w:rFonts w:cs="Arial"/>
           <w:color w:val="000000" w:themeColor="text1"/>
+          <w:lang w:val="en-US"/>
         </w:rPr>
         <w:tab/>
       </w:r>
+      <w:proofErr w:type="spellStart"/>
       <w:r>
         <w:rPr>
           <w:rFonts w:cs="Arial"/>
           <w:color w:val="000000" w:themeColor="text1"/>
-        </w:rPr>
-        <w:t>HyperText Markup Language</w:t>
+          <w:lang w:val="en-US"/>
+        </w:rPr>
+        <w:t>HyperText</w:t>
+      </w:r>
+      <w:proofErr w:type="spellEnd"/>
+      <w:r>
+        <w:rPr>
+          <w:rFonts w:cs="Arial"/>
+          <w:color w:val="000000" w:themeColor="text1"/>
+          <w:lang w:val="en-US"/>
+        </w:rPr>
+        <w:t xml:space="preserve"> Markup Language</w:t>
       </w:r>
     </w:p>
     <w:p>
@@ -2253,6 +2272,7 @@
       <w:pPr>
         <w:rPr>
           <w:rFonts w:cs="Arial"/>
+          <w:lang w:val="en-US"/>
         </w:rPr>
       </w:pPr>
       <w:r>
@@ -2282,6 +2302,7 @@
       <w:pPr>
         <w:rPr>
           <w:rFonts w:cs="Arial"/>
+          <w:lang w:val="en-US"/>
         </w:rPr>
       </w:pPr>
     </w:p>
@@ -2418,13 +2439,7 @@
         <w:rPr>
           <w:rFonts w:cs="Arial"/>
         </w:rPr>
-        <w:t xml:space="preserve"> </w:t>
-      </w:r>
-      <w:r>
-        <w:rPr>
-          <w:rFonts w:cs="Arial"/>
-        </w:rPr>
-        <w:t>localizada no Icolo e Bengo, municipio do Sequele na Comuna do Kifangondo bairro Maiombe</w:t>
+        <w:t xml:space="preserve"> localizada no Icolo e Bengo, municipio do Sequele na Comuna do Kifangondo bairro Maiombe</w:t>
       </w:r>
       <w:r>
         <w:rPr>
@@ -4998,19 +5013,7 @@
         <w:rPr>
           <w:rFonts w:cs="Arial"/>
         </w:rPr>
-        <w:t xml:space="preserve">O presente trabalho caracteriza-se como um estudo de caso, uma vez que foi desenvolvido com base na análise de uma situação real e específica, neste caso, a </w:t>
-      </w:r>
-      <w:r>
-        <w:rPr>
-          <w:rFonts w:cs="Arial"/>
-        </w:rPr>
-        <w:t>Secretaria</w:t>
-      </w:r>
-      <w:r>
-        <w:rPr>
-          <w:rFonts w:cs="Arial"/>
-        </w:rPr>
-        <w:t xml:space="preserve"> do Instituto Politécnico do Maiombe (IPM). O estudo de caso permite analisar profundamente um determinado ambiente, considerando suas características, limitações e necessidades reais</w:t>
+        <w:t>O presente trabalho caracteriza-se como um estudo de caso, uma vez que foi desenvolvido com base na análise de uma situação real e específica, neste caso, a Secretaria do Instituto Politécnico do Maiombe (IPM). O estudo de caso permite analisar profundamente um determinado ambiente, considerando suas características, limitações e necessidades reais</w:t>
       </w:r>
       <w:r>
         <w:rPr>
@@ -5210,98 +5213,361 @@
         <w:lastRenderedPageBreak/>
         <w:t>posteriormente analisados de forma qualitativa, categorizando os principais problemas, e quantitativa, permitindo medir a frequência dos desafios identificados.</w:t>
       </w:r>
-      <w:r>
-        <w:rPr>
-          <w:rFonts w:cs="Arial"/>
-        </w:rPr>
-        <w:br w:type="page"/>
-      </w:r>
-    </w:p>
-    <w:p>
-      <w:pPr>
-        <w:rPr>
-          <w:rFonts w:cs="Arial"/>
-          <w:b/>
-        </w:rPr>
-      </w:pPr>
-      <w:r>
-        <w:rPr>
-          <w:rFonts w:cs="Arial"/>
-          <w:b/>
+    </w:p>
+    <w:p>
+      <w:pPr>
+        <w:rPr>
+          <w:rFonts w:cs="Arial"/>
+        </w:rPr>
+      </w:pPr>
+      <w:r>
+        <w:rPr>
+          <w:rFonts w:cs="Arial"/>
+        </w:rPr>
+        <w:t xml:space="preserve">Foram realizadas entrevistas com </w:t>
+      </w:r>
+      <w:r>
+        <w:rPr>
+          <w:rFonts w:cs="Arial"/>
+        </w:rPr>
+        <w:t>a secretária do Instituto Politécnico do Maiombe, no horário de expediente,</w:t>
+      </w:r>
+      <w:r>
+        <w:rPr>
+          <w:rFonts w:cs="Arial"/>
+        </w:rPr>
+        <w:t xml:space="preserve"> com o objetivo de </w:t>
+      </w:r>
+      <w:r>
+        <w:rPr>
+          <w:rFonts w:cs="Arial"/>
+        </w:rPr>
+        <w:t xml:space="preserve">recolher informações e </w:t>
+      </w:r>
+      <w:r>
+        <w:rPr>
+          <w:rFonts w:cs="Arial"/>
+        </w:rPr>
+        <w:t xml:space="preserve">compreender o </w:t>
+      </w:r>
+      <w:r>
+        <w:rPr>
+          <w:rFonts w:cs="Arial"/>
+        </w:rPr>
+        <w:t>fluxo das actividades que levam a elaboração de uma declaração. Com a entrevista foi possível identificar as dificuldades enfretadas pela instituição no processo de emissão de declarações</w:t>
+      </w:r>
+      <w:r>
+        <w:rPr>
+          <w:rFonts w:cs="Arial"/>
+        </w:rPr>
+        <w:t>.</w:t>
+      </w:r>
+    </w:p>
+    <w:p>
+      <w:pPr>
+        <w:pStyle w:val="Heading2"/>
+        <w:rPr>
+          <w:rStyle w:val="Strong"/>
+          <w:rFonts w:eastAsia="Times New Roman" w:cs="Arial"/>
+          <w:color w:val="auto"/>
+          <w:sz w:val="28"/>
+          <w:szCs w:val="27"/>
+          <w:lang w:eastAsia="pt-PT"/>
+        </w:rPr>
+      </w:pPr>
+      <w:r>
+        <w:rPr>
+          <w:rStyle w:val="Strong"/>
+          <w:rFonts w:eastAsia="Times New Roman" w:cs="Arial"/>
+          <w:color w:val="auto"/>
+          <w:sz w:val="28"/>
+          <w:szCs w:val="27"/>
+          <w:lang w:eastAsia="pt-PT"/>
+        </w:rPr>
+        <w:t xml:space="preserve">2.4 </w:t>
+      </w:r>
+      <w:r>
+        <w:rPr>
+          <w:rStyle w:val="Strong"/>
+          <w:rFonts w:eastAsia="Times New Roman" w:cs="Arial"/>
+          <w:color w:val="auto"/>
+          <w:sz w:val="28"/>
+          <w:szCs w:val="27"/>
+          <w:lang w:eastAsia="pt-PT"/>
+        </w:rPr>
+        <w:t>Metodologia de Desenvolvimento do Sistema</w:t>
+      </w:r>
+    </w:p>
+    <w:p>
+      <w:pPr>
+        <w:pStyle w:val="NormalWeb"/>
+        <w:spacing w:line="360" w:lineRule="auto"/>
+        <w:ind w:firstLine="708"/>
+        <w:jc w:val="both"/>
+        <w:rPr>
+          <w:rFonts w:ascii="Arial" w:hAnsi="Arial" w:cs="Arial"/>
+        </w:rPr>
+      </w:pPr>
+      <w:r>
+        <w:rPr>
+          <w:rFonts w:ascii="Arial" w:hAnsi="Arial" w:cs="Arial"/>
+        </w:rPr>
+        <w:t xml:space="preserve">No desenvolvimento do sistema, foram realizadas várias fases, que permitiram que o sistema fosse terminado com sucesso e que resolvesse o problema identificado. Essas </w:t>
+      </w:r>
+      <w:r>
+        <w:rPr>
+          <w:rFonts w:ascii="Arial" w:hAnsi="Arial" w:cs="Arial"/>
+        </w:rPr>
+        <w:t>fases</w:t>
+      </w:r>
+      <w:r>
+        <w:rPr>
+          <w:rFonts w:ascii="Arial" w:hAnsi="Arial" w:cs="Arial"/>
+        </w:rPr>
+        <w:t xml:space="preserve"> foram:</w:t>
+      </w:r>
+    </w:p>
+    <w:p>
+      <w:pPr>
+        <w:pStyle w:val="NormalWeb"/>
+        <w:spacing w:line="360" w:lineRule="auto"/>
+        <w:jc w:val="both"/>
+        <w:rPr>
+          <w:rFonts w:ascii="Arial" w:hAnsi="Arial" w:cs="Arial"/>
+          <w:b/>
+        </w:rPr>
+      </w:pPr>
+      <w:r>
+        <w:rPr>
+          <w:rFonts w:ascii="Arial" w:hAnsi="Arial" w:cs="Arial"/>
+          <w:b/>
+        </w:rPr>
+        <w:t>Análise</w:t>
+      </w:r>
+      <w:r>
+        <w:rPr>
+          <w:rFonts w:ascii="Arial" w:hAnsi="Arial" w:cs="Arial"/>
+          <w:b/>
+        </w:rPr>
+        <w:t xml:space="preserve"> e Levantamento de Requisitos</w:t>
+      </w:r>
+    </w:p>
+    <w:p>
+      <w:pPr>
+        <w:pStyle w:val="NormalWeb"/>
+        <w:spacing w:line="360" w:lineRule="auto"/>
+        <w:ind w:firstLine="708"/>
+        <w:jc w:val="both"/>
+        <w:rPr>
+          <w:rFonts w:ascii="Arial" w:hAnsi="Arial" w:cs="Arial"/>
+        </w:rPr>
+      </w:pPr>
+      <w:r>
+        <w:rPr>
+          <w:rFonts w:ascii="Arial" w:hAnsi="Arial" w:cs="Arial"/>
+        </w:rPr>
+        <w:t xml:space="preserve">Nesta fase, nosso foco foi em entender o problema, e encontrar a solução para o mesmo, essa foi uma fase muito importante que nos permitiu identificar a forma mais eficiente para resolver o problema da gestão das declarações, Nela foram realizadas várias atividades como: </w:t>
+      </w:r>
+    </w:p>
+    <w:p>
+      <w:pPr>
+        <w:pStyle w:val="NormalWeb"/>
+        <w:numPr>
+          <w:ilvl w:val="0"/>
+          <w:numId w:val="3"/>
+        </w:numPr>
+        <w:spacing w:line="360" w:lineRule="auto"/>
+        <w:jc w:val="both"/>
+        <w:rPr>
+          <w:rFonts w:ascii="Arial" w:hAnsi="Arial" w:cs="Arial"/>
+        </w:rPr>
+      </w:pPr>
+      <w:r>
+        <w:rPr>
+          <w:rFonts w:ascii="Arial" w:hAnsi="Arial" w:cs="Arial"/>
+        </w:rPr>
+        <w:t>Identificação dos Requisitos Funcionais e Não Funcionais;</w:t>
+      </w:r>
+    </w:p>
+    <w:p>
+      <w:pPr>
+        <w:pStyle w:val="NormalWeb"/>
+        <w:numPr>
+          <w:ilvl w:val="0"/>
+          <w:numId w:val="3"/>
+        </w:numPr>
+        <w:spacing w:line="360" w:lineRule="auto"/>
+        <w:jc w:val="both"/>
+        <w:rPr>
+          <w:rFonts w:ascii="Arial" w:hAnsi="Arial" w:cs="Arial"/>
+        </w:rPr>
+      </w:pPr>
+      <w:r>
+        <w:rPr>
+          <w:rFonts w:ascii="Arial" w:hAnsi="Arial" w:cs="Arial"/>
+        </w:rPr>
+        <w:t>Escolha das Stack para o desenvolvimento da solução;</w:t>
+      </w:r>
+    </w:p>
+    <w:p>
+      <w:pPr>
+        <w:pStyle w:val="NormalWeb"/>
+        <w:numPr>
+          <w:ilvl w:val="0"/>
+          <w:numId w:val="3"/>
+        </w:numPr>
+        <w:spacing w:line="360" w:lineRule="auto"/>
+        <w:jc w:val="both"/>
+        <w:rPr>
+          <w:rFonts w:ascii="Arial" w:hAnsi="Arial" w:cs="Arial"/>
+        </w:rPr>
+      </w:pPr>
+      <w:r>
+        <w:rPr>
+          <w:rFonts w:ascii="Arial" w:hAnsi="Arial" w:cs="Arial"/>
+        </w:rPr>
+        <w:t>Escolha da arquitectura do sistema.</w:t>
+      </w:r>
+    </w:p>
+    <w:p>
+      <w:pPr>
+        <w:pStyle w:val="NormalWeb"/>
+        <w:spacing w:line="360" w:lineRule="auto"/>
+        <w:ind w:firstLine="708"/>
+        <w:jc w:val="both"/>
+        <w:rPr>
+          <w:rFonts w:ascii="Arial" w:hAnsi="Arial" w:cs="Arial"/>
+        </w:rPr>
+      </w:pPr>
+      <w:r>
+        <w:rPr>
+          <w:rFonts w:ascii="Arial" w:hAnsi="Arial" w:cs="Arial"/>
+        </w:rPr>
+        <w:t>Modelagem dos Dados</w:t>
+      </w:r>
+    </w:p>
+    <w:p>
+      <w:pPr>
+        <w:pStyle w:val="NormalWeb"/>
+        <w:spacing w:line="360" w:lineRule="auto"/>
+        <w:ind w:firstLine="708"/>
+        <w:jc w:val="both"/>
+        <w:rPr>
+          <w:rFonts w:ascii="Arial" w:hAnsi="Arial" w:cs="Arial"/>
+        </w:rPr>
+      </w:pPr>
+      <w:r>
+        <w:rPr>
+          <w:rFonts w:ascii="Arial" w:hAnsi="Arial" w:cs="Arial"/>
+        </w:rPr>
+        <w:t>Foi nesta fase que se realizou a modelagem do banco de dados do sistema e teste para saber se o banco de dados consegue suprir as necessidades do sistema.</w:t>
+      </w:r>
+    </w:p>
+    <w:p>
+      <w:pPr>
+        <w:pStyle w:val="NormalWeb"/>
+        <w:spacing w:line="360" w:lineRule="auto"/>
+        <w:ind w:firstLine="708"/>
+        <w:jc w:val="both"/>
+        <w:rPr>
+          <w:rFonts w:ascii="Arial" w:hAnsi="Arial" w:cs="Arial"/>
+          <w:b/>
+        </w:rPr>
+      </w:pPr>
+      <w:r>
+        <w:rPr>
+          <w:rFonts w:ascii="Arial" w:hAnsi="Arial" w:cs="Arial"/>
+          <w:b/>
+        </w:rPr>
+        <w:t>Desenvolvimento</w:t>
+      </w:r>
+      <w:r>
+        <w:rPr>
+          <w:rFonts w:ascii="Arial" w:hAnsi="Arial" w:cs="Arial"/>
+          <w:b/>
+        </w:rPr>
+        <w:t xml:space="preserve"> Backend</w:t>
+      </w:r>
+    </w:p>
+    <w:p>
+      <w:pPr>
+        <w:pStyle w:val="NormalWeb"/>
+        <w:spacing w:line="360" w:lineRule="auto"/>
+        <w:ind w:firstLine="708"/>
+        <w:jc w:val="both"/>
+        <w:rPr>
+          <w:rFonts w:ascii="Arial" w:hAnsi="Arial" w:cs="Arial"/>
+        </w:rPr>
+      </w:pPr>
+      <w:r>
+        <w:rPr>
+          <w:rFonts w:ascii="Arial" w:hAnsi="Arial" w:cs="Arial"/>
+        </w:rPr>
+        <w:t>Nesta fase realizou-se o desenvolvimento do sistema, criação da lógica, da API, e integração do backend com o banco de dados.</w:t>
+      </w:r>
+    </w:p>
+    <w:p>
+      <w:pPr>
+        <w:pStyle w:val="NormalWeb"/>
+        <w:spacing w:line="360" w:lineRule="auto"/>
+        <w:ind w:firstLine="708"/>
+        <w:jc w:val="both"/>
+        <w:rPr>
+          <w:rFonts w:ascii="Arial" w:hAnsi="Arial" w:cs="Arial"/>
+          <w:b/>
+        </w:rPr>
+      </w:pPr>
+      <w:r>
+        <w:rPr>
+          <w:rFonts w:ascii="Arial" w:hAnsi="Arial" w:cs="Arial"/>
+          <w:b/>
+        </w:rPr>
+        <w:t>Desenvolvimento</w:t>
+      </w:r>
+      <w:r>
+        <w:rPr>
+          <w:rFonts w:ascii="Arial" w:hAnsi="Arial" w:cs="Arial"/>
+          <w:b/>
+        </w:rPr>
+        <w:t xml:space="preserve"> </w:t>
+      </w:r>
+      <w:r>
+        <w:rPr>
+          <w:rFonts w:ascii="Arial" w:hAnsi="Arial" w:cs="Arial"/>
+          <w:b/>
+        </w:rPr>
+        <w:t>Frontend</w:t>
+      </w:r>
+    </w:p>
+    <w:p>
+      <w:pPr>
+        <w:pStyle w:val="NormalWeb"/>
+        <w:spacing w:line="360" w:lineRule="auto"/>
+        <w:ind w:firstLine="708"/>
+        <w:jc w:val="both"/>
+        <w:rPr>
+          <w:rFonts w:ascii="Arial" w:hAnsi="Arial" w:cs="Arial"/>
+        </w:rPr>
+      </w:pPr>
+      <w:r>
+        <w:rPr>
+          <w:rFonts w:ascii="Arial" w:hAnsi="Arial" w:cs="Arial"/>
         </w:rPr>
         <w:lastRenderedPageBreak/>
-        <w:t>Entrevista</w:t>
-      </w:r>
-    </w:p>
-    <w:p>
-      <w:pPr>
-        <w:rPr>
-          <w:rFonts w:cs="Arial"/>
-        </w:rPr>
-      </w:pPr>
-      <w:r>
-        <w:rPr>
-          <w:rFonts w:cs="Arial"/>
-        </w:rPr>
-        <w:t xml:space="preserve">Foram realizadas entrevistas com </w:t>
-      </w:r>
-      <w:r>
-        <w:rPr>
-          <w:rFonts w:cs="Arial"/>
-          <w:b/>
-          <w:bCs/>
-        </w:rPr>
-        <w:t>vendedores e responsáveis pela cantina</w:t>
-      </w:r>
-      <w:r>
-        <w:rPr>
-          <w:rFonts w:cs="Arial"/>
-        </w:rPr>
-        <w:t>, com o objetivo de compreender o funcionamento atual do processo de vendas. Durante as entrevistas, foram abordados aspectos como a forma de registro das vendas, o controlo do estoque, as principais dificuldades enfrentadas e a aceitação de um sistema informatizado.</w:t>
-      </w:r>
-    </w:p>
-    <w:p>
-      <w:pPr>
-        <w:rPr>
-          <w:rFonts w:cs="Arial"/>
-        </w:rPr>
-      </w:pPr>
-      <w:r>
-        <w:rPr>
-          <w:rFonts w:cs="Arial"/>
-        </w:rPr>
-        <w:t>Segundo Prodanov e Freitas (2013), a entrevista é uma técnica eficaz para recolher informações detalhadas diretamente das pessoas envolvidas no processo estudado.</w:t>
-      </w:r>
-    </w:p>
-    <w:p>
-      <w:pPr>
-        <w:rPr>
-          <w:rFonts w:cs="Arial"/>
-        </w:rPr>
-      </w:pPr>
-    </w:p>
-    <w:p>
-      <w:pPr>
-        <w:rPr>
-          <w:rFonts w:cs="Arial"/>
-          <w:lang w:val="pt-AO"/>
-        </w:rPr>
-      </w:pPr>
-      <w:r>
-        <w:rPr>
-          <w:rFonts w:cs="Arial"/>
-          <w:lang w:val="pt-AO"/>
-        </w:rPr>
-        <w:t>CONCEITOS: TIPOS DE PESQUISAS ABORDAGEM DA PESQUISA, TECNICA DE RECOLHA DE DADOS, FERRAMENTAS UTILIZADAS NA PESQUISA, METODOLOGIA DE DESENVOLVIMENTO DO SISTEMA, CONSIDERAÇÕES FINAIS DA METODOLOGIA</w:t>
-      </w:r>
-    </w:p>
-    <w:p>
-      <w:pPr>
-        <w:rPr>
-          <w:rFonts w:cs="Arial"/>
-          <w:lang w:val="pt-AO"/>
-        </w:rPr>
-      </w:pPr>
+        <w:t>Nesta fase realizou-se o desenvolvimento d</w:t>
+      </w:r>
+      <w:r>
+        <w:rPr>
+          <w:rFonts w:ascii="Arial" w:hAnsi="Arial" w:cs="Arial"/>
+        </w:rPr>
+        <w:t>as interfaces dos sistema</w:t>
+      </w:r>
+      <w:r>
+        <w:rPr>
+          <w:rFonts w:ascii="Arial" w:hAnsi="Arial" w:cs="Arial"/>
+        </w:rPr>
+        <w:t>, as interfaces foram desenvolvidas pensado em uma melhor acessibilidade para os usuário, pensado não só na UI mas também na UX, com o objecto de dar uma experiência satisfatória ao usuário.</w:t>
+      </w:r>
     </w:p>
     <w:p>
       <w:pPr>
@@ -5354,21 +5620,610 @@
     </w:p>
     <w:p>
       <w:pPr>
-        <w:rPr>
-          <w:rFonts w:cs="Arial"/>
-          <w:lang w:val="pt-AO"/>
-        </w:rPr>
-      </w:pPr>
-      <w:r>
-        <w:rPr>
-          <w:rFonts w:cs="Arial"/>
-          <w:lang w:val="pt-AO"/>
-        </w:rPr>
-        <w:t>APRESENTACAO DO SISTEMA,</w:t>
-      </w:r>
-    </w:p>
-    <w:p>
-      <w:pPr>
+        <w:ind w:firstLine="0"/>
+        <w:jc w:val="left"/>
+        <w:rPr>
+          <w:rFonts w:cs="Arial"/>
+          <w:lang w:val="pt-AO"/>
+        </w:rPr>
+      </w:pPr>
+      <w:r>
+        <w:rPr>
+          <w:rFonts w:cs="Arial"/>
+          <w:lang w:val="pt-AO"/>
+        </w:rPr>
+        <w:br w:type="page"/>
+      </w:r>
+    </w:p>
+    <w:p>
+      <w:pPr>
+        <w:rPr>
+          <w:rFonts w:cs="Arial"/>
+          <w:lang w:val="pt-AO"/>
+        </w:rPr>
+      </w:pPr>
+      <w:r>
+        <w:rPr>
+          <w:rFonts w:cs="Arial"/>
+          <w:lang w:val="pt-AO"/>
+        </w:rPr>
+        <w:lastRenderedPageBreak/>
+        <w:t>APRESENTACAO DO SISTEMA</w:t>
+      </w:r>
+    </w:p>
+    <w:p>
+      <w:pPr>
+        <w:rPr>
+          <w:rFonts w:cs="Arial"/>
+          <w:lang w:val="pt-AO"/>
+        </w:rPr>
+      </w:pPr>
+      <w:r>
+        <w:rPr>
+          <w:rFonts w:cs="Arial"/>
+          <w:lang w:val="pt-AO"/>
+        </w:rPr>
+        <w:t>O sistema de Gestão de Declarações escolares é um software web desenvolvido com o intuito de aprimorar a eficiência nos processos de solicitações de declarações ao instituto, o sistema foi desenvolvido com base em uma stack muito forte, garantindo segurança performance e robustez.</w:t>
+      </w:r>
+    </w:p>
+    <w:p>
+      <w:pPr>
+        <w:rPr>
+          <w:rFonts w:cs="Arial"/>
+          <w:lang w:val="pt-AO"/>
+        </w:rPr>
+      </w:pPr>
+      <w:r>
+        <w:rPr>
+          <w:rFonts w:cs="Arial"/>
+          <w:lang w:val="pt-AO"/>
+        </w:rPr>
+        <w:t>O sistema possui três niveis de acesso, garantido organização, segurança e estabilidade:</w:t>
+      </w:r>
+    </w:p>
+    <w:p>
+      <w:pPr>
+        <w:rPr>
+          <w:rFonts w:cs="Arial"/>
+          <w:lang w:val="pt-AO"/>
+        </w:rPr>
+      </w:pPr>
+      <w:r>
+        <w:rPr>
+          <w:rFonts w:cs="Arial"/>
+          <w:lang w:val="pt-AO"/>
+        </w:rPr>
+        <w:t>Alunos: o seu acesso limita-se em visualizar seu dados, realizar solicitações, acessesar aos seus documentos</w:t>
+      </w:r>
+    </w:p>
+    <w:p>
+      <w:pPr>
+        <w:rPr>
+          <w:rFonts w:cs="Arial"/>
+          <w:lang w:val="pt-AO"/>
+        </w:rPr>
+      </w:pPr>
+      <w:r>
+        <w:rPr>
+          <w:rFonts w:cs="Arial"/>
+          <w:lang w:val="pt-AO"/>
+        </w:rPr>
+        <w:t>Encarregados: seu nível de acesso permite monitorar seus educandos</w:t>
+      </w:r>
+      <w:r>
+        <w:rPr>
+          <w:rFonts w:cs="Arial"/>
+          <w:lang w:val="pt-AO"/>
+        </w:rPr>
+        <w:t xml:space="preserve"> </w:t>
+      </w:r>
+      <w:r>
+        <w:rPr>
+          <w:rFonts w:cs="Arial"/>
+          <w:lang w:val="pt-AO"/>
+        </w:rPr>
+        <w:t xml:space="preserve"> acompanha</w:t>
+      </w:r>
+      <w:r>
+        <w:rPr>
+          <w:rFonts w:cs="Arial"/>
+          <w:lang w:val="pt-AO"/>
+        </w:rPr>
+        <w:t xml:space="preserve">ndo seu </w:t>
+      </w:r>
+      <w:r>
+        <w:rPr>
+          <w:rFonts w:cs="Arial"/>
+          <w:lang w:val="pt-AO"/>
+        </w:rPr>
+        <w:t xml:space="preserve"> desempenho academico</w:t>
+      </w:r>
+      <w:r>
+        <w:rPr>
+          <w:rFonts w:cs="Arial"/>
+          <w:lang w:val="pt-AO"/>
+        </w:rPr>
+        <w:t xml:space="preserve"> </w:t>
+      </w:r>
+      <w:r>
+        <w:rPr>
+          <w:rFonts w:cs="Arial"/>
+          <w:lang w:val="pt-AO"/>
+        </w:rPr>
+        <w:t xml:space="preserve">e </w:t>
+      </w:r>
+      <w:r>
+        <w:rPr>
+          <w:rFonts w:cs="Arial"/>
+          <w:lang w:val="pt-AO"/>
+        </w:rPr>
+        <w:t>realizar soli</w:t>
+      </w:r>
+      <w:r>
+        <w:rPr>
+          <w:rFonts w:cs="Arial"/>
+          <w:lang w:val="pt-AO"/>
+        </w:rPr>
+        <w:t>citações por parte dos seus educandos.</w:t>
+      </w:r>
+    </w:p>
+    <w:p>
+      <w:pPr>
+        <w:rPr>
+          <w:rFonts w:cs="Arial"/>
+          <w:lang w:val="pt-AO"/>
+        </w:rPr>
+      </w:pPr>
+      <w:r>
+        <w:rPr>
+          <w:rFonts w:cs="Arial"/>
+          <w:lang w:val="pt-AO"/>
+        </w:rPr>
+        <w:t>Administradores (Secretário, Direitores)</w:t>
+      </w:r>
+      <w:r>
+        <w:rPr>
+          <w:rFonts w:cs="Arial"/>
+          <w:lang w:val="pt-AO"/>
+        </w:rPr>
+        <w:t>: responsáveis pelo gerenciamento dos dados que circulam pelo sistema, e pelo monitoramento das actividades dos usuarios, podendo também realizar solicitações a pedido de alunos ou encarregados.</w:t>
+      </w:r>
+    </w:p>
+    <w:p>
+      <w:pPr>
+        <w:rPr>
+          <w:rFonts w:cs="Arial"/>
+          <w:b/>
+          <w:bCs/>
+          <w:lang w:val="pt-AO"/>
+        </w:rPr>
+      </w:pPr>
+      <w:r>
+        <w:rPr>
+          <w:rFonts w:cs="Arial"/>
+          <w:b/>
+          <w:bCs/>
+          <w:lang w:val="pt-AO"/>
+        </w:rPr>
+        <w:t>Funcionalidades</w:t>
+      </w:r>
+    </w:p>
+    <w:p>
+      <w:pPr>
+        <w:ind w:firstLine="0"/>
+        <w:rPr>
+          <w:rFonts w:cs="Arial"/>
+          <w:lang w:val="pt-AO"/>
+        </w:rPr>
+      </w:pPr>
+      <w:r>
+        <w:rPr>
+          <w:rFonts w:cs="Arial"/>
+          <w:lang w:val="pt-AO"/>
+        </w:rPr>
+        <w:t>O sistema desenpenha diversas funções:</w:t>
+      </w:r>
+    </w:p>
+    <w:p>
+      <w:pPr>
+        <w:ind w:firstLine="0"/>
+        <w:rPr>
+          <w:rFonts w:cs="Arial"/>
+          <w:lang w:val="pt-AO"/>
+        </w:rPr>
+      </w:pPr>
+      <w:r>
+        <w:rPr>
+          <w:rFonts w:cs="Arial"/>
+          <w:lang w:val="pt-AO"/>
+        </w:rPr>
+        <w:t>Listagem das solicitações de documentos</w:t>
+      </w:r>
+    </w:p>
+    <w:p>
+      <w:pPr>
+        <w:ind w:firstLine="0"/>
+        <w:rPr>
+          <w:rFonts w:cs="Arial"/>
+          <w:lang w:val="pt-AO"/>
+        </w:rPr>
+      </w:pPr>
+      <w:r>
+        <w:rPr>
+          <w:rFonts w:cs="Arial"/>
+          <w:lang w:val="pt-AO"/>
+        </w:rPr>
+        <w:t>Geração de relatórios</w:t>
+      </w:r>
+    </w:p>
+    <w:p>
+      <w:pPr>
+        <w:ind w:firstLine="0"/>
+        <w:rPr>
+          <w:rFonts w:cs="Arial"/>
+          <w:lang w:val="pt-AO"/>
+        </w:rPr>
+      </w:pPr>
+      <w:r>
+        <w:rPr>
+          <w:rFonts w:cs="Arial"/>
+          <w:lang w:val="pt-AO"/>
+        </w:rPr>
+        <w:t>Login com niveis de acessos distintos</w:t>
+      </w:r>
+    </w:p>
+    <w:p>
+      <w:pPr>
+        <w:ind w:firstLine="0"/>
+        <w:rPr>
+          <w:rFonts w:cs="Arial"/>
+          <w:lang w:val="pt-AO"/>
+        </w:rPr>
+      </w:pPr>
+      <w:r>
+        <w:rPr>
+          <w:rFonts w:cs="Arial"/>
+          <w:lang w:val="pt-AO"/>
+        </w:rPr>
+        <w:t>Emissão de declarações</w:t>
+      </w:r>
+    </w:p>
+    <w:p>
+      <w:pPr>
+        <w:ind w:firstLine="0"/>
+        <w:rPr>
+          <w:rFonts w:cs="Arial"/>
+          <w:lang w:val="pt-AO"/>
+        </w:rPr>
+      </w:pPr>
+      <w:r>
+        <w:rPr>
+          <w:rFonts w:cs="Arial"/>
+          <w:lang w:val="pt-AO"/>
+        </w:rPr>
+        <w:t>Listagens dos históricos de logins e logouts</w:t>
+      </w:r>
+    </w:p>
+    <w:p>
+      <w:pPr>
+        <w:ind w:firstLine="0"/>
+        <w:rPr>
+          <w:rFonts w:cs="Arial"/>
+          <w:lang w:val="pt-AO"/>
+        </w:rPr>
+      </w:pPr>
+      <w:r>
+        <w:rPr>
+          <w:rFonts w:cs="Arial"/>
+          <w:lang w:val="pt-AO"/>
+        </w:rPr>
+        <w:t>Monitoramento dos educandos</w:t>
+      </w:r>
+    </w:p>
+    <w:p>
+      <w:pPr>
+        <w:ind w:firstLine="0"/>
+        <w:rPr>
+          <w:rFonts w:cs="Arial"/>
+          <w:lang w:val="pt-AO"/>
+        </w:rPr>
+      </w:pPr>
+      <w:r>
+        <w:rPr>
+          <w:rFonts w:cs="Arial"/>
+          <w:lang w:val="pt-AO"/>
+        </w:rPr>
+        <w:t>Geração de Cópias de Segurança</w:t>
+      </w:r>
+    </w:p>
+    <w:p>
+      <w:pPr>
+        <w:ind w:firstLine="0"/>
+        <w:rPr>
+          <w:rFonts w:cs="Arial"/>
+          <w:lang w:val="pt-AO"/>
+        </w:rPr>
+      </w:pPr>
+      <w:r>
+        <w:rPr>
+          <w:rFonts w:cs="Arial"/>
+          <w:b/>
+          <w:bCs/>
+          <w:lang w:val="pt-AO"/>
+        </w:rPr>
+        <w:t>Requisistos do sisitem</w:t>
+      </w:r>
+      <w:r>
+        <w:rPr>
+          <w:rFonts w:cs="Arial"/>
+          <w:b/>
+          <w:bCs/>
+          <w:lang w:val="pt-AO"/>
+        </w:rPr>
+        <w:t>a</w:t>
+      </w:r>
+    </w:p>
+    <w:p>
+      <w:pPr>
+        <w:ind w:firstLine="0"/>
+        <w:rPr>
+          <w:rFonts w:cs="Arial"/>
+          <w:lang w:val="pt-AO"/>
+        </w:rPr>
+      </w:pPr>
+      <w:r>
+        <w:rPr>
+          <w:rFonts w:cs="Arial"/>
+          <w:lang w:val="pt-AO"/>
+        </w:rPr>
+        <w:t>Funcionais</w:t>
+      </w:r>
+    </w:p>
+    <w:p>
+      <w:pPr>
+        <w:ind w:firstLine="0"/>
+        <w:rPr>
+          <w:rFonts w:cs="Arial"/>
+          <w:lang w:val="pt-AO"/>
+        </w:rPr>
+      </w:pPr>
+      <w:r>
+        <w:rPr>
+          <w:rFonts w:cs="Arial"/>
+          <w:lang w:val="pt-AO"/>
+        </w:rPr>
+        <w:t>Não Funcionais</w:t>
+      </w:r>
+    </w:p>
+    <w:p>
+      <w:pPr>
+        <w:pStyle w:val="NormalWeb"/>
+        <w:spacing w:line="360" w:lineRule="auto"/>
+        <w:ind w:firstLine="708"/>
+        <w:jc w:val="both"/>
+        <w:rPr>
+          <w:rFonts w:ascii="Arial" w:hAnsi="Arial" w:cs="Arial"/>
+          <w:bCs/>
+        </w:rPr>
+      </w:pPr>
+      <w:r>
+        <w:rPr>
+          <w:rFonts w:ascii="Arial" w:hAnsi="Arial" w:cs="Arial"/>
+          <w:b/>
+          <w:bCs/>
+        </w:rPr>
+        <w:t>Usabilidade</w:t>
+      </w:r>
+      <w:r>
+        <w:rPr>
+          <w:rFonts w:ascii="Arial" w:hAnsi="Arial" w:cs="Arial"/>
+          <w:bCs/>
+        </w:rPr>
+        <w:t xml:space="preserve">: o sistema </w:t>
+      </w:r>
+      <w:r>
+        <w:rPr>
+          <w:rFonts w:ascii="Arial" w:hAnsi="Arial" w:cs="Arial"/>
+          <w:bCs/>
+        </w:rPr>
+        <w:t>é</w:t>
+      </w:r>
+      <w:r>
+        <w:rPr>
+          <w:rFonts w:ascii="Arial" w:hAnsi="Arial" w:cs="Arial"/>
+          <w:bCs/>
+        </w:rPr>
+        <w:t xml:space="preserve"> fácil de usar, com um visual simples, direto, e </w:t>
+      </w:r>
+      <w:r>
+        <w:rPr>
+          <w:rFonts w:ascii="Arial" w:hAnsi="Arial" w:cs="Arial"/>
+          <w:bCs/>
+        </w:rPr>
+        <w:t xml:space="preserve">para </w:t>
+      </w:r>
+      <w:r>
+        <w:rPr>
+          <w:rFonts w:ascii="Arial" w:hAnsi="Arial" w:cs="Arial"/>
+          <w:bCs/>
+        </w:rPr>
+        <w:t xml:space="preserve">que </w:t>
+      </w:r>
+      <w:r>
+        <w:rPr>
+          <w:rFonts w:ascii="Arial" w:hAnsi="Arial" w:cs="Arial"/>
+          <w:bCs/>
+        </w:rPr>
+        <w:t xml:space="preserve">qualquer </w:t>
+      </w:r>
+      <w:r>
+        <w:rPr>
+          <w:rFonts w:ascii="Arial" w:hAnsi="Arial" w:cs="Arial"/>
+          <w:bCs/>
+        </w:rPr>
+        <w:t xml:space="preserve"> usuário tenha facilidade em se familiarizar com o sistema evitando dúvidas e erros por parte dos usuários no exercício</w:t>
+      </w:r>
+      <w:r>
+        <w:rPr>
+          <w:rFonts w:ascii="Arial" w:hAnsi="Arial" w:cs="Arial"/>
+          <w:bCs/>
+        </w:rPr>
+        <w:t xml:space="preserve"> </w:t>
+      </w:r>
+      <w:r>
+        <w:rPr>
+          <w:rFonts w:ascii="Arial" w:hAnsi="Arial" w:cs="Arial"/>
+          <w:bCs/>
+        </w:rPr>
+        <w:t xml:space="preserve"> das suas actividades dentro do sistema.</w:t>
+      </w:r>
+    </w:p>
+    <w:p>
+      <w:pPr>
+        <w:pStyle w:val="NormalWeb"/>
+        <w:spacing w:line="360" w:lineRule="auto"/>
+        <w:ind w:firstLine="708"/>
+        <w:jc w:val="both"/>
+        <w:rPr>
+          <w:rFonts w:ascii="Arial" w:hAnsi="Arial" w:cs="Arial"/>
+          <w:bCs/>
+        </w:rPr>
+      </w:pPr>
+      <w:r>
+        <w:rPr>
+          <w:rFonts w:ascii="Arial" w:hAnsi="Arial" w:cs="Arial"/>
+          <w:b/>
+        </w:rPr>
+        <w:lastRenderedPageBreak/>
+        <w:t>Escalável:</w:t>
+      </w:r>
+      <w:r>
+        <w:rPr>
+          <w:rFonts w:ascii="Arial" w:hAnsi="Arial" w:cs="Arial"/>
+          <w:bCs/>
+        </w:rPr>
+        <w:t xml:space="preserve"> a arquitetura do sistema é modular o que permite que o sistema possa crescer a nível  exponencial sem dar problemas na implementação de novos modulos.</w:t>
+      </w:r>
+    </w:p>
+    <w:p>
+      <w:pPr>
+        <w:pStyle w:val="NormalWeb"/>
+        <w:spacing w:line="360" w:lineRule="auto"/>
+        <w:jc w:val="both"/>
+        <w:rPr>
+          <w:rFonts w:ascii="Arial" w:hAnsi="Arial" w:cs="Arial"/>
+          <w:bCs/>
+        </w:rPr>
+      </w:pPr>
+      <w:r>
+        <w:rPr>
+          <w:rFonts w:ascii="Arial" w:hAnsi="Arial" w:cs="Arial"/>
+          <w:bCs/>
+        </w:rPr>
+        <w:t xml:space="preserve"> </w:t>
+      </w:r>
+      <w:r>
+        <w:rPr>
+          <w:rFonts w:ascii="Arial" w:hAnsi="Arial" w:cs="Arial"/>
+          <w:bCs/>
+        </w:rPr>
+        <w:tab/>
+      </w:r>
+      <w:r>
+        <w:rPr>
+          <w:rFonts w:ascii="Arial" w:hAnsi="Arial" w:cs="Arial"/>
+          <w:b/>
+          <w:bCs/>
+        </w:rPr>
+        <w:t>Desempenho</w:t>
+      </w:r>
+      <w:r>
+        <w:rPr>
+          <w:rFonts w:ascii="Arial" w:hAnsi="Arial" w:cs="Arial"/>
+          <w:bCs/>
+        </w:rPr>
+        <w:t xml:space="preserve">: </w:t>
+      </w:r>
+      <w:r>
+        <w:rPr>
+          <w:rFonts w:ascii="Arial" w:hAnsi="Arial" w:cs="Arial"/>
+          <w:bCs/>
+        </w:rPr>
+        <w:t>o sistema foi projectado para ter performance e rápidez no processamento, seu código está otimizado.</w:t>
+      </w:r>
+    </w:p>
+    <w:p>
+      <w:pPr>
+        <w:pStyle w:val="NormalWeb"/>
+        <w:spacing w:line="360" w:lineRule="auto"/>
+        <w:jc w:val="both"/>
+        <w:rPr>
+          <w:rFonts w:ascii="Arial" w:hAnsi="Arial" w:cs="Arial"/>
+          <w:bCs/>
+        </w:rPr>
+      </w:pPr>
+      <w:r>
+        <w:rPr>
+          <w:rFonts w:ascii="Arial" w:hAnsi="Arial" w:cs="Arial"/>
+          <w:bCs/>
+        </w:rPr>
+        <w:t xml:space="preserve"> </w:t>
+      </w:r>
+      <w:r>
+        <w:rPr>
+          <w:rFonts w:ascii="Arial" w:hAnsi="Arial" w:cs="Arial"/>
+          <w:bCs/>
+        </w:rPr>
+        <w:tab/>
+      </w:r>
+      <w:r>
+        <w:rPr>
+          <w:rFonts w:ascii="Arial" w:hAnsi="Arial" w:cs="Arial"/>
+          <w:b/>
+          <w:bCs/>
+        </w:rPr>
+        <w:t>Segurança:</w:t>
+      </w:r>
+      <w:r>
+        <w:rPr>
+          <w:rFonts w:ascii="Arial" w:hAnsi="Arial" w:cs="Arial"/>
+          <w:bCs/>
+        </w:rPr>
+        <w:t xml:space="preserve"> </w:t>
+      </w:r>
+      <w:r>
+        <w:rPr>
+          <w:rFonts w:ascii="Arial" w:hAnsi="Arial" w:cs="Arial"/>
+          <w:bCs/>
+        </w:rPr>
+        <w:t>o sistema tem forte segurança e robustez, garantido estabilidade n</w:t>
+      </w:r>
+      <w:r>
+        <w:rPr>
+          <w:rFonts w:ascii="Arial" w:hAnsi="Arial" w:cs="Arial"/>
+          <w:bCs/>
+        </w:rPr>
+        <w:t>os dados</w:t>
+      </w:r>
+      <w:r>
+        <w:rPr>
+          <w:rFonts w:ascii="Arial" w:hAnsi="Arial" w:cs="Arial"/>
+          <w:bCs/>
+        </w:rPr>
+        <w:t>, e dando acesso apenas para entidades autorizadas</w:t>
+      </w:r>
+    </w:p>
+    <w:p>
+      <w:pPr>
+        <w:ind w:firstLine="0"/>
+        <w:rPr>
+          <w:rFonts w:cs="Arial"/>
+        </w:rPr>
+      </w:pPr>
+    </w:p>
+    <w:p>
+      <w:pPr>
+        <w:ind w:firstLine="0"/>
         <w:rPr>
           <w:rFonts w:eastAsiaTheme="majorEastAsia" w:cs="Arial"/>
           <w:b/>
@@ -6146,11 +7001,127 @@
       </w:rPr>
     </w:lvl>
   </w:abstractNum>
+  <w:abstractNum w:abstractNumId="2" w15:restartNumberingAfterBreak="0">
+    <w:nsid w:val="6C9B4E4D"/>
+    <w:multiLevelType w:val="hybridMultilevel"/>
+    <w:tmpl w:val="2E1EBA7C"/>
+    <w:lvl w:ilvl="0" w:tplc="0C000001">
+      <w:start w:val="1"/>
+      <w:numFmt w:val="bullet"/>
+      <w:lvlText w:val=""/>
+      <w:lvlJc w:val="left"/>
+      <w:pPr>
+        <w:ind w:left="1428" w:hanging="360"/>
+      </w:pPr>
+      <w:rPr>
+        <w:rFonts w:ascii="Symbol" w:hAnsi="Symbol" w:hint="default"/>
+      </w:rPr>
+    </w:lvl>
+    <w:lvl w:ilvl="1" w:tplc="0C000003" w:tentative="1">
+      <w:start w:val="1"/>
+      <w:numFmt w:val="bullet"/>
+      <w:lvlText w:val="o"/>
+      <w:lvlJc w:val="left"/>
+      <w:pPr>
+        <w:ind w:left="2148" w:hanging="360"/>
+      </w:pPr>
+      <w:rPr>
+        <w:rFonts w:ascii="Courier New" w:hAnsi="Courier New" w:cs="Courier New" w:hint="default"/>
+      </w:rPr>
+    </w:lvl>
+    <w:lvl w:ilvl="2" w:tplc="0C000005" w:tentative="1">
+      <w:start w:val="1"/>
+      <w:numFmt w:val="bullet"/>
+      <w:lvlText w:val=""/>
+      <w:lvlJc w:val="left"/>
+      <w:pPr>
+        <w:ind w:left="2868" w:hanging="360"/>
+      </w:pPr>
+      <w:rPr>
+        <w:rFonts w:ascii="Wingdings" w:hAnsi="Wingdings" w:hint="default"/>
+      </w:rPr>
+    </w:lvl>
+    <w:lvl w:ilvl="3" w:tplc="0C000001" w:tentative="1">
+      <w:start w:val="1"/>
+      <w:numFmt w:val="bullet"/>
+      <w:lvlText w:val=""/>
+      <w:lvlJc w:val="left"/>
+      <w:pPr>
+        <w:ind w:left="3588" w:hanging="360"/>
+      </w:pPr>
+      <w:rPr>
+        <w:rFonts w:ascii="Symbol" w:hAnsi="Symbol" w:hint="default"/>
+      </w:rPr>
+    </w:lvl>
+    <w:lvl w:ilvl="4" w:tplc="0C000003" w:tentative="1">
+      <w:start w:val="1"/>
+      <w:numFmt w:val="bullet"/>
+      <w:lvlText w:val="o"/>
+      <w:lvlJc w:val="left"/>
+      <w:pPr>
+        <w:ind w:left="4308" w:hanging="360"/>
+      </w:pPr>
+      <w:rPr>
+        <w:rFonts w:ascii="Courier New" w:hAnsi="Courier New" w:cs="Courier New" w:hint="default"/>
+      </w:rPr>
+    </w:lvl>
+    <w:lvl w:ilvl="5" w:tplc="0C000005" w:tentative="1">
+      <w:start w:val="1"/>
+      <w:numFmt w:val="bullet"/>
+      <w:lvlText w:val=""/>
+      <w:lvlJc w:val="left"/>
+      <w:pPr>
+        <w:ind w:left="5028" w:hanging="360"/>
+      </w:pPr>
+      <w:rPr>
+        <w:rFonts w:ascii="Wingdings" w:hAnsi="Wingdings" w:hint="default"/>
+      </w:rPr>
+    </w:lvl>
+    <w:lvl w:ilvl="6" w:tplc="0C000001" w:tentative="1">
+      <w:start w:val="1"/>
+      <w:numFmt w:val="bullet"/>
+      <w:lvlText w:val=""/>
+      <w:lvlJc w:val="left"/>
+      <w:pPr>
+        <w:ind w:left="5748" w:hanging="360"/>
+      </w:pPr>
+      <w:rPr>
+        <w:rFonts w:ascii="Symbol" w:hAnsi="Symbol" w:hint="default"/>
+      </w:rPr>
+    </w:lvl>
+    <w:lvl w:ilvl="7" w:tplc="0C000003" w:tentative="1">
+      <w:start w:val="1"/>
+      <w:numFmt w:val="bullet"/>
+      <w:lvlText w:val="o"/>
+      <w:lvlJc w:val="left"/>
+      <w:pPr>
+        <w:ind w:left="6468" w:hanging="360"/>
+      </w:pPr>
+      <w:rPr>
+        <w:rFonts w:ascii="Courier New" w:hAnsi="Courier New" w:cs="Courier New" w:hint="default"/>
+      </w:rPr>
+    </w:lvl>
+    <w:lvl w:ilvl="8" w:tplc="0C000005" w:tentative="1">
+      <w:start w:val="1"/>
+      <w:numFmt w:val="bullet"/>
+      <w:lvlText w:val=""/>
+      <w:lvlJc w:val="left"/>
+      <w:pPr>
+        <w:ind w:left="7188" w:hanging="360"/>
+      </w:pPr>
+      <w:rPr>
+        <w:rFonts w:ascii="Wingdings" w:hAnsi="Wingdings" w:hint="default"/>
+      </w:rPr>
+    </w:lvl>
+  </w:abstractNum>
   <w:num w:numId="1" w16cid:durableId="948661166">
     <w:abstractNumId w:val="0"/>
   </w:num>
   <w:num w:numId="2" w16cid:durableId="599027378">
     <w:abstractNumId w:val="1"/>
+  </w:num>
+  <w:num w:numId="3" w16cid:durableId="145166325">
+    <w:abstractNumId w:val="2"/>
   </w:num>
 </w:numbering>
 </file>
@@ -6777,6 +7748,7 @@
   <w:style w:type="character" w:default="1" w:styleId="DefaultParagraphFont">
     <w:name w:val="Default Paragraph Font"/>
     <w:uiPriority w:val="1"/>
+    <w:semiHidden/>
     <w:unhideWhenUsed/>
   </w:style>
   <w:style w:type="table" w:default="1" w:styleId="TableNormal">
@@ -7162,6 +8134,36 @@
       <w:szCs w:val="20"/>
     </w:rPr>
   </w:style>
+  <w:style w:type="character" w:styleId="Strong">
+    <w:name w:val="Strong"/>
+    <w:basedOn w:val="DefaultParagraphFont"/>
+    <w:uiPriority w:val="22"/>
+    <w:qFormat/>
+    <w:rsid w:val="008E65C0"/>
+    <w:rPr>
+      <w:b/>
+      <w:bCs/>
+    </w:rPr>
+  </w:style>
+  <w:style w:type="paragraph" w:styleId="NormalWeb">
+    <w:name w:val="Normal (Web)"/>
+    <w:basedOn w:val="Normal"/>
+    <w:uiPriority w:val="99"/>
+    <w:unhideWhenUsed/>
+    <w:rsid w:val="008E65C0"/>
+    <w:pPr>
+      <w:spacing w:before="100" w:beforeAutospacing="1" w:after="100" w:afterAutospacing="1" w:line="240" w:lineRule="auto"/>
+      <w:ind w:firstLine="0"/>
+      <w:jc w:val="left"/>
+    </w:pPr>
+    <w:rPr>
+      <w:rFonts w:ascii="Times New Roman" w:eastAsia="Times New Roman" w:hAnsi="Times New Roman" w:cs="Times New Roman"/>
+      <w:kern w:val="0"/>
+      <w:szCs w:val="24"/>
+      <w:lang w:eastAsia="pt-PT"/>
+      <w14:ligatures w14:val="none"/>
+    </w:rPr>
+  </w:style>
 </w:styles>
 </file>
 

</xml_diff>

<commit_message>
feat: Implement document and solicitation management system with PDF generation capabilities.
</commit_message>
<xml_diff>
--- a/docs/TCC-PAP-Projecto-Fim-Curso-Gestao-Declaracao.docx
+++ b/docs/TCC-PAP-Projecto-Fim-Curso-Gestao-Declaracao.docx
@@ -1649,21 +1649,6 @@
       <w:pPr>
         <w:rPr>
           <w:rFonts w:cs="Arial"/>
-          <w:color w:val="FF0000"/>
-        </w:rPr>
-      </w:pPr>
-      <w:r>
-        <w:rPr>
-          <w:rFonts w:cs="Arial"/>
-          <w:color w:val="FF0000"/>
-        </w:rPr>
-        <w:t>A metodologia adotada para o desenvolvimento envolve análise de requisitos, modelagem de dados, escolha de tecnologias modernas e práticas de desenvolvimento de software, utilizando ferramentas robustas como Django para o back-end, React para o front-end e PostgreSQL para o banco de dados.</w:t>
-      </w:r>
-    </w:p>
-    <w:p>
-      <w:pPr>
-        <w:rPr>
-          <w:rFonts w:cs="Arial"/>
         </w:rPr>
       </w:pPr>
       <w:r>
@@ -1757,6 +1742,65 @@
     <w:p>
       <w:pPr>
         <w:rPr>
+          <w:lang w:val="pt-AO"/>
+        </w:rPr>
+      </w:pPr>
+      <w:r>
+        <w:rPr>
+          <w:lang w:val="pt-AO"/>
+        </w:rPr>
+        <w:t>This project aims to design and develop a computerized system for managing certificates at the Instituto Politécnico do Maiombe. Currently, the institution faces difficulties in handling certificate requests due to the increasing volume of applications, reliance on manual processes, and lack of adequate traceability, which causes delays, errors, and loss of important documents and information.</w:t>
+      </w:r>
+    </w:p>
+    <w:p>
+      <w:pPr>
+        <w:rPr>
+          <w:lang w:val="pt-AO"/>
+        </w:rPr>
+      </w:pPr>
+      <w:r>
+        <w:rPr>
+          <w:lang w:val="pt-AO"/>
+        </w:rPr>
+        <w:t>The proposed system seeks to automate the processes of certificate generation, validation, and traceability, ensuring greater accuracy and security in information handling. In addition, it aims to provide an accessible, efficient, and user-friendly solution, allowing the institution's administrative office to organize, control, and monitor all requests in a fast and reliable manner.</w:t>
+      </w:r>
+    </w:p>
+    <w:p>
+      <w:pPr>
+        <w:rPr>
+          <w:lang w:val="pt-AO"/>
+        </w:rPr>
+      </w:pPr>
+      <w:r>
+        <w:rPr>
+          <w:lang w:val="pt-AO"/>
+        </w:rPr>
+        <w:t>The implementation of the system is expected to result in significant improvements in document management, increasing the productivity of the administrative office, reducing human errors, and providing a more satisfactory experience for the institution's users. Thus, the project contributes to the modernization of administrative processes and to the overall efficiency of the Instituto Politécnico do Maiombe.</w:t>
+      </w:r>
+    </w:p>
+    <w:p>
+      <w:pPr>
+        <w:rPr>
+          <w:lang w:val="pt-AO"/>
+        </w:rPr>
+      </w:pPr>
+    </w:p>
+    <w:p>
+      <w:pPr>
+        <w:rPr>
+          <w:lang w:val="pt-AO"/>
+        </w:rPr>
+      </w:pPr>
+      <w:r>
+        <w:rPr>
+          <w:lang w:val="pt-AO"/>
+        </w:rPr>
+        <w:t>Keywords: Management, Certificates, System</w:t>
+      </w:r>
+    </w:p>
+    <w:p>
+      <w:pPr>
+        <w:rPr>
           <w:rFonts w:eastAsiaTheme="majorEastAsia" w:cs="Arial"/>
           <w:b/>
           <w:color w:val="0D0D0D" w:themeColor="text1" w:themeTint="F2"/>
@@ -1874,7 +1918,7 @@
           <w:rFonts w:cs="Arial"/>
           <w:color w:val="000000" w:themeColor="text1"/>
         </w:rPr>
-        <w:t>SGBD</w:t>
+        <w:t>SGBD </w:t>
       </w:r>
       <w:r>
         <w:rPr>
@@ -1888,29 +1932,57 @@
           <w:rFonts w:cs="Arial"/>
           <w:color w:val="000000" w:themeColor="text1"/>
         </w:rPr>
+        <w:t>Sistema de Gerenciamento de Banco de Dados</w:t>
+      </w:r>
+    </w:p>
+    <w:p>
+      <w:pPr>
+        <w:rPr>
+          <w:rFonts w:cs="Arial"/>
+          <w:color w:val="000000" w:themeColor="text1"/>
+        </w:rPr>
+      </w:pPr>
+      <w:r>
+        <w:rPr>
+          <w:rFonts w:cs="Arial"/>
+          <w:color w:val="000000" w:themeColor="text1"/>
+        </w:rPr>
+        <w:t>DER  </w:t>
+      </w:r>
+      <w:r>
+        <w:rPr>
+          <w:rFonts w:cs="Arial"/>
+          <w:color w:val="000000" w:themeColor="text1"/>
+        </w:rPr>
         <w:tab/>
-        <w:t>Sistema de Gerenciamento de Banco de Dados</w:t>
-      </w:r>
-    </w:p>
-    <w:p>
-      <w:pPr>
+      </w:r>
+      <w:r>
         <w:rPr>
           <w:rFonts w:cs="Arial"/>
           <w:color w:val="000000" w:themeColor="text1"/>
         </w:rPr>
-      </w:pPr>
-      <w:r>
+        <w:t>Diagrama Entidade-Relacionamento</w:t>
+      </w:r>
+    </w:p>
+    <w:p>
+      <w:pPr>
         <w:rPr>
           <w:rFonts w:cs="Arial"/>
           <w:color w:val="000000" w:themeColor="text1"/>
         </w:rPr>
-        <w:t xml:space="preserve">DER </w:t>
-      </w:r>
+      </w:pPr>
       <w:r>
         <w:rPr>
           <w:rFonts w:cs="Arial"/>
           <w:color w:val="000000" w:themeColor="text1"/>
         </w:rPr>
+        <w:t>HTTP  </w:t>
+      </w:r>
+      <w:r>
+        <w:rPr>
+          <w:rFonts w:cs="Arial"/>
+          <w:color w:val="000000" w:themeColor="text1"/>
+        </w:rPr>
         <w:tab/>
       </w:r>
       <w:r>
@@ -1918,39 +1990,7 @@
           <w:rFonts w:cs="Arial"/>
           <w:color w:val="000000" w:themeColor="text1"/>
         </w:rPr>
-        <w:tab/>
-        <w:t>Diagrama Entidade-Relacionamento</w:t>
-      </w:r>
-    </w:p>
-    <w:p>
-      <w:pPr>
-        <w:rPr>
-          <w:rFonts w:cs="Arial"/>
-          <w:color w:val="000000" w:themeColor="text1"/>
-        </w:rPr>
-      </w:pPr>
-      <w:r>
-        <w:rPr>
-          <w:rFonts w:cs="Arial"/>
-          <w:color w:val="000000" w:themeColor="text1"/>
-          <w:lang w:val="pt-BR"/>
-        </w:rPr>
-        <w:t>HTTP</w:t>
-      </w:r>
-      <w:r>
-        <w:rPr>
-          <w:rFonts w:cs="Arial"/>
-          <w:color w:val="000000" w:themeColor="text1"/>
-        </w:rPr>
-        <w:tab/>
-      </w:r>
-      <w:r>
-        <w:rPr>
-          <w:rFonts w:cs="Arial"/>
-          <w:color w:val="000000" w:themeColor="text1"/>
-        </w:rPr>
-        <w:tab/>
-        <w:t>HyperText Transferer Protocol</w:t>
+        <w:t>HyperText Transfer Protocol</w:t>
       </w:r>
     </w:p>
     <w:p>
@@ -1967,7 +2007,7 @@
           <w:color w:val="000000" w:themeColor="text1"/>
           <w:lang w:val="en-US"/>
         </w:rPr>
-        <w:t>API</w:t>
+        <w:t>API  </w:t>
       </w:r>
       <w:r>
         <w:rPr>
@@ -1983,7 +2023,6 @@
           <w:color w:val="000000" w:themeColor="text1"/>
           <w:lang w:val="en-US"/>
         </w:rPr>
-        <w:tab/>
         <w:t>Application Programming Interface</w:t>
       </w:r>
     </w:p>
@@ -2001,7 +2040,7 @@
           <w:color w:val="000000" w:themeColor="text1"/>
           <w:lang w:val="en-US"/>
         </w:rPr>
-        <w:t>JWT</w:t>
+        <w:t>JWT  </w:t>
       </w:r>
       <w:r>
         <w:rPr>
@@ -2017,29 +2056,64 @@
           <w:color w:val="000000" w:themeColor="text1"/>
           <w:lang w:val="en-US"/>
         </w:rPr>
+        <w:t>JSON Web Token</w:t>
+      </w:r>
+    </w:p>
+    <w:p>
+      <w:pPr>
+        <w:rPr>
+          <w:rFonts w:cs="Arial"/>
+          <w:color w:val="000000" w:themeColor="text1"/>
+        </w:rPr>
+      </w:pPr>
+      <w:r>
+        <w:rPr>
+          <w:rFonts w:cs="Arial"/>
+          <w:color w:val="000000" w:themeColor="text1"/>
+        </w:rPr>
+        <w:t>IA  </w:t>
+      </w:r>
+      <w:r>
+        <w:rPr>
+          <w:rFonts w:cs="Arial"/>
+          <w:color w:val="000000" w:themeColor="text1"/>
+        </w:rPr>
         <w:tab/>
-        <w:t>JSON Web Token</w:t>
-      </w:r>
-    </w:p>
-    <w:p>
-      <w:pPr>
+      </w:r>
+      <w:r>
         <w:rPr>
           <w:rFonts w:cs="Arial"/>
           <w:color w:val="000000" w:themeColor="text1"/>
         </w:rPr>
-      </w:pPr>
+        <w:tab/>
+      </w:r>
       <w:r>
         <w:rPr>
           <w:rFonts w:cs="Arial"/>
           <w:color w:val="000000" w:themeColor="text1"/>
         </w:rPr>
-        <w:t>I.A</w:t>
-      </w:r>
-      <w:r>
+        <w:t>Inteligência Artificial</w:t>
+      </w:r>
+    </w:p>
+    <w:p>
+      <w:pPr>
         <w:rPr>
           <w:rFonts w:cs="Arial"/>
           <w:color w:val="000000" w:themeColor="text1"/>
         </w:rPr>
+      </w:pPr>
+      <w:r>
+        <w:rPr>
+          <w:rFonts w:cs="Arial"/>
+          <w:color w:val="000000" w:themeColor="text1"/>
+        </w:rPr>
+        <w:t>UI  </w:t>
+      </w:r>
+      <w:r>
+        <w:rPr>
+          <w:rFonts w:cs="Arial"/>
+          <w:color w:val="000000" w:themeColor="text1"/>
+        </w:rPr>
         <w:tab/>
       </w:r>
       <w:r>
@@ -2047,38 +2121,7 @@
           <w:rFonts w:cs="Arial"/>
           <w:color w:val="000000" w:themeColor="text1"/>
         </w:rPr>
-        <w:tab/>
-        <w:t xml:space="preserve">Inteligência Artificial </w:t>
-      </w:r>
-    </w:p>
-    <w:p>
-      <w:pPr>
-        <w:rPr>
-          <w:rFonts w:cs="Arial"/>
-          <w:color w:val="000000" w:themeColor="text1"/>
-        </w:rPr>
-      </w:pPr>
-      <w:r>
-        <w:rPr>
-          <w:rFonts w:cs="Arial"/>
-          <w:color w:val="000000" w:themeColor="text1"/>
-        </w:rPr>
-        <w:t>UI</w:t>
-      </w:r>
-      <w:r>
-        <w:rPr>
-          <w:rFonts w:cs="Arial"/>
-          <w:color w:val="000000" w:themeColor="text1"/>
-        </w:rPr>
-        <w:tab/>
-      </w:r>
-      <w:r>
-        <w:rPr>
-          <w:rFonts w:cs="Arial"/>
-          <w:color w:val="000000" w:themeColor="text1"/>
-        </w:rPr>
-        <w:tab/>
-        <w:t>Interface User</w:t>
+        <w:t>User Interface</w:t>
       </w:r>
     </w:p>
     <w:p>
@@ -2095,7 +2138,7 @@
           <w:color w:val="000000" w:themeColor="text1"/>
           <w:lang w:val="en-US"/>
         </w:rPr>
-        <w:t>UX</w:t>
+        <w:t>UX  </w:t>
       </w:r>
       <w:r>
         <w:rPr>
@@ -2111,8 +2154,7 @@
           <w:color w:val="000000" w:themeColor="text1"/>
           <w:lang w:val="en-US"/>
         </w:rPr>
-        <w:tab/>
-        <w:t>Expires User</w:t>
+        <w:t>User Experience</w:t>
       </w:r>
     </w:p>
     <w:p>
@@ -2129,7 +2171,7 @@
           <w:color w:val="000000" w:themeColor="text1"/>
           <w:lang w:val="en-US"/>
         </w:rPr>
-        <w:t>HTML</w:t>
+        <w:t>HTML  </w:t>
       </w:r>
       <w:r>
         <w:rPr>
@@ -2139,51 +2181,136 @@
         </w:rPr>
         <w:tab/>
       </w:r>
+      <w:proofErr w:type="spellStart"/>
       <w:r>
         <w:rPr>
           <w:rFonts w:cs="Arial"/>
           <w:color w:val="000000" w:themeColor="text1"/>
           <w:lang w:val="en-US"/>
         </w:rPr>
-        <w:tab/>
-      </w:r>
-      <w:proofErr w:type="spellStart"/>
+        <w:t>HyperText</w:t>
+      </w:r>
+      <w:proofErr w:type="spellEnd"/>
       <w:r>
         <w:rPr>
           <w:rFonts w:cs="Arial"/>
           <w:color w:val="000000" w:themeColor="text1"/>
           <w:lang w:val="en-US"/>
         </w:rPr>
-        <w:t>HyperText</w:t>
-      </w:r>
-      <w:proofErr w:type="spellEnd"/>
-      <w:r>
+        <w:t xml:space="preserve"> Markup Language</w:t>
+      </w:r>
+    </w:p>
+    <w:p>
+      <w:pPr>
+        <w:rPr>
+          <w:rFonts w:cs="Arial"/>
+          <w:color w:val="000000" w:themeColor="text1"/>
+        </w:rPr>
+      </w:pPr>
+      <w:r>
+        <w:rPr>
+          <w:rFonts w:cs="Arial"/>
+          <w:color w:val="000000" w:themeColor="text1"/>
+        </w:rPr>
+        <w:t>BD  </w:t>
+      </w:r>
+      <w:r>
+        <w:rPr>
+          <w:rFonts w:cs="Arial"/>
+          <w:color w:val="000000" w:themeColor="text1"/>
+        </w:rPr>
+        <w:tab/>
+      </w:r>
+      <w:r>
+        <w:rPr>
+          <w:rFonts w:cs="Arial"/>
+          <w:color w:val="000000" w:themeColor="text1"/>
+        </w:rPr>
+        <w:t>Banco de Dados</w:t>
+      </w:r>
+    </w:p>
+    <w:p>
+      <w:pPr>
+        <w:rPr>
+          <w:rFonts w:cs="Arial"/>
+          <w:color w:val="000000" w:themeColor="text1"/>
+        </w:rPr>
+      </w:pPr>
+      <w:r>
+        <w:rPr>
+          <w:rFonts w:cs="Arial"/>
+          <w:color w:val="000000" w:themeColor="text1"/>
+        </w:rPr>
+        <w:t>IPM  </w:t>
+      </w:r>
+      <w:r>
+        <w:rPr>
+          <w:rFonts w:cs="Arial"/>
+          <w:color w:val="000000" w:themeColor="text1"/>
+        </w:rPr>
+        <w:tab/>
+      </w:r>
+      <w:r>
+        <w:rPr>
+          <w:rFonts w:cs="Arial"/>
+          <w:color w:val="000000" w:themeColor="text1"/>
+        </w:rPr>
+        <w:t>Instituto Politécnico do Maiombe</w:t>
+      </w:r>
+    </w:p>
+    <w:p>
+      <w:pPr>
         <w:rPr>
           <w:rFonts w:cs="Arial"/>
           <w:color w:val="000000" w:themeColor="text1"/>
           <w:lang w:val="en-US"/>
         </w:rPr>
-        <w:t xml:space="preserve"> Markup Language</w:t>
-      </w:r>
-    </w:p>
-    <w:p>
-      <w:pPr>
+      </w:pPr>
+      <w:r>
         <w:rPr>
           <w:rFonts w:cs="Arial"/>
           <w:color w:val="000000" w:themeColor="text1"/>
-        </w:rPr>
-      </w:pPr>
+          <w:lang w:val="en-US"/>
+        </w:rPr>
+        <w:t>SQL  </w:t>
+      </w:r>
       <w:r>
         <w:rPr>
           <w:rFonts w:cs="Arial"/>
           <w:color w:val="000000" w:themeColor="text1"/>
-        </w:rPr>
-        <w:t>BD</w:t>
+          <w:lang w:val="en-US"/>
+        </w:rPr>
+        <w:tab/>
       </w:r>
       <w:r>
         <w:rPr>
           <w:rFonts w:cs="Arial"/>
           <w:color w:val="000000" w:themeColor="text1"/>
+          <w:lang w:val="en-US"/>
+        </w:rPr>
+        <w:t>Structured Query Language</w:t>
+      </w:r>
+    </w:p>
+    <w:p>
+      <w:pPr>
+        <w:rPr>
+          <w:rFonts w:cs="Arial"/>
+          <w:lang w:val="en-US"/>
+        </w:rPr>
+      </w:pPr>
+      <w:r>
+        <w:rPr>
+          <w:rFonts w:cs="Arial"/>
+          <w:color w:val="000000" w:themeColor="text1"/>
+          <w:lang w:val="en-US"/>
+        </w:rPr>
+        <w:t>MVT  </w:t>
+      </w:r>
+      <w:r>
+        <w:rPr>
+          <w:rFonts w:cs="Arial"/>
+          <w:color w:val="000000" w:themeColor="text1"/>
+          <w:lang w:val="en-US"/>
         </w:rPr>
         <w:tab/>
       </w:r>
@@ -2191,120 +2318,10 @@
         <w:rPr>
           <w:rFonts w:cs="Arial"/>
           <w:color w:val="000000" w:themeColor="text1"/>
-        </w:rPr>
-        <w:tab/>
-      </w:r>
-      <w:r>
-        <w:rPr>
-          <w:rFonts w:cs="Arial"/>
-          <w:color w:val="000000" w:themeColor="text1"/>
-        </w:rPr>
-        <w:t>Banco de Dados</w:t>
-      </w:r>
-    </w:p>
-    <w:p>
-      <w:pPr>
-        <w:rPr>
-          <w:rFonts w:cs="Arial"/>
-          <w:color w:val="000000" w:themeColor="text1"/>
-        </w:rPr>
-      </w:pPr>
-      <w:r>
-        <w:rPr>
-          <w:rFonts w:cs="Arial"/>
-          <w:color w:val="000000" w:themeColor="text1"/>
-        </w:rPr>
-        <w:t>IPM</w:t>
-      </w:r>
-      <w:r>
-        <w:rPr>
-          <w:rFonts w:cs="Arial"/>
-          <w:color w:val="000000" w:themeColor="text1"/>
-        </w:rPr>
-        <w:tab/>
-      </w:r>
-      <w:r>
-        <w:rPr>
-          <w:rFonts w:cs="Arial"/>
-          <w:color w:val="000000" w:themeColor="text1"/>
-        </w:rPr>
-        <w:tab/>
-      </w:r>
-      <w:r>
-        <w:rPr>
-          <w:rFonts w:cs="Arial"/>
-          <w:color w:val="000000" w:themeColor="text1"/>
-        </w:rPr>
-        <w:t>Instituto Politécnico do Maiombe</w:t>
-      </w:r>
-    </w:p>
-    <w:p>
-      <w:pPr>
-        <w:rPr>
-          <w:rFonts w:cs="Arial"/>
-          <w:lang w:val="pt-AO"/>
-        </w:rPr>
-      </w:pPr>
-      <w:r>
-        <w:rPr>
-          <w:rFonts w:cs="Arial"/>
-          <w:lang w:val="pt-AO"/>
-        </w:rPr>
-        <w:t>SQL</w:t>
-      </w:r>
-      <w:r>
-        <w:rPr>
-          <w:rFonts w:cs="Arial"/>
-          <w:lang w:val="pt-AO"/>
-        </w:rPr>
-        <w:tab/>
-      </w:r>
-      <w:r>
-        <w:rPr>
-          <w:rFonts w:cs="Arial"/>
-          <w:lang w:val="pt-AO"/>
-        </w:rPr>
-        <w:tab/>
-        <w:t xml:space="preserve">Structure Query Language </w:t>
-      </w:r>
-    </w:p>
-    <w:p>
-      <w:pPr>
-        <w:rPr>
-          <w:rFonts w:cs="Arial"/>
           <w:lang w:val="en-US"/>
         </w:rPr>
-      </w:pPr>
-      <w:r>
-        <w:rPr>
-          <w:rFonts w:cs="Arial"/>
-          <w:lang w:val="pt-AO"/>
-        </w:rPr>
-        <w:t>MVT</w:t>
-      </w:r>
-      <w:r>
-        <w:rPr>
-          <w:rFonts w:cs="Arial"/>
-          <w:lang w:val="pt-AO"/>
-        </w:rPr>
-        <w:tab/>
-      </w:r>
-      <w:r>
-        <w:rPr>
-          <w:rFonts w:cs="Arial"/>
-          <w:lang w:val="pt-AO"/>
-        </w:rPr>
-        <w:tab/>
-        <w:t>Model View Template</w:t>
-      </w:r>
-    </w:p>
-    <w:p>
-      <w:pPr>
-        <w:rPr>
-          <w:rFonts w:cs="Arial"/>
-          <w:lang w:val="en-US"/>
-        </w:rPr>
-      </w:pPr>
+        <w:t>Model-View-Template</w:t>
+      </w:r>
     </w:p>
     <w:p>
       <w:pPr>
@@ -2439,7 +2456,31 @@
         <w:rPr>
           <w:rFonts w:cs="Arial"/>
         </w:rPr>
-        <w:t xml:space="preserve"> localizada no Icolo e Bengo, municipio do Sequele na Comuna do Kifangondo bairro Maiombe</w:t>
+        <w:t xml:space="preserve"> localizad</w:t>
+      </w:r>
+      <w:r>
+        <w:rPr>
+          <w:rFonts w:cs="Arial"/>
+        </w:rPr>
+        <w:t>o</w:t>
+      </w:r>
+      <w:r>
+        <w:rPr>
+          <w:rFonts w:cs="Arial"/>
+        </w:rPr>
+        <w:t xml:space="preserve"> no Icolo e Bengo, </w:t>
+      </w:r>
+      <w:r>
+        <w:rPr>
+          <w:rFonts w:cs="Arial"/>
+        </w:rPr>
+        <w:t>município</w:t>
+      </w:r>
+      <w:r>
+        <w:rPr>
+          <w:rFonts w:cs="Arial"/>
+        </w:rPr>
+        <w:t xml:space="preserve"> do Sequele na Comuna do Kifangondo bairro Maiombe</w:t>
       </w:r>
       <w:r>
         <w:rPr>
@@ -2459,7 +2500,7 @@
           <w:rFonts w:cs="Arial"/>
           <w:lang w:val="pt-AO"/>
         </w:rPr>
-        <w:t>ndo</w:t>
+        <w:t>do</w:t>
       </w:r>
       <w:r>
         <w:rPr>
@@ -3014,7 +3055,21 @@
           <w:rFonts w:cs="Arial"/>
           <w:lang w:val="pt-AO"/>
         </w:rPr>
-        <w:t>, durante o período compreendido entre dezembro de 2025 a março de 2026. A investigação limita-se à secretária do Instituto Politécnico do Maiombe, localizada na Província do Icole e Bengo no município do Sequele Bairro do Maiombe</w:t>
+        <w:t xml:space="preserve">, durante o período compreendido entre dezembro de 2025 a março de 2026. A investigação limita-se à secretária do Instituto Politécnico do Maiombe, localizada na Província do Icole e Bengo no </w:t>
+      </w:r>
+      <w:r>
+        <w:rPr>
+          <w:rFonts w:cs="Arial"/>
+          <w:lang w:val="pt-AO"/>
+        </w:rPr>
+        <w:t>município</w:t>
+      </w:r>
+      <w:r>
+        <w:rPr>
+          <w:rFonts w:cs="Arial"/>
+          <w:lang w:val="pt-AO"/>
+        </w:rPr>
+        <w:t xml:space="preserve"> do Sequele Bairro do Maiombe</w:t>
       </w:r>
       <w:r>
         <w:rPr>
@@ -4933,6 +4988,7 @@
       <w:pPr>
         <w:rPr>
           <w:rFonts w:cs="Arial"/>
+          <w:color w:val="191919" w:themeColor="background2" w:themeShade="1A"/>
           <w:lang w:val="pt-AO"/>
         </w:rPr>
       </w:pPr>
@@ -4975,180 +5031,173 @@
       <w:r>
         <w:rPr>
           <w:rFonts w:cs="Arial"/>
+          <w:color w:val="191919" w:themeColor="background2" w:themeShade="1A"/>
+          <w:lang w:val="pt-AO"/>
+        </w:rPr>
+        <w:t>.</w:t>
+      </w:r>
+    </w:p>
+    <w:p>
+      <w:pPr>
+        <w:ind w:firstLine="0"/>
+        <w:rPr>
+          <w:rFonts w:cs="Arial"/>
+        </w:rPr>
+      </w:pPr>
+      <w:r>
+        <w:rPr>
+          <w:rFonts w:cs="Arial"/>
+        </w:rPr>
+        <w:t>2.1 Tipo de Pesquisa</w:t>
+      </w:r>
+    </w:p>
+    <w:p>
+      <w:pPr>
+        <w:ind w:firstLine="708"/>
+        <w:rPr>
+          <w:rFonts w:cs="Arial"/>
+        </w:rPr>
+      </w:pPr>
+      <w:r>
+        <w:rPr>
+          <w:rFonts w:cs="Arial"/>
+        </w:rPr>
+        <w:t>O presente trabalho caracteriza-se como um estudo de caso, uma vez que foi desenvolvido com base na análise de uma situação real e específica, neste caso, a Secretaria do Instituto Politécnico do Maiombe (IPM). O estudo de caso permite analisar profundamente um determinado ambiente, considerando suas características, limitações e necessidades reais</w:t>
+      </w:r>
+      <w:r>
+        <w:rPr>
+          <w:rFonts w:cs="Arial"/>
+        </w:rPr>
+        <w:t>, de modo a encontrar formas de suprir as necessidade da situação em questão.</w:t>
+      </w:r>
+    </w:p>
+    <w:p>
+      <w:pPr>
+        <w:rPr>
+          <w:rFonts w:cs="Arial"/>
+        </w:rPr>
+      </w:pPr>
+      <w:r>
+        <w:rPr>
+          <w:rFonts w:cs="Arial"/>
+        </w:rPr>
+        <w:t>Segundo Gil (2010), o estudo de caso é indicado quando se pretende investigar um fenômeno contemporâneo dentro do seu contexto real, principalmente quando os limites entre o fenômeno e o contexto não estão claramente definidos.</w:t>
+      </w:r>
+    </w:p>
+    <w:p>
+      <w:pPr>
+        <w:rPr>
+          <w:rFonts w:cs="Arial"/>
+        </w:rPr>
+      </w:pPr>
+      <w:r>
+        <w:rPr>
+          <w:rFonts w:cs="Arial"/>
+        </w:rPr>
+        <w:t xml:space="preserve"> </w:t>
+      </w:r>
+      <w:r>
+        <w:rPr>
+          <w:rFonts w:cs="Arial"/>
+        </w:rPr>
+        <w:t>Na vertente deste trabalho</w:t>
+      </w:r>
+      <w:r>
+        <w:rPr>
+          <w:rFonts w:cs="Arial"/>
+        </w:rPr>
+        <w:t xml:space="preserve">, foi necessário compreender como </w:t>
+      </w:r>
+      <w:r>
+        <w:rPr>
+          <w:rFonts w:cs="Arial"/>
+        </w:rPr>
+        <w:t>o fluxo de solicitações e a entrega de declarações funcionam na Secretaria do Instituto Politécnico do Maiombe, identificando</w:t>
+      </w:r>
+      <w:r>
+        <w:rPr>
+          <w:rFonts w:cs="Arial"/>
+        </w:rPr>
+        <w:t xml:space="preserve"> quais as dificuldades enfrentadas pelos </w:t>
+      </w:r>
+      <w:r>
+        <w:rPr>
+          <w:rFonts w:cs="Arial"/>
+        </w:rPr>
+        <w:t>estudantes e outras entidades que realizam a solicitação de declarações</w:t>
+      </w:r>
+      <w:r>
+        <w:rPr>
+          <w:rFonts w:cs="Arial"/>
+        </w:rPr>
+        <w:t>.</w:t>
+      </w:r>
+    </w:p>
+    <w:p>
+      <w:pPr>
+        <w:rPr>
+          <w:rFonts w:cs="Arial"/>
+        </w:rPr>
+      </w:pPr>
+      <w:r>
+        <w:rPr>
+          <w:rFonts w:cs="Arial"/>
+        </w:rPr>
+        <w:t>2.2 Abordagem da Pesquisa</w:t>
+      </w:r>
+    </w:p>
+    <w:p>
+      <w:pPr>
+        <w:rPr>
+          <w:rFonts w:cs="Arial"/>
+        </w:rPr>
+      </w:pPr>
+      <w:r>
+        <w:rPr>
+          <w:rFonts w:cs="Arial"/>
+        </w:rPr>
+        <w:t>O estudo adota uma abordagem quali-quantitativa, combinando métodos qualitativos e quantitativos, com o objetivo de descrever e analisar as dificuldades enfrentadas pelo Instituto Politécnico do Maiombe na gestão das declarações. A abordagem qualitativa permite compreender aspectos subjetivos e organizacionais, enquanto a abordagem quantitativa possibilita medir a frequência e a magnitude dos problemas identificados.</w:t>
+      </w:r>
+    </w:p>
+    <w:p>
+      <w:pPr>
+        <w:rPr>
+          <w:rFonts w:cs="Arial"/>
+        </w:rPr>
+      </w:pPr>
+      <w:r>
+        <w:rPr>
+          <w:rFonts w:cs="Arial"/>
+        </w:rPr>
+        <w:t xml:space="preserve">De acordo com </w:t>
+      </w:r>
+      <w:r>
+        <w:rPr>
+          <w:rFonts w:cs="Arial"/>
           <w:color w:val="FF0000"/>
-          <w:lang w:val="pt-AO"/>
-        </w:rPr>
-        <w:t>. A escolha adequada da metodologia é fundamental para garantir que os resultados obtidos sejam confiáveis, organizados e coerentes com a realidade estudada</w:t>
-      </w:r>
-      <w:r>
-        <w:rPr>
-          <w:rFonts w:cs="Arial"/>
-          <w:lang w:val="pt-AO"/>
-        </w:rPr>
-        <w:t>.</w:t>
-      </w:r>
-    </w:p>
-    <w:p>
-      <w:pPr>
-        <w:ind w:firstLine="0"/>
-        <w:rPr>
-          <w:rFonts w:cs="Arial"/>
-        </w:rPr>
-      </w:pPr>
-      <w:r>
-        <w:rPr>
-          <w:rFonts w:cs="Arial"/>
-        </w:rPr>
-        <w:t>2.1 Tipo de Pesquisa</w:t>
-      </w:r>
-    </w:p>
-    <w:p>
-      <w:pPr>
-        <w:ind w:firstLine="708"/>
-        <w:rPr>
-          <w:rFonts w:cs="Arial"/>
-        </w:rPr>
-      </w:pPr>
-      <w:r>
-        <w:rPr>
-          <w:rFonts w:cs="Arial"/>
-        </w:rPr>
-        <w:t>O presente trabalho caracteriza-se como um estudo de caso, uma vez que foi desenvolvido com base na análise de uma situação real e específica, neste caso, a Secretaria do Instituto Politécnico do Maiombe (IPM). O estudo de caso permite analisar profundamente um determinado ambiente, considerando suas características, limitações e necessidades reais</w:t>
-      </w:r>
-      <w:r>
-        <w:rPr>
-          <w:rFonts w:cs="Arial"/>
-        </w:rPr>
-        <w:t>, de modo a encontrar formas de suprir as necessidade da situação em questão.</w:t>
-      </w:r>
-    </w:p>
-    <w:p>
-      <w:pPr>
-        <w:rPr>
-          <w:rFonts w:cs="Arial"/>
-        </w:rPr>
-      </w:pPr>
-      <w:r>
-        <w:rPr>
-          <w:rFonts w:cs="Arial"/>
-        </w:rPr>
-        <w:t>Segundo Gil (2010), o estudo de caso é indicado quando se pretende investigar um fenômeno contemporâneo dentro do seu contexto real, principalmente quando os limites entre o fenômeno e o contexto não estão claramente definidos.</w:t>
-      </w:r>
-    </w:p>
-    <w:p>
-      <w:pPr>
-        <w:rPr>
-          <w:rFonts w:cs="Arial"/>
-        </w:rPr>
-      </w:pPr>
-      <w:r>
-        <w:rPr>
-          <w:rFonts w:cs="Arial"/>
-        </w:rPr>
-        <w:t xml:space="preserve"> </w:t>
-      </w:r>
-      <w:r>
-        <w:rPr>
-          <w:rFonts w:cs="Arial"/>
-        </w:rPr>
-        <w:t>Na vertente deste trabalho</w:t>
-      </w:r>
-      <w:r>
-        <w:rPr>
-          <w:rFonts w:cs="Arial"/>
-        </w:rPr>
-        <w:t xml:space="preserve">, foi necessário compreender como </w:t>
-      </w:r>
-      <w:r>
-        <w:rPr>
-          <w:rFonts w:cs="Arial"/>
-        </w:rPr>
-        <w:t>o fluxo de solicitações e a entrega de declarações funcionam na Secretaria do Instituto Politécnico do Maiombe, identificando</w:t>
-      </w:r>
-      <w:r>
-        <w:rPr>
-          <w:rFonts w:cs="Arial"/>
-        </w:rPr>
-        <w:t xml:space="preserve"> quais as dificuldades enfrentadas pelos </w:t>
-      </w:r>
-      <w:r>
-        <w:rPr>
-          <w:rFonts w:cs="Arial"/>
-        </w:rPr>
-        <w:t>estudantes e outras entidades que realizam a solicitação de declarações</w:t>
-      </w:r>
-      <w:r>
-        <w:rPr>
-          <w:rFonts w:cs="Arial"/>
-        </w:rPr>
-        <w:t>.</w:t>
-      </w:r>
-    </w:p>
-    <w:p>
-      <w:pPr>
-        <w:rPr>
-          <w:rFonts w:cs="Arial"/>
-        </w:rPr>
-      </w:pPr>
-      <w:r>
-        <w:rPr>
-          <w:rFonts w:cs="Arial"/>
-        </w:rPr>
-        <w:t>2.2 Abordagem da Pesquisa</w:t>
-      </w:r>
-    </w:p>
-    <w:p>
-      <w:pPr>
-        <w:rPr>
-          <w:rFonts w:cs="Arial"/>
-        </w:rPr>
-      </w:pPr>
-      <w:r>
-        <w:rPr>
-          <w:rFonts w:cs="Arial"/>
-        </w:rPr>
-        <w:t>O estudo adota uma abordagem quali-quantitativa, combinando métodos qualitativos e quantitativos, com o objetivo de descrever e analisar as dificuldades enfrentadas pelo Instituto Politécnico do Maiombe na gestão das declarações. A abordagem qualitativa permite compreender aspectos subjetivos e organizacionais, enquanto a abordagem quantitativa possibilita medir a frequência e a magnitude dos problemas identificados.</w:t>
-      </w:r>
-    </w:p>
-    <w:p>
-      <w:pPr>
-        <w:rPr>
-          <w:rFonts w:cs="Arial"/>
-        </w:rPr>
-      </w:pPr>
-      <w:r>
-        <w:rPr>
-          <w:rFonts w:cs="Arial"/>
-        </w:rPr>
-        <w:t xml:space="preserve">De acordo com </w:t>
-      </w:r>
+        </w:rPr>
+        <w:t xml:space="preserve">Lakatos e </w:t>
+      </w:r>
+      <w:commentRangeStart w:id="0"/>
       <w:r>
         <w:rPr>
           <w:rFonts w:cs="Arial"/>
           <w:color w:val="FF0000"/>
         </w:rPr>
-        <w:t xml:space="preserve">Lakatos e </w:t>
-      </w:r>
-      <w:commentRangeStart w:id="0"/>
+        <w:t>Marconi</w:t>
+      </w:r>
+      <w:commentRangeEnd w:id="0"/>
+      <w:r>
+        <w:rPr>
+          <w:rStyle w:val="CommentReference"/>
+        </w:rPr>
+        <w:commentReference w:id="0"/>
+      </w:r>
       <w:r>
         <w:rPr>
           <w:rFonts w:cs="Arial"/>
           <w:color w:val="FF0000"/>
         </w:rPr>
-        <w:t>Marconi</w:t>
-      </w:r>
-      <w:commentRangeEnd w:id="0"/>
-      <w:r>
-        <w:rPr>
-          <w:rStyle w:val="CommentReference"/>
-        </w:rPr>
-        <w:commentReference w:id="0"/>
-      </w:r>
-      <w:r>
-        <w:rPr>
-          <w:rFonts w:cs="Arial"/>
-          <w:color w:val="FF0000"/>
-        </w:rPr>
         <w:t xml:space="preserve"> (2017), </w:t>
       </w:r>
       <w:r>
@@ -5204,14 +5253,14 @@
         <w:rPr>
           <w:rFonts w:cs="Arial"/>
         </w:rPr>
-        <w:t xml:space="preserve"> questionários estruturados aplicados à secretária da instituição. As entrevistas buscaram compreender de forma detalhada as dificuldades e limitações dos processos manuais, enquanto os questionários possibilitaram quantificar aspectos como atrasos, erros e dificuldades de controle. Os dados coletados foram </w:t>
+        <w:t xml:space="preserve"> questionários estruturados aplicados à secretária da instituição. As entrevistas buscaram compreender de forma detalhada as dificuldades e limitações dos processos manuais, enquanto os questionários possibilitaram quantificar aspectos como atrasos, erros e dificuldades de controle. Os dados coletados foram posteriormente analisados de forma qualitativa, categorizando os principais </w:t>
       </w:r>
       <w:r>
         <w:rPr>
           <w:rFonts w:cs="Arial"/>
         </w:rPr>
         <w:lastRenderedPageBreak/>
-        <w:t>posteriormente analisados de forma qualitativa, categorizando os principais problemas, e quantitativa, permitindo medir a frequência dos desafios identificados.</w:t>
+        <w:t>problemas, e quantitativa, permitindo medir a frequência dos desafios identificados.</w:t>
       </w:r>
     </w:p>
     <w:p>
@@ -5529,14 +5578,7 @@
           <w:rFonts w:ascii="Arial" w:hAnsi="Arial" w:cs="Arial"/>
           <w:b/>
         </w:rPr>
-        <w:t xml:space="preserve"> </w:t>
-      </w:r>
-      <w:r>
-        <w:rPr>
-          <w:rFonts w:ascii="Arial" w:hAnsi="Arial" w:cs="Arial"/>
-          <w:b/>
-        </w:rPr>
-        <w:t>Frontend</w:t>
+        <w:t xml:space="preserve"> Frontend</w:t>
       </w:r>
     </w:p>
     <w:p>
@@ -5554,13 +5596,7 @@
           <w:rFonts w:ascii="Arial" w:hAnsi="Arial" w:cs="Arial"/>
         </w:rPr>
         <w:lastRenderedPageBreak/>
-        <w:t>Nesta fase realizou-se o desenvolvimento d</w:t>
-      </w:r>
-      <w:r>
-        <w:rPr>
-          <w:rFonts w:ascii="Arial" w:hAnsi="Arial" w:cs="Arial"/>
-        </w:rPr>
-        <w:t>as interfaces dos sistema</w:t>
+        <w:t>Nesta fase realizou-se o desenvolvimento das interfaces dos sistema</w:t>
       </w:r>
       <w:r>
         <w:rPr>
@@ -5715,6 +5751,13 @@
           <w:rFonts w:cs="Arial"/>
           <w:lang w:val="pt-AO"/>
         </w:rPr>
+        <w:t xml:space="preserve">  acompanhando seu  desempenho academico</w:t>
+      </w:r>
+      <w:r>
+        <w:rPr>
+          <w:rFonts w:cs="Arial"/>
+          <w:lang w:val="pt-AO"/>
+        </w:rPr>
         <w:t xml:space="preserve"> </w:t>
       </w:r>
       <w:r>
@@ -5722,219 +5765,62 @@
           <w:rFonts w:cs="Arial"/>
           <w:lang w:val="pt-AO"/>
         </w:rPr>
-        <w:t xml:space="preserve"> acompanha</w:t>
-      </w:r>
-      <w:r>
-        <w:rPr>
-          <w:rFonts w:cs="Arial"/>
-          <w:lang w:val="pt-AO"/>
-        </w:rPr>
-        <w:t xml:space="preserve">ndo seu </w:t>
-      </w:r>
-      <w:r>
-        <w:rPr>
-          <w:rFonts w:cs="Arial"/>
-          <w:lang w:val="pt-AO"/>
-        </w:rPr>
-        <w:t xml:space="preserve"> desempenho academico</w:t>
-      </w:r>
-      <w:r>
-        <w:rPr>
-          <w:rFonts w:cs="Arial"/>
+        <w:t xml:space="preserve">e </w:t>
+      </w:r>
+      <w:r>
+        <w:rPr>
+          <w:rFonts w:cs="Arial"/>
+          <w:lang w:val="pt-AO"/>
+        </w:rPr>
+        <w:t>realizar soli</w:t>
+      </w:r>
+      <w:r>
+        <w:rPr>
+          <w:rFonts w:cs="Arial"/>
+          <w:lang w:val="pt-AO"/>
+        </w:rPr>
+        <w:t>citações por parte dos seus educandos.</w:t>
+      </w:r>
+    </w:p>
+    <w:p>
+      <w:pPr>
+        <w:rPr>
+          <w:rFonts w:cs="Arial"/>
+          <w:lang w:val="pt-AO"/>
+        </w:rPr>
+      </w:pPr>
+      <w:r>
+        <w:rPr>
+          <w:rFonts w:cs="Arial"/>
+          <w:lang w:val="pt-AO"/>
+        </w:rPr>
+        <w:t>Administradores (Secretário, Direitores)</w:t>
+      </w:r>
+      <w:r>
+        <w:rPr>
+          <w:rFonts w:cs="Arial"/>
+          <w:lang w:val="pt-AO"/>
+        </w:rPr>
+        <w:t>: responsáveis pelo gerenciamento dos dados que circulam pelo sistema, e pelo monitoramento das actividades dos usuarios, podendo também realizar solicitações a pedido de alunos ou encarregados.</w:t>
+      </w:r>
+    </w:p>
+    <w:p>
+      <w:pPr>
+        <w:ind w:firstLine="0"/>
+        <w:rPr>
+          <w:rFonts w:cs="Arial"/>
+          <w:lang w:val="pt-AO"/>
+        </w:rPr>
+      </w:pPr>
+      <w:r>
+        <w:rPr>
+          <w:rFonts w:cs="Arial"/>
+          <w:b/>
+          <w:bCs/>
           <w:lang w:val="pt-AO"/>
         </w:rPr>
         <w:t xml:space="preserve"> </w:t>
       </w:r>
-      <w:r>
-        <w:rPr>
-          <w:rFonts w:cs="Arial"/>
-          <w:lang w:val="pt-AO"/>
-        </w:rPr>
-        <w:t xml:space="preserve">e </w:t>
-      </w:r>
-      <w:r>
-        <w:rPr>
-          <w:rFonts w:cs="Arial"/>
-          <w:lang w:val="pt-AO"/>
-        </w:rPr>
-        <w:t>realizar soli</w:t>
-      </w:r>
-      <w:r>
-        <w:rPr>
-          <w:rFonts w:cs="Arial"/>
-          <w:lang w:val="pt-AO"/>
-        </w:rPr>
-        <w:t>citações por parte dos seus educandos.</w:t>
-      </w:r>
-    </w:p>
-    <w:p>
-      <w:pPr>
-        <w:rPr>
-          <w:rFonts w:cs="Arial"/>
-          <w:lang w:val="pt-AO"/>
-        </w:rPr>
-      </w:pPr>
-      <w:r>
-        <w:rPr>
-          <w:rFonts w:cs="Arial"/>
-          <w:lang w:val="pt-AO"/>
-        </w:rPr>
-        <w:t>Administradores (Secretário, Direitores)</w:t>
-      </w:r>
-      <w:r>
-        <w:rPr>
-          <w:rFonts w:cs="Arial"/>
-          <w:lang w:val="pt-AO"/>
-        </w:rPr>
-        <w:t>: responsáveis pelo gerenciamento dos dados que circulam pelo sistema, e pelo monitoramento das actividades dos usuarios, podendo também realizar solicitações a pedido de alunos ou encarregados.</w:t>
-      </w:r>
-    </w:p>
-    <w:p>
-      <w:pPr>
-        <w:rPr>
-          <w:rFonts w:cs="Arial"/>
-          <w:b/>
-          <w:bCs/>
-          <w:lang w:val="pt-AO"/>
-        </w:rPr>
-      </w:pPr>
-      <w:r>
-        <w:rPr>
-          <w:rFonts w:cs="Arial"/>
-          <w:b/>
-          <w:bCs/>
-          <w:lang w:val="pt-AO"/>
-        </w:rPr>
-        <w:t>Funcionalidades</w:t>
-      </w:r>
-    </w:p>
-    <w:p>
-      <w:pPr>
-        <w:ind w:firstLine="0"/>
-        <w:rPr>
-          <w:rFonts w:cs="Arial"/>
-          <w:lang w:val="pt-AO"/>
-        </w:rPr>
-      </w:pPr>
-      <w:r>
-        <w:rPr>
-          <w:rFonts w:cs="Arial"/>
-          <w:lang w:val="pt-AO"/>
-        </w:rPr>
-        <w:t>O sistema desenpenha diversas funções:</w:t>
-      </w:r>
-    </w:p>
-    <w:p>
-      <w:pPr>
-        <w:ind w:firstLine="0"/>
-        <w:rPr>
-          <w:rFonts w:cs="Arial"/>
-          <w:lang w:val="pt-AO"/>
-        </w:rPr>
-      </w:pPr>
-      <w:r>
-        <w:rPr>
-          <w:rFonts w:cs="Arial"/>
-          <w:lang w:val="pt-AO"/>
-        </w:rPr>
-        <w:t>Listagem das solicitações de documentos</w:t>
-      </w:r>
-    </w:p>
-    <w:p>
-      <w:pPr>
-        <w:ind w:firstLine="0"/>
-        <w:rPr>
-          <w:rFonts w:cs="Arial"/>
-          <w:lang w:val="pt-AO"/>
-        </w:rPr>
-      </w:pPr>
-      <w:r>
-        <w:rPr>
-          <w:rFonts w:cs="Arial"/>
-          <w:lang w:val="pt-AO"/>
-        </w:rPr>
-        <w:t>Geração de relatórios</w:t>
-      </w:r>
-    </w:p>
-    <w:p>
-      <w:pPr>
-        <w:ind w:firstLine="0"/>
-        <w:rPr>
-          <w:rFonts w:cs="Arial"/>
-          <w:lang w:val="pt-AO"/>
-        </w:rPr>
-      </w:pPr>
-      <w:r>
-        <w:rPr>
-          <w:rFonts w:cs="Arial"/>
-          <w:lang w:val="pt-AO"/>
-        </w:rPr>
-        <w:t>Login com niveis de acessos distintos</w:t>
-      </w:r>
-    </w:p>
-    <w:p>
-      <w:pPr>
-        <w:ind w:firstLine="0"/>
-        <w:rPr>
-          <w:rFonts w:cs="Arial"/>
-          <w:lang w:val="pt-AO"/>
-        </w:rPr>
-      </w:pPr>
-      <w:r>
-        <w:rPr>
-          <w:rFonts w:cs="Arial"/>
-          <w:lang w:val="pt-AO"/>
-        </w:rPr>
-        <w:t>Emissão de declarações</w:t>
-      </w:r>
-    </w:p>
-    <w:p>
-      <w:pPr>
-        <w:ind w:firstLine="0"/>
-        <w:rPr>
-          <w:rFonts w:cs="Arial"/>
-          <w:lang w:val="pt-AO"/>
-        </w:rPr>
-      </w:pPr>
-      <w:r>
-        <w:rPr>
-          <w:rFonts w:cs="Arial"/>
-          <w:lang w:val="pt-AO"/>
-        </w:rPr>
-        <w:t>Listagens dos históricos de logins e logouts</w:t>
-      </w:r>
-    </w:p>
-    <w:p>
-      <w:pPr>
-        <w:ind w:firstLine="0"/>
-        <w:rPr>
-          <w:rFonts w:cs="Arial"/>
-          <w:lang w:val="pt-AO"/>
-        </w:rPr>
-      </w:pPr>
-      <w:r>
-        <w:rPr>
-          <w:rFonts w:cs="Arial"/>
-          <w:lang w:val="pt-AO"/>
-        </w:rPr>
-        <w:t>Monitoramento dos educandos</w:t>
-      </w:r>
-    </w:p>
-    <w:p>
-      <w:pPr>
-        <w:ind w:firstLine="0"/>
-        <w:rPr>
-          <w:rFonts w:cs="Arial"/>
-          <w:lang w:val="pt-AO"/>
-        </w:rPr>
-      </w:pPr>
-      <w:r>
-        <w:rPr>
-          <w:rFonts w:cs="Arial"/>
-          <w:lang w:val="pt-AO"/>
-        </w:rPr>
-        <w:t>Geração de Cópias de Segurança</w:t>
-      </w:r>
     </w:p>
     <w:p>
       <w:pPr>
@@ -5992,118 +5878,1103 @@
           <w:rFonts w:cs="Arial"/>
           <w:lang w:val="pt-AO"/>
         </w:rPr>
-        <w:t>Não Funcionais</w:t>
+        <w:t>Cadastro de solicitações de declarações</w:t>
+      </w:r>
+    </w:p>
+    <w:p>
+      <w:pPr>
+        <w:ind w:firstLine="0"/>
+        <w:rPr>
+          <w:rFonts w:cs="Arial"/>
+          <w:lang w:val="pt-AO"/>
+        </w:rPr>
+      </w:pPr>
+    </w:p>
+    <w:p>
+      <w:pPr>
+        <w:ind w:firstLine="0"/>
+        <w:rPr>
+          <w:rFonts w:cs="Arial"/>
+          <w:lang w:val="pt-AO"/>
+        </w:rPr>
+      </w:pPr>
+      <w:r>
+        <w:rPr>
+          <w:rFonts w:cs="Arial"/>
+          <w:lang w:val="pt-AO"/>
+        </w:rPr>
+        <w:t>Permitir que alunos e encarregados registrem solicitações de documentos, informando dados pessoais, tipo de declaração e finalidade.</w:t>
+      </w:r>
+    </w:p>
+    <w:p>
+      <w:pPr>
+        <w:ind w:firstLine="0"/>
+        <w:rPr>
+          <w:rFonts w:cs="Arial"/>
+          <w:lang w:val="pt-AO"/>
+        </w:rPr>
+      </w:pPr>
+    </w:p>
+    <w:p>
+      <w:pPr>
+        <w:ind w:firstLine="0"/>
+        <w:rPr>
+          <w:rFonts w:cs="Arial"/>
+          <w:lang w:val="pt-AO"/>
+        </w:rPr>
+      </w:pPr>
+      <w:r>
+        <w:rPr>
+          <w:rFonts w:cs="Arial"/>
+          <w:lang w:val="pt-AO"/>
+        </w:rPr>
+        <w:t>Garantir a validação mínima dos dados antes do envio, evitando inconsistências.</w:t>
+      </w:r>
+    </w:p>
+    <w:p>
+      <w:pPr>
+        <w:ind w:firstLine="0"/>
+        <w:rPr>
+          <w:rFonts w:cs="Arial"/>
+          <w:lang w:val="pt-AO"/>
+        </w:rPr>
+      </w:pPr>
+    </w:p>
+    <w:p>
+      <w:pPr>
+        <w:ind w:firstLine="0"/>
+        <w:rPr>
+          <w:rFonts w:cs="Arial"/>
+          <w:lang w:val="pt-AO"/>
+        </w:rPr>
+      </w:pPr>
+      <w:r>
+        <w:rPr>
+          <w:rFonts w:cs="Arial"/>
+          <w:lang w:val="pt-AO"/>
+        </w:rPr>
+        <w:t>Emissão de declarações escolares</w:t>
+      </w:r>
+    </w:p>
+    <w:p>
+      <w:pPr>
+        <w:ind w:firstLine="0"/>
+        <w:rPr>
+          <w:rFonts w:cs="Arial"/>
+          <w:lang w:val="pt-AO"/>
+        </w:rPr>
+      </w:pPr>
+    </w:p>
+    <w:p>
+      <w:pPr>
+        <w:ind w:firstLine="0"/>
+        <w:rPr>
+          <w:rFonts w:cs="Arial"/>
+          <w:lang w:val="pt-AO"/>
+        </w:rPr>
+      </w:pPr>
+      <w:r>
+        <w:rPr>
+          <w:rFonts w:cs="Arial"/>
+          <w:lang w:val="pt-AO"/>
+        </w:rPr>
+        <w:t>Gerar declarações oficiais de forma automatizada, com dados confiáveis extraídos do banco de dados acadêmico.</w:t>
+      </w:r>
+    </w:p>
+    <w:p>
+      <w:pPr>
+        <w:ind w:firstLine="0"/>
+        <w:rPr>
+          <w:rFonts w:cs="Arial"/>
+          <w:lang w:val="pt-AO"/>
+        </w:rPr>
+      </w:pPr>
+    </w:p>
+    <w:p>
+      <w:pPr>
+        <w:ind w:firstLine="0"/>
+        <w:rPr>
+          <w:rFonts w:cs="Arial"/>
+          <w:lang w:val="pt-AO"/>
+        </w:rPr>
+      </w:pPr>
+      <w:r>
+        <w:rPr>
+          <w:rFonts w:cs="Arial"/>
+          <w:lang w:val="pt-AO"/>
+        </w:rPr>
+        <w:t>Permitir personalização de formatos, incluindo logotipo do instituto, carimbo digital e assinatura do responsável.</w:t>
+      </w:r>
+    </w:p>
+    <w:p>
+      <w:pPr>
+        <w:ind w:firstLine="0"/>
+        <w:rPr>
+          <w:rFonts w:cs="Arial"/>
+          <w:lang w:val="pt-AO"/>
+        </w:rPr>
+      </w:pPr>
+    </w:p>
+    <w:p>
+      <w:pPr>
+        <w:ind w:firstLine="0"/>
+        <w:rPr>
+          <w:rFonts w:cs="Arial"/>
+          <w:lang w:val="pt-AO"/>
+        </w:rPr>
+      </w:pPr>
+      <w:r>
+        <w:rPr>
+          <w:rFonts w:cs="Arial"/>
+          <w:lang w:val="pt-AO"/>
+        </w:rPr>
+        <w:t>Listagem de solicitações</w:t>
+      </w:r>
+    </w:p>
+    <w:p>
+      <w:pPr>
+        <w:ind w:firstLine="0"/>
+        <w:rPr>
+          <w:rFonts w:cs="Arial"/>
+          <w:lang w:val="pt-AO"/>
+        </w:rPr>
+      </w:pPr>
+    </w:p>
+    <w:p>
+      <w:pPr>
+        <w:ind w:firstLine="0"/>
+        <w:rPr>
+          <w:rFonts w:cs="Arial"/>
+          <w:lang w:val="pt-AO"/>
+        </w:rPr>
+      </w:pPr>
+      <w:r>
+        <w:rPr>
+          <w:rFonts w:cs="Arial"/>
+          <w:lang w:val="pt-AO"/>
+        </w:rPr>
+        <w:t>Exibir todas as solicitações registradas, com filtros por data, tipo de documento, status da solicitação e usuário solicitante.</w:t>
+      </w:r>
+    </w:p>
+    <w:p>
+      <w:pPr>
+        <w:ind w:firstLine="0"/>
+        <w:rPr>
+          <w:rFonts w:cs="Arial"/>
+          <w:lang w:val="pt-AO"/>
+        </w:rPr>
+      </w:pPr>
+    </w:p>
+    <w:p>
+      <w:pPr>
+        <w:ind w:firstLine="0"/>
+        <w:rPr>
+          <w:rFonts w:cs="Arial"/>
+          <w:lang w:val="pt-AO"/>
+        </w:rPr>
+      </w:pPr>
+      <w:r>
+        <w:rPr>
+          <w:rFonts w:cs="Arial"/>
+          <w:lang w:val="pt-AO"/>
+        </w:rPr>
+        <w:t>Permitir ordenação e pesquisa rápida para facilitar o acompanhamento administrativo.</w:t>
+      </w:r>
+    </w:p>
+    <w:p>
+      <w:pPr>
+        <w:ind w:firstLine="0"/>
+        <w:rPr>
+          <w:rFonts w:cs="Arial"/>
+          <w:lang w:val="pt-AO"/>
+        </w:rPr>
+      </w:pPr>
+    </w:p>
+    <w:p>
+      <w:pPr>
+        <w:ind w:firstLine="0"/>
+        <w:rPr>
+          <w:rFonts w:cs="Arial"/>
+          <w:lang w:val="pt-AO"/>
+        </w:rPr>
+      </w:pPr>
+      <w:r>
+        <w:rPr>
+          <w:rFonts w:cs="Arial"/>
+          <w:lang w:val="pt-AO"/>
+        </w:rPr>
+        <w:t>Controle de usuários e login com níveis de acesso distintos</w:t>
+      </w:r>
+    </w:p>
+    <w:p>
+      <w:pPr>
+        <w:ind w:firstLine="0"/>
+        <w:rPr>
+          <w:rFonts w:cs="Arial"/>
+          <w:lang w:val="pt-AO"/>
+        </w:rPr>
+      </w:pPr>
+    </w:p>
+    <w:p>
+      <w:pPr>
+        <w:ind w:firstLine="0"/>
+        <w:rPr>
+          <w:rFonts w:cs="Arial"/>
+          <w:lang w:val="pt-AO"/>
+        </w:rPr>
+      </w:pPr>
+      <w:r>
+        <w:rPr>
+          <w:rFonts w:cs="Arial"/>
+          <w:lang w:val="pt-AO"/>
+        </w:rPr>
+        <w:t>Implementar autenticação segura para diferentes tipos de usuários: alunos, secretaria, administradores e encarregados.</w:t>
+      </w:r>
+    </w:p>
+    <w:p>
+      <w:pPr>
+        <w:ind w:firstLine="0"/>
+        <w:rPr>
+          <w:rFonts w:cs="Arial"/>
+          <w:lang w:val="pt-AO"/>
+        </w:rPr>
+      </w:pPr>
+    </w:p>
+    <w:p>
+      <w:pPr>
+        <w:ind w:firstLine="0"/>
+        <w:rPr>
+          <w:rFonts w:cs="Arial"/>
+          <w:lang w:val="pt-AO"/>
+        </w:rPr>
+      </w:pPr>
+      <w:r>
+        <w:rPr>
+          <w:rFonts w:cs="Arial"/>
+          <w:lang w:val="pt-AO"/>
+        </w:rPr>
+        <w:t>Garantir que cada usuário tenha acesso apenas às funcionalidades e informações permitidas pelo seu perfil.</w:t>
+      </w:r>
+    </w:p>
+    <w:p>
+      <w:pPr>
+        <w:ind w:firstLine="0"/>
+        <w:rPr>
+          <w:rFonts w:cs="Arial"/>
+          <w:lang w:val="pt-AO"/>
+        </w:rPr>
+      </w:pPr>
+    </w:p>
+    <w:p>
+      <w:pPr>
+        <w:ind w:firstLine="0"/>
+        <w:rPr>
+          <w:rFonts w:cs="Arial"/>
+          <w:lang w:val="pt-AO"/>
+        </w:rPr>
+      </w:pPr>
+      <w:r>
+        <w:rPr>
+          <w:rFonts w:cs="Arial"/>
+          <w:lang w:val="pt-AO"/>
+        </w:rPr>
+        <w:t>Registro e acompanhamento de atividades (histórico de logins e ações)</w:t>
+      </w:r>
+    </w:p>
+    <w:p>
+      <w:pPr>
+        <w:ind w:firstLine="0"/>
+        <w:rPr>
+          <w:rFonts w:cs="Arial"/>
+          <w:lang w:val="pt-AO"/>
+        </w:rPr>
+      </w:pPr>
+    </w:p>
+    <w:p>
+      <w:pPr>
+        <w:ind w:firstLine="0"/>
+        <w:rPr>
+          <w:rFonts w:cs="Arial"/>
+          <w:lang w:val="pt-AO"/>
+        </w:rPr>
+      </w:pPr>
+      <w:r>
+        <w:rPr>
+          <w:rFonts w:cs="Arial"/>
+          <w:lang w:val="pt-AO"/>
+        </w:rPr>
+        <w:t>Registrar todos os logins e logouts, além das ações críticas realizadas no sistema, como emissão de documentos e alterações de cadastro.</w:t>
+      </w:r>
+    </w:p>
+    <w:p>
+      <w:pPr>
+        <w:ind w:firstLine="0"/>
+        <w:rPr>
+          <w:rFonts w:cs="Arial"/>
+          <w:lang w:val="pt-AO"/>
+        </w:rPr>
+      </w:pPr>
+    </w:p>
+    <w:p>
+      <w:pPr>
+        <w:ind w:firstLine="0"/>
+        <w:rPr>
+          <w:rFonts w:cs="Arial"/>
+          <w:lang w:val="pt-AO"/>
+        </w:rPr>
+      </w:pPr>
+      <w:r>
+        <w:rPr>
+          <w:rFonts w:cs="Arial"/>
+          <w:lang w:val="pt-AO"/>
+        </w:rPr>
+        <w:t>Permitir geração de relatórios de auditoria para controle e segurança.</w:t>
+      </w:r>
+    </w:p>
+    <w:p>
+      <w:pPr>
+        <w:ind w:firstLine="0"/>
+        <w:rPr>
+          <w:rFonts w:cs="Arial"/>
+          <w:lang w:val="pt-AO"/>
+        </w:rPr>
+      </w:pPr>
+    </w:p>
+    <w:p>
+      <w:pPr>
+        <w:ind w:firstLine="0"/>
+        <w:rPr>
+          <w:rFonts w:cs="Arial"/>
+          <w:lang w:val="pt-AO"/>
+        </w:rPr>
+      </w:pPr>
+      <w:r>
+        <w:rPr>
+          <w:rFonts w:cs="Arial"/>
+          <w:lang w:val="pt-AO"/>
+        </w:rPr>
+        <w:t>Monitoramento de estudantes</w:t>
+      </w:r>
+    </w:p>
+    <w:p>
+      <w:pPr>
+        <w:ind w:firstLine="0"/>
+        <w:rPr>
+          <w:rFonts w:cs="Arial"/>
+          <w:lang w:val="pt-AO"/>
+        </w:rPr>
+      </w:pPr>
+    </w:p>
+    <w:p>
+      <w:pPr>
+        <w:ind w:firstLine="0"/>
+        <w:rPr>
+          <w:rFonts w:cs="Arial"/>
+          <w:lang w:val="pt-AO"/>
+        </w:rPr>
+      </w:pPr>
+      <w:r>
+        <w:rPr>
+          <w:rFonts w:cs="Arial"/>
+          <w:lang w:val="pt-AO"/>
+        </w:rPr>
+        <w:t>Permitir que encarregados acompanhem o andamento das solicitações e situações acadêmicas de seus dependentes (como frequência e documentos emitidos).</w:t>
+      </w:r>
+    </w:p>
+    <w:p>
+      <w:pPr>
+        <w:ind w:firstLine="0"/>
+        <w:rPr>
+          <w:rFonts w:cs="Arial"/>
+          <w:lang w:val="pt-AO"/>
+        </w:rPr>
+      </w:pPr>
+    </w:p>
+    <w:p>
+      <w:pPr>
+        <w:ind w:firstLine="0"/>
+        <w:rPr>
+          <w:rFonts w:cs="Arial"/>
+          <w:lang w:val="pt-AO"/>
+        </w:rPr>
+      </w:pPr>
+      <w:r>
+        <w:rPr>
+          <w:rFonts w:cs="Arial"/>
+          <w:lang w:val="pt-AO"/>
+        </w:rPr>
+        <w:t>Garantir acesso restrito e seguro aos dados de cada estudante.</w:t>
+      </w:r>
+    </w:p>
+    <w:p>
+      <w:pPr>
+        <w:ind w:firstLine="0"/>
+        <w:rPr>
+          <w:rFonts w:cs="Arial"/>
+          <w:lang w:val="pt-AO"/>
+        </w:rPr>
+      </w:pPr>
+    </w:p>
+    <w:p>
+      <w:pPr>
+        <w:ind w:firstLine="0"/>
+        <w:rPr>
+          <w:rFonts w:cs="Arial"/>
+          <w:lang w:val="pt-AO"/>
+        </w:rPr>
+      </w:pPr>
+      <w:r>
+        <w:rPr>
+          <w:rFonts w:cs="Arial"/>
+          <w:lang w:val="pt-AO"/>
+        </w:rPr>
+        <w:t>Geração de relatórios administrativos e acadêmicos</w:t>
+      </w:r>
+    </w:p>
+    <w:p>
+      <w:pPr>
+        <w:ind w:firstLine="0"/>
+        <w:rPr>
+          <w:rFonts w:cs="Arial"/>
+          <w:lang w:val="pt-AO"/>
+        </w:rPr>
+      </w:pPr>
+    </w:p>
+    <w:p>
+      <w:pPr>
+        <w:ind w:firstLine="0"/>
+        <w:rPr>
+          <w:rFonts w:cs="Arial"/>
+          <w:lang w:val="pt-AO"/>
+        </w:rPr>
+      </w:pPr>
+      <w:r>
+        <w:rPr>
+          <w:rFonts w:cs="Arial"/>
+          <w:lang w:val="pt-AO"/>
+        </w:rPr>
+        <w:lastRenderedPageBreak/>
+        <w:t>Produzir relatórios detalhados sobre solicitações, emissão de declarações, frequência de uso e desempenho do sistema.</w:t>
+      </w:r>
+    </w:p>
+    <w:p>
+      <w:pPr>
+        <w:ind w:firstLine="0"/>
+        <w:rPr>
+          <w:rFonts w:cs="Arial"/>
+          <w:lang w:val="pt-AO"/>
+        </w:rPr>
+      </w:pPr>
+    </w:p>
+    <w:p>
+      <w:pPr>
+        <w:ind w:firstLine="0"/>
+        <w:rPr>
+          <w:rFonts w:cs="Arial"/>
+          <w:lang w:val="pt-AO"/>
+        </w:rPr>
+      </w:pPr>
+      <w:r>
+        <w:rPr>
+          <w:rFonts w:cs="Arial"/>
+          <w:lang w:val="pt-AO"/>
+        </w:rPr>
+        <w:t>Permitir exportação em formatos PDF e Excel para análise e arquivamento.</w:t>
+      </w:r>
+    </w:p>
+    <w:p>
+      <w:pPr>
+        <w:ind w:firstLine="0"/>
+        <w:rPr>
+          <w:rFonts w:cs="Arial"/>
+          <w:lang w:val="pt-AO"/>
+        </w:rPr>
+      </w:pPr>
+    </w:p>
+    <w:p>
+      <w:pPr>
+        <w:ind w:firstLine="0"/>
+        <w:rPr>
+          <w:rFonts w:cs="Arial"/>
+          <w:lang w:val="pt-AO"/>
+        </w:rPr>
+      </w:pPr>
+      <w:r>
+        <w:rPr>
+          <w:rFonts w:cs="Arial"/>
+          <w:lang w:val="pt-AO"/>
+        </w:rPr>
+        <w:t>Geração de cópias de segurança (backup)</w:t>
+      </w:r>
+    </w:p>
+    <w:p>
+      <w:pPr>
+        <w:ind w:firstLine="0"/>
+        <w:rPr>
+          <w:rFonts w:cs="Arial"/>
+          <w:lang w:val="pt-AO"/>
+        </w:rPr>
+      </w:pPr>
+    </w:p>
+    <w:p>
+      <w:pPr>
+        <w:ind w:firstLine="0"/>
+        <w:rPr>
+          <w:rFonts w:cs="Arial"/>
+          <w:lang w:val="pt-AO"/>
+        </w:rPr>
+      </w:pPr>
+      <w:r>
+        <w:rPr>
+          <w:rFonts w:cs="Arial"/>
+          <w:lang w:val="pt-AO"/>
+        </w:rPr>
+        <w:t>Realizar backup automático dos dados do sistema em intervalos definidos.</w:t>
+      </w:r>
+    </w:p>
+    <w:p>
+      <w:pPr>
+        <w:ind w:firstLine="0"/>
+        <w:rPr>
+          <w:rFonts w:cs="Arial"/>
+          <w:lang w:val="pt-AO"/>
+        </w:rPr>
+      </w:pPr>
+    </w:p>
+    <w:p>
+      <w:pPr>
+        <w:ind w:firstLine="0"/>
+        <w:rPr>
+          <w:rFonts w:cs="Arial"/>
+          <w:lang w:val="pt-AO"/>
+        </w:rPr>
+      </w:pPr>
+      <w:r>
+        <w:rPr>
+          <w:rFonts w:cs="Arial"/>
+          <w:lang w:val="pt-AO"/>
+        </w:rPr>
+        <w:t>Permitir restauração segura das informações em caso de falhas ou perda de dados.</w:t>
+      </w:r>
+    </w:p>
+    <w:p>
+      <w:pPr>
+        <w:ind w:firstLine="0"/>
+        <w:rPr>
+          <w:rFonts w:cs="Arial"/>
+          <w:lang w:val="pt-AO"/>
+        </w:rPr>
+      </w:pPr>
+    </w:p>
+    <w:p>
+      <w:pPr>
+        <w:ind w:firstLine="0"/>
+        <w:rPr>
+          <w:rFonts w:cs="Arial"/>
+          <w:lang w:val="pt-AO"/>
+        </w:rPr>
+      </w:pPr>
+      <w:r>
+        <w:rPr>
+          <w:rFonts w:cs="Arial"/>
+          <w:lang w:val="pt-AO"/>
+        </w:rPr>
+        <w:t>Validação de informações e consistência dos dados</w:t>
+      </w:r>
+    </w:p>
+    <w:p>
+      <w:pPr>
+        <w:ind w:firstLine="0"/>
+        <w:rPr>
+          <w:rFonts w:cs="Arial"/>
+          <w:lang w:val="pt-AO"/>
+        </w:rPr>
+      </w:pPr>
+    </w:p>
+    <w:p>
+      <w:pPr>
+        <w:ind w:firstLine="0"/>
+        <w:rPr>
+          <w:rFonts w:cs="Arial"/>
+          <w:lang w:val="pt-AO"/>
+        </w:rPr>
+      </w:pPr>
+      <w:r>
+        <w:rPr>
+          <w:rFonts w:cs="Arial"/>
+          <w:lang w:val="pt-AO"/>
+        </w:rPr>
+        <w:t>Verificar automaticamente se os dados fornecidos estão completos e corretos antes da emissão de declarações.</w:t>
+      </w:r>
+    </w:p>
+    <w:p>
+      <w:pPr>
+        <w:ind w:firstLine="0"/>
+        <w:rPr>
+          <w:rFonts w:cs="Arial"/>
+          <w:lang w:val="pt-AO"/>
+        </w:rPr>
+      </w:pPr>
+    </w:p>
+    <w:p>
+      <w:pPr>
+        <w:ind w:firstLine="0"/>
+        <w:rPr>
+          <w:rFonts w:cs="Arial"/>
+          <w:lang w:val="pt-AO"/>
+        </w:rPr>
+      </w:pPr>
+      <w:r>
+        <w:rPr>
+          <w:rFonts w:cs="Arial"/>
+          <w:lang w:val="pt-AO"/>
+        </w:rPr>
+        <w:t>Alertar usuários e administradores sobre inconsistências ou dados faltantes.</w:t>
+      </w:r>
+    </w:p>
+    <w:p>
+      <w:pPr>
+        <w:ind w:firstLine="0"/>
+        <w:rPr>
+          <w:rFonts w:cs="Arial"/>
+          <w:lang w:val="pt-AO"/>
+        </w:rPr>
+      </w:pPr>
+    </w:p>
+    <w:p>
+      <w:pPr>
+        <w:ind w:firstLine="0"/>
+        <w:rPr>
+          <w:rFonts w:cs="Arial"/>
+          <w:lang w:val="pt-AO"/>
+        </w:rPr>
+      </w:pPr>
+      <w:r>
+        <w:rPr>
+          <w:rFonts w:cs="Arial"/>
+          <w:lang w:val="pt-AO"/>
+        </w:rPr>
+        <w:t>Notificações e alertas automáticos</w:t>
+      </w:r>
+    </w:p>
+    <w:p>
+      <w:pPr>
+        <w:ind w:firstLine="0"/>
+        <w:rPr>
+          <w:rFonts w:cs="Arial"/>
+          <w:lang w:val="pt-AO"/>
+        </w:rPr>
+      </w:pPr>
+    </w:p>
+    <w:p>
+      <w:pPr>
+        <w:ind w:firstLine="0"/>
+        <w:rPr>
+          <w:rFonts w:cs="Arial"/>
+          <w:lang w:val="pt-AO"/>
+        </w:rPr>
+      </w:pPr>
+      <w:r>
+        <w:rPr>
+          <w:rFonts w:cs="Arial"/>
+          <w:lang w:val="pt-AO"/>
+        </w:rPr>
+        <w:t>Enviar notificações aos usuários sobre status de solicitações (aprovação, rejeição ou pendência de informações).</w:t>
+      </w:r>
+    </w:p>
+    <w:p>
+      <w:pPr>
+        <w:ind w:firstLine="0"/>
+        <w:rPr>
+          <w:rFonts w:cs="Arial"/>
+          <w:lang w:val="pt-AO"/>
+        </w:rPr>
+      </w:pPr>
+    </w:p>
+    <w:p>
+      <w:pPr>
+        <w:ind w:firstLine="0"/>
+        <w:rPr>
+          <w:rFonts w:cs="Arial"/>
+          <w:lang w:val="pt-AO"/>
+        </w:rPr>
+      </w:pPr>
+      <w:r>
+        <w:rPr>
+          <w:rFonts w:cs="Arial"/>
+          <w:lang w:val="pt-AO"/>
+        </w:rPr>
+        <w:t>Alertar a secretaria sobre solicitações urgentes ou atrasadas.</w:t>
+      </w:r>
+    </w:p>
+    <w:p>
+      <w:pPr>
+        <w:ind w:firstLine="0"/>
+        <w:rPr>
+          <w:rFonts w:cs="Arial"/>
+          <w:lang w:val="pt-AO"/>
+        </w:rPr>
+      </w:pPr>
+    </w:p>
+    <w:p>
+      <w:pPr>
+        <w:ind w:firstLine="0"/>
+        <w:rPr>
+          <w:rFonts w:cs="Arial"/>
+          <w:lang w:val="pt-AO"/>
+        </w:rPr>
+      </w:pPr>
+      <w:r>
+        <w:rPr>
+          <w:rFonts w:cs="Arial"/>
+          <w:lang w:val="pt-AO"/>
+        </w:rPr>
+        <w:t>Exportação e impressão de documentos</w:t>
+      </w:r>
+    </w:p>
+    <w:p>
+      <w:pPr>
+        <w:ind w:firstLine="0"/>
+        <w:rPr>
+          <w:rFonts w:cs="Arial"/>
+          <w:lang w:val="pt-AO"/>
+        </w:rPr>
+      </w:pPr>
+    </w:p>
+    <w:p>
+      <w:pPr>
+        <w:ind w:firstLine="0"/>
+        <w:rPr>
+          <w:rFonts w:cs="Arial"/>
+          <w:lang w:val="pt-AO"/>
+        </w:rPr>
+      </w:pPr>
+      <w:r>
+        <w:rPr>
+          <w:rFonts w:cs="Arial"/>
+          <w:lang w:val="pt-AO"/>
+        </w:rPr>
+        <w:t>Permitir que declarações emitidas e relatórios possam ser exportados para PDF ou impressos diretamente pelo sistema.</w:t>
+      </w:r>
+    </w:p>
+    <w:p>
+      <w:pPr>
+        <w:ind w:firstLine="0"/>
+        <w:rPr>
+          <w:rFonts w:cs="Arial"/>
+          <w:lang w:val="pt-AO"/>
+        </w:rPr>
+      </w:pPr>
+    </w:p>
+    <w:p>
+      <w:pPr>
+        <w:ind w:firstLine="0"/>
+        <w:rPr>
+          <w:rFonts w:cs="Arial"/>
+          <w:lang w:val="pt-AO"/>
+        </w:rPr>
+      </w:pPr>
+      <w:r>
+        <w:rPr>
+          <w:rFonts w:cs="Arial"/>
+          <w:lang w:val="pt-AO"/>
+        </w:rPr>
+        <w:t>Garantir que os documentos emitidos mantenham integridade visual e legal.</w:t>
+      </w:r>
+    </w:p>
+    <w:p>
+      <w:pPr>
+        <w:ind w:firstLine="0"/>
+        <w:rPr>
+          <w:rFonts w:cs="Arial"/>
+          <w:lang w:val="pt-AO"/>
+        </w:rPr>
+      </w:pPr>
+    </w:p>
+    <w:p>
+      <w:pPr>
+        <w:ind w:firstLine="0"/>
+        <w:rPr>
+          <w:rFonts w:cs="Arial"/>
+          <w:lang w:val="pt-AO"/>
+        </w:rPr>
+      </w:pPr>
+      <w:r>
+        <w:rPr>
+          <w:rFonts w:cs="Arial"/>
+          <w:lang w:val="pt-AO"/>
+        </w:rPr>
+        <w:t>Pesquisa e filtragem de registros</w:t>
+      </w:r>
+    </w:p>
+    <w:p>
+      <w:pPr>
+        <w:ind w:firstLine="0"/>
+        <w:rPr>
+          <w:rFonts w:cs="Arial"/>
+          <w:lang w:val="pt-AO"/>
+        </w:rPr>
+      </w:pPr>
+    </w:p>
+    <w:p>
+      <w:pPr>
+        <w:ind w:firstLine="0"/>
+        <w:rPr>
+          <w:rFonts w:cs="Arial"/>
+          <w:lang w:val="pt-AO"/>
+        </w:rPr>
+      </w:pPr>
+      <w:r>
+        <w:rPr>
+          <w:rFonts w:cs="Arial"/>
+          <w:lang w:val="pt-AO"/>
+        </w:rPr>
+        <w:t>Disponibilizar ferramentas de busca avançada para localizar rapidamente solicitações, usuários e documentos.</w:t>
+      </w:r>
+    </w:p>
+    <w:p>
+      <w:pPr>
+        <w:ind w:firstLine="0"/>
+        <w:rPr>
+          <w:rFonts w:cs="Arial"/>
+          <w:lang w:val="pt-AO"/>
+        </w:rPr>
+      </w:pPr>
+    </w:p>
+    <w:p>
+      <w:pPr>
+        <w:ind w:firstLine="0"/>
+        <w:rPr>
+          <w:rFonts w:cs="Arial"/>
+          <w:lang w:val="pt-AO"/>
+        </w:rPr>
+      </w:pPr>
+      <w:r>
+        <w:rPr>
+          <w:rFonts w:cs="Arial"/>
+          <w:lang w:val="pt-AO"/>
+        </w:rPr>
+        <w:t>Permitir filtragem por múltiplos critérios: datas, tipo de declaração, status e usuário solicitante.</w:t>
+      </w:r>
+    </w:p>
+    <w:p>
+      <w:pPr>
+        <w:ind w:firstLine="0"/>
+        <w:rPr>
+          <w:rFonts w:cs="Arial"/>
+          <w:lang w:val="pt-AO"/>
+        </w:rPr>
+      </w:pPr>
+    </w:p>
+    <w:p>
+      <w:pPr>
+        <w:ind w:firstLine="0"/>
+        <w:rPr>
+          <w:rFonts w:cs="Arial"/>
+          <w:lang w:val="pt-AO"/>
+        </w:rPr>
+      </w:pPr>
+      <w:r>
+        <w:rPr>
+          <w:rFonts w:cs="Arial"/>
+          <w:lang w:val="pt-AO"/>
+        </w:rPr>
+        <w:t>Suporte a auditoria e conformidade</w:t>
+      </w:r>
+    </w:p>
+    <w:p>
+      <w:pPr>
+        <w:ind w:firstLine="0"/>
+        <w:rPr>
+          <w:rFonts w:cs="Arial"/>
+          <w:lang w:val="pt-AO"/>
+        </w:rPr>
+      </w:pPr>
+    </w:p>
+    <w:p>
+      <w:pPr>
+        <w:ind w:firstLine="0"/>
+        <w:rPr>
+          <w:rFonts w:cs="Arial"/>
+          <w:lang w:val="pt-AO"/>
+        </w:rPr>
+      </w:pPr>
+      <w:r>
+        <w:rPr>
+          <w:rFonts w:cs="Arial"/>
+          <w:lang w:val="pt-AO"/>
+        </w:rPr>
+        <w:t>Registrar todas as alterações feitas nos registros de declarações e usuários.</w:t>
+      </w:r>
+    </w:p>
+    <w:p>
+      <w:pPr>
+        <w:ind w:firstLine="0"/>
+        <w:rPr>
+          <w:rFonts w:cs="Arial"/>
+          <w:lang w:val="pt-AO"/>
+        </w:rPr>
+      </w:pPr>
+    </w:p>
+    <w:p>
+      <w:pPr>
+        <w:ind w:firstLine="0"/>
+        <w:rPr>
+          <w:rFonts w:cs="Arial"/>
+          <w:lang w:val="pt-AO"/>
+        </w:rPr>
+      </w:pPr>
+      <w:r>
+        <w:rPr>
+          <w:rFonts w:cs="Arial"/>
+          <w:lang w:val="pt-AO"/>
+        </w:rPr>
+        <w:t>Garantir rastreabilidade e histórico completo para auditorias internas e externas.</w:t>
       </w:r>
     </w:p>
     <w:p>
       <w:pPr>
         <w:pStyle w:val="NormalWeb"/>
         <w:spacing w:line="360" w:lineRule="auto"/>
-        <w:ind w:firstLine="708"/>
-        <w:jc w:val="both"/>
-        <w:rPr>
-          <w:rFonts w:ascii="Arial" w:hAnsi="Arial" w:cs="Arial"/>
-          <w:bCs/>
-        </w:rPr>
-      </w:pPr>
-      <w:r>
-        <w:rPr>
-          <w:rFonts w:ascii="Arial" w:hAnsi="Arial" w:cs="Arial"/>
-          <w:b/>
-          <w:bCs/>
-        </w:rPr>
-        <w:t>Usabilidade</w:t>
-      </w:r>
-      <w:r>
-        <w:rPr>
-          <w:rFonts w:ascii="Arial" w:hAnsi="Arial" w:cs="Arial"/>
-          <w:bCs/>
-        </w:rPr>
-        <w:t xml:space="preserve">: o sistema </w:t>
-      </w:r>
-      <w:r>
-        <w:rPr>
-          <w:rFonts w:ascii="Arial" w:hAnsi="Arial" w:cs="Arial"/>
-          <w:bCs/>
-        </w:rPr>
-        <w:t>é</w:t>
-      </w:r>
-      <w:r>
-        <w:rPr>
-          <w:rFonts w:ascii="Arial" w:hAnsi="Arial" w:cs="Arial"/>
-          <w:bCs/>
-        </w:rPr>
-        <w:t xml:space="preserve"> fácil de usar, com um visual simples, direto, e </w:t>
-      </w:r>
-      <w:r>
-        <w:rPr>
-          <w:rFonts w:ascii="Arial" w:hAnsi="Arial" w:cs="Arial"/>
-          <w:bCs/>
-        </w:rPr>
-        <w:t xml:space="preserve">para </w:t>
-      </w:r>
-      <w:r>
-        <w:rPr>
-          <w:rFonts w:ascii="Arial" w:hAnsi="Arial" w:cs="Arial"/>
-          <w:bCs/>
-        </w:rPr>
-        <w:t xml:space="preserve">que </w:t>
-      </w:r>
-      <w:r>
-        <w:rPr>
-          <w:rFonts w:ascii="Arial" w:hAnsi="Arial" w:cs="Arial"/>
-          <w:bCs/>
-        </w:rPr>
-        <w:t xml:space="preserve">qualquer </w:t>
-      </w:r>
-      <w:r>
-        <w:rPr>
-          <w:rFonts w:ascii="Arial" w:hAnsi="Arial" w:cs="Arial"/>
-          <w:bCs/>
-        </w:rPr>
-        <w:t xml:space="preserve"> usuário tenha facilidade em se familiarizar com o sistema evitando dúvidas e erros por parte dos usuários no exercício</w:t>
-      </w:r>
-      <w:r>
-        <w:rPr>
-          <w:rFonts w:ascii="Arial" w:hAnsi="Arial" w:cs="Arial"/>
-          <w:bCs/>
-        </w:rPr>
-        <w:t xml:space="preserve"> </w:t>
-      </w:r>
-      <w:r>
-        <w:rPr>
-          <w:rFonts w:ascii="Arial" w:hAnsi="Arial" w:cs="Arial"/>
-          <w:bCs/>
-        </w:rPr>
-        <w:t xml:space="preserve"> das suas actividades dentro do sistema.</w:t>
+        <w:rPr>
+          <w:rFonts w:ascii="Arial" w:eastAsiaTheme="minorHAnsi" w:hAnsi="Arial" w:cs="Arial"/>
+          <w:kern w:val="2"/>
+          <w:szCs w:val="22"/>
+          <w:lang w:val="pt-AO" w:eastAsia="en-US"/>
+          <w14:ligatures w14:val="standardContextual"/>
+        </w:rPr>
+      </w:pPr>
+      <w:r>
+        <w:rPr>
+          <w:rFonts w:ascii="Arial" w:eastAsiaTheme="minorHAnsi" w:hAnsi="Arial" w:cs="Arial"/>
+          <w:kern w:val="2"/>
+          <w:szCs w:val="22"/>
+          <w:lang w:val="pt-AO" w:eastAsia="en-US"/>
+          <w14:ligatures w14:val="standardContextual"/>
+        </w:rPr>
+        <w:t>Não Funcionais</w:t>
       </w:r>
     </w:p>
     <w:p>
       <w:pPr>
         <w:pStyle w:val="NormalWeb"/>
         <w:spacing w:line="360" w:lineRule="auto"/>
-        <w:ind w:firstLine="708"/>
-        <w:jc w:val="both"/>
-        <w:rPr>
-          <w:rFonts w:ascii="Arial" w:hAnsi="Arial" w:cs="Arial"/>
-          <w:bCs/>
-        </w:rPr>
-      </w:pPr>
-      <w:r>
-        <w:rPr>
-          <w:rFonts w:ascii="Arial" w:hAnsi="Arial" w:cs="Arial"/>
-          <w:b/>
-        </w:rPr>
-        <w:lastRenderedPageBreak/>
-        <w:t>Escalável:</w:t>
-      </w:r>
-      <w:r>
-        <w:rPr>
-          <w:rFonts w:ascii="Arial" w:hAnsi="Arial" w:cs="Arial"/>
-          <w:bCs/>
-        </w:rPr>
-        <w:t xml:space="preserve"> a arquitetura do sistema é modular o que permite que o sistema possa crescer a nível  exponencial sem dar problemas na implementação de novos modulos.</w:t>
-      </w:r>
+        <w:rPr>
+          <w:rFonts w:ascii="Arial" w:eastAsiaTheme="minorHAnsi" w:hAnsi="Arial" w:cs="Arial"/>
+          <w:kern w:val="2"/>
+          <w:szCs w:val="22"/>
+          <w:lang w:val="pt-AO" w:eastAsia="en-US"/>
+          <w14:ligatures w14:val="standardContextual"/>
+        </w:rPr>
+      </w:pPr>
+    </w:p>
+    <w:p>
+      <w:pPr>
+        <w:pStyle w:val="NormalWeb"/>
+        <w:spacing w:line="360" w:lineRule="auto"/>
+        <w:rPr>
+          <w:rFonts w:ascii="Arial" w:eastAsiaTheme="minorHAnsi" w:hAnsi="Arial" w:cs="Arial"/>
+          <w:kern w:val="2"/>
+          <w:szCs w:val="22"/>
+          <w:lang w:val="pt-AO" w:eastAsia="en-US"/>
+          <w14:ligatures w14:val="standardContextual"/>
+        </w:rPr>
+      </w:pPr>
+      <w:r>
+        <w:rPr>
+          <w:rFonts w:ascii="Arial" w:eastAsiaTheme="minorHAnsi" w:hAnsi="Arial" w:cs="Arial"/>
+          <w:kern w:val="2"/>
+          <w:szCs w:val="22"/>
+          <w:lang w:val="pt-AO" w:eastAsia="en-US"/>
+          <w14:ligatures w14:val="standardContextual"/>
+        </w:rPr>
+        <w:t>Usabilidade: O sistema deve ser fácil de usar, com interface clara e intuitiva, permitindo que qualquer usuário se familiarize rapidamente com suas funcionalidades, reduzindo dúvidas e erros no uso.</w:t>
+      </w:r>
+    </w:p>
+    <w:p>
+      <w:pPr>
+        <w:pStyle w:val="NormalWeb"/>
+        <w:spacing w:line="360" w:lineRule="auto"/>
+        <w:rPr>
+          <w:rFonts w:ascii="Arial" w:eastAsiaTheme="minorHAnsi" w:hAnsi="Arial" w:cs="Arial"/>
+          <w:kern w:val="2"/>
+          <w:szCs w:val="22"/>
+          <w:lang w:val="pt-AO" w:eastAsia="en-US"/>
+          <w14:ligatures w14:val="standardContextual"/>
+        </w:rPr>
+      </w:pPr>
+    </w:p>
+    <w:p>
+      <w:pPr>
+        <w:pStyle w:val="NormalWeb"/>
+        <w:spacing w:line="360" w:lineRule="auto"/>
+        <w:rPr>
+          <w:rFonts w:ascii="Arial" w:eastAsiaTheme="minorHAnsi" w:hAnsi="Arial" w:cs="Arial"/>
+          <w:kern w:val="2"/>
+          <w:szCs w:val="22"/>
+          <w:lang w:val="pt-AO" w:eastAsia="en-US"/>
+          <w14:ligatures w14:val="standardContextual"/>
+        </w:rPr>
+      </w:pPr>
+      <w:r>
+        <w:rPr>
+          <w:rFonts w:ascii="Arial" w:eastAsiaTheme="minorHAnsi" w:hAnsi="Arial" w:cs="Arial"/>
+          <w:kern w:val="2"/>
+          <w:szCs w:val="22"/>
+          <w:lang w:val="pt-AO" w:eastAsia="en-US"/>
+          <w14:ligatures w14:val="standardContextual"/>
+        </w:rPr>
+        <w:t>Escalabilidade: A arquitetura modular do sistema permite a expansão com novos módulos sem comprometer sua estabilidade e funcionamento.</w:t>
+      </w:r>
+    </w:p>
+    <w:p>
+      <w:pPr>
+        <w:pStyle w:val="NormalWeb"/>
+        <w:spacing w:line="360" w:lineRule="auto"/>
+        <w:rPr>
+          <w:rFonts w:ascii="Arial" w:eastAsiaTheme="minorHAnsi" w:hAnsi="Arial" w:cs="Arial"/>
+          <w:kern w:val="2"/>
+          <w:szCs w:val="22"/>
+          <w:lang w:val="pt-AO" w:eastAsia="en-US"/>
+          <w14:ligatures w14:val="standardContextual"/>
+        </w:rPr>
+      </w:pPr>
+    </w:p>
+    <w:p>
+      <w:pPr>
+        <w:pStyle w:val="NormalWeb"/>
+        <w:spacing w:line="360" w:lineRule="auto"/>
+        <w:rPr>
+          <w:rFonts w:ascii="Arial" w:eastAsiaTheme="minorHAnsi" w:hAnsi="Arial" w:cs="Arial"/>
+          <w:kern w:val="2"/>
+          <w:szCs w:val="22"/>
+          <w:lang w:val="pt-AO" w:eastAsia="en-US"/>
+          <w14:ligatures w14:val="standardContextual"/>
+        </w:rPr>
+      </w:pPr>
+      <w:r>
+        <w:rPr>
+          <w:rFonts w:ascii="Arial" w:eastAsiaTheme="minorHAnsi" w:hAnsi="Arial" w:cs="Arial"/>
+          <w:kern w:val="2"/>
+          <w:szCs w:val="22"/>
+          <w:lang w:val="pt-AO" w:eastAsia="en-US"/>
+          <w14:ligatures w14:val="standardContextual"/>
+        </w:rPr>
+        <w:t>Desempenho: O sistema deve apresentar processamento rápido e eficiente, com código otimizado para garantir alta performance.</w:t>
+      </w:r>
+    </w:p>
+    <w:p>
+      <w:pPr>
+        <w:pStyle w:val="NormalWeb"/>
+        <w:spacing w:line="360" w:lineRule="auto"/>
+        <w:rPr>
+          <w:rFonts w:ascii="Arial" w:eastAsiaTheme="minorHAnsi" w:hAnsi="Arial" w:cs="Arial"/>
+          <w:kern w:val="2"/>
+          <w:szCs w:val="22"/>
+          <w:lang w:val="pt-AO" w:eastAsia="en-US"/>
+          <w14:ligatures w14:val="standardContextual"/>
+        </w:rPr>
+      </w:pPr>
     </w:p>
     <w:p>
       <w:pPr>
@@ -6113,104 +6984,19 @@
         <w:rPr>
           <w:rFonts w:ascii="Arial" w:hAnsi="Arial" w:cs="Arial"/>
           <w:bCs/>
-        </w:rPr>
-      </w:pPr>
-      <w:r>
-        <w:rPr>
-          <w:rFonts w:ascii="Arial" w:hAnsi="Arial" w:cs="Arial"/>
-          <w:bCs/>
-        </w:rPr>
-        <w:t xml:space="preserve"> </w:t>
-      </w:r>
-      <w:r>
-        <w:rPr>
-          <w:rFonts w:ascii="Arial" w:hAnsi="Arial" w:cs="Arial"/>
-          <w:bCs/>
-        </w:rPr>
-        <w:tab/>
-      </w:r>
-      <w:r>
-        <w:rPr>
-          <w:rFonts w:ascii="Arial" w:hAnsi="Arial" w:cs="Arial"/>
-          <w:b/>
-          <w:bCs/>
-        </w:rPr>
-        <w:t>Desempenho</w:t>
-      </w:r>
-      <w:r>
-        <w:rPr>
-          <w:rFonts w:ascii="Arial" w:hAnsi="Arial" w:cs="Arial"/>
-          <w:bCs/>
-        </w:rPr>
-        <w:t xml:space="preserve">: </w:t>
-      </w:r>
-      <w:r>
-        <w:rPr>
-          <w:rFonts w:ascii="Arial" w:hAnsi="Arial" w:cs="Arial"/>
-          <w:bCs/>
-        </w:rPr>
-        <w:t>o sistema foi projectado para ter performance e rápidez no processamento, seu código está otimizado.</w:t>
-      </w:r>
-    </w:p>
-    <w:p>
-      <w:pPr>
-        <w:pStyle w:val="NormalWeb"/>
-        <w:spacing w:line="360" w:lineRule="auto"/>
-        <w:jc w:val="both"/>
-        <w:rPr>
-          <w:rFonts w:ascii="Arial" w:hAnsi="Arial" w:cs="Arial"/>
-          <w:bCs/>
-        </w:rPr>
-      </w:pPr>
-      <w:r>
-        <w:rPr>
-          <w:rFonts w:ascii="Arial" w:hAnsi="Arial" w:cs="Arial"/>
-          <w:bCs/>
-        </w:rPr>
-        <w:t xml:space="preserve"> </w:t>
-      </w:r>
-      <w:r>
-        <w:rPr>
-          <w:rFonts w:ascii="Arial" w:hAnsi="Arial" w:cs="Arial"/>
-          <w:bCs/>
-        </w:rPr>
-        <w:tab/>
-      </w:r>
-      <w:r>
-        <w:rPr>
-          <w:rFonts w:ascii="Arial" w:hAnsi="Arial" w:cs="Arial"/>
-          <w:b/>
-          <w:bCs/>
-        </w:rPr>
-        <w:t>Segurança:</w:t>
-      </w:r>
-      <w:r>
-        <w:rPr>
-          <w:rFonts w:ascii="Arial" w:hAnsi="Arial" w:cs="Arial"/>
-          <w:bCs/>
-        </w:rPr>
-        <w:t xml:space="preserve"> </w:t>
-      </w:r>
-      <w:r>
-        <w:rPr>
-          <w:rFonts w:ascii="Arial" w:hAnsi="Arial" w:cs="Arial"/>
-          <w:bCs/>
-        </w:rPr>
-        <w:t>o sistema tem forte segurança e robustez, garantido estabilidade n</w:t>
-      </w:r>
-      <w:r>
-        <w:rPr>
-          <w:rFonts w:ascii="Arial" w:hAnsi="Arial" w:cs="Arial"/>
-          <w:bCs/>
-        </w:rPr>
-        <w:t>os dados</w:t>
-      </w:r>
-      <w:r>
-        <w:rPr>
-          <w:rFonts w:ascii="Arial" w:hAnsi="Arial" w:cs="Arial"/>
-          <w:bCs/>
-        </w:rPr>
-        <w:t>, e dando acesso apenas para entidades autorizadas</w:t>
+          <w:lang w:val="pt-AO"/>
+        </w:rPr>
+      </w:pPr>
+      <w:r>
+        <w:rPr>
+          <w:rFonts w:ascii="Arial" w:eastAsiaTheme="minorHAnsi" w:hAnsi="Arial" w:cs="Arial"/>
+          <w:kern w:val="2"/>
+          <w:szCs w:val="22"/>
+          <w:lang w:val="pt-AO" w:eastAsia="en-US"/>
+          <w14:ligatures w14:val="standardContextual"/>
+        </w:rPr>
+        <w:lastRenderedPageBreak/>
+        <w:t>Segurança: O sistema deve ser seguro e robusto, garantindo a integridade dos dados e acesso restrito a usuários autorizados.</w:t>
       </w:r>
     </w:p>
     <w:p>
@@ -7748,7 +8534,6 @@
   <w:style w:type="character" w:default="1" w:styleId="DefaultParagraphFont">
     <w:name w:val="Default Paragraph Font"/>
     <w:uiPriority w:val="1"/>
-    <w:semiHidden/>
     <w:unhideWhenUsed/>
   </w:style>
   <w:style w:type="table" w:default="1" w:styleId="TableNormal">

</xml_diff>

<commit_message>
refactor: declaração sem notas adicionada, tcc e melhoria no soliciticao flow
</commit_message>
<xml_diff>
--- a/docs/TCC-PAP-Projecto-Fim-Curso-Gestao-Declaracao.docx
+++ b/docs/TCC-PAP-Projecto-Fim-Curso-Gestao-Declaracao.docx
@@ -37,7 +37,7 @@
                     </pic:cNvPicPr>
                   </pic:nvPicPr>
                   <pic:blipFill>
-                    <a:blip r:embed="rId5">
+                    <a:blip r:embed="rId6">
                       <a:extLst>
                         <a:ext uri="{28A0092B-C50C-407E-A947-70E740481C1C}">
                           <a14:useLocalDpi xmlns:a14="http://schemas.microsoft.com/office/drawing/2010/main" val="0"/>
@@ -448,7 +448,7 @@
                     <pic:cNvPicPr/>
                   </pic:nvPicPr>
                   <pic:blipFill>
-                    <a:blip r:embed="rId6">
+                    <a:blip r:embed="rId7">
                       <a:extLst>
                         <a:ext uri="{28A0092B-C50C-407E-A947-70E740481C1C}">
                           <a14:useLocalDpi xmlns:a14="http://schemas.microsoft.com/office/drawing/2010/main" val="0"/>
@@ -597,7 +597,6 @@
     <w:p>
       <w:pPr>
         <w:spacing w:after="0"/>
-        <w:jc w:val="center"/>
         <w:rPr>
           <w:rFonts w:cs="Arial"/>
           <w:b/>
@@ -623,7 +622,6 @@
           <w:numId w:val="1"/>
         </w:numPr>
         <w:spacing w:after="0" w:line="360" w:lineRule="auto"/>
-        <w:jc w:val="center"/>
         <w:rPr>
           <w:rFonts w:cs="Arial"/>
           <w:b/>
@@ -649,7 +647,6 @@
           <w:numId w:val="1"/>
         </w:numPr>
         <w:spacing w:after="0" w:line="360" w:lineRule="auto"/>
-        <w:jc w:val="center"/>
         <w:rPr>
           <w:rFonts w:cs="Arial"/>
           <w:b/>
@@ -675,7 +672,6 @@
           <w:numId w:val="1"/>
         </w:numPr>
         <w:spacing w:after="0" w:line="360" w:lineRule="auto"/>
-        <w:jc w:val="center"/>
         <w:rPr>
           <w:rFonts w:cs="Arial"/>
           <w:b/>
@@ -701,7 +697,6 @@
           <w:numId w:val="1"/>
         </w:numPr>
         <w:spacing w:after="0" w:line="360" w:lineRule="auto"/>
-        <w:jc w:val="center"/>
         <w:rPr>
           <w:rFonts w:cs="Arial"/>
           <w:b/>
@@ -727,7 +722,6 @@
           <w:numId w:val="1"/>
         </w:numPr>
         <w:spacing w:after="0" w:line="360" w:lineRule="auto"/>
-        <w:jc w:val="center"/>
         <w:rPr>
           <w:rFonts w:cs="Arial"/>
           <w:b/>
@@ -1106,6 +1100,7 @@
           <w:sz w:val="28"/>
           <w:szCs w:val="40"/>
         </w:rPr>
+        <w:lastRenderedPageBreak/>
         <w:t>FOLHA DE APROVAÇÃO</w:t>
       </w:r>
     </w:p>
@@ -1429,6 +1424,7 @@
           <w:rFonts w:cs="Arial"/>
           <w:lang w:val="pt-AO"/>
         </w:rPr>
+        <w:lastRenderedPageBreak/>
         <w:t>DEDICATÓRIA</w:t>
       </w:r>
     </w:p>
@@ -1478,6 +1474,7 @@
           <w:rFonts w:cs="Arial"/>
           <w:lang w:val="pt-AO"/>
         </w:rPr>
+        <w:lastRenderedPageBreak/>
         <w:t>AGRADECIMENTO</w:t>
       </w:r>
     </w:p>
@@ -1526,6 +1523,7 @@
           <w:rFonts w:cs="Arial"/>
           <w:lang w:val="pt-AO"/>
         </w:rPr>
+        <w:lastRenderedPageBreak/>
         <w:t>EPÍGRAFE</w:t>
       </w:r>
     </w:p>
@@ -1599,6 +1597,7 @@
           <w:rFonts w:cs="Arial"/>
           <w:lang w:val="pt-AO"/>
         </w:rPr>
+        <w:lastRenderedPageBreak/>
         <w:t>RESUMO</w:t>
       </w:r>
     </w:p>
@@ -1730,6 +1729,7 @@
           <w:rFonts w:cs="Arial"/>
           <w:lang w:val="pt-AO"/>
         </w:rPr>
+        <w:lastRenderedPageBreak/>
         <w:t>ABSTRACT</w:t>
       </w:r>
     </w:p>
@@ -1824,6 +1824,7 @@
           <w:rFonts w:cs="Arial"/>
           <w:lang w:val="pt-AO"/>
         </w:rPr>
+        <w:lastRenderedPageBreak/>
         <w:t>LISTA DE ILUSTRAÇÕES</w:t>
       </w:r>
     </w:p>
@@ -1859,6 +1860,7 @@
           <w:rFonts w:cs="Arial"/>
           <w:lang w:val="pt-AO"/>
         </w:rPr>
+        <w:lastRenderedPageBreak/>
         <w:t>LISTA DE TABELAS</w:t>
       </w:r>
     </w:p>
@@ -1894,6 +1896,7 @@
           <w:rFonts w:cs="Arial"/>
           <w:lang w:val="pt-AO"/>
         </w:rPr>
+        <w:lastRenderedPageBreak/>
         <w:t>LISTA DE ABREVIATURAS E SIGLAS</w:t>
       </w:r>
     </w:p>
@@ -2336,6 +2339,7 @@
           <w:rFonts w:cs="Arial"/>
           <w:lang w:val="pt-AO"/>
         </w:rPr>
+        <w:lastRenderedPageBreak/>
         <w:t>SUMÁRIO</w:t>
       </w:r>
     </w:p>
@@ -2371,6 +2375,7 @@
           <w:rFonts w:cs="Arial"/>
           <w:lang w:val="pt-AO"/>
         </w:rPr>
+        <w:lastRenderedPageBreak/>
         <w:t>1 INTRODUÇÃO</w:t>
       </w:r>
     </w:p>
@@ -2568,6 +2573,7 @@
         <w:rPr>
           <w:rFonts w:cs="Arial"/>
         </w:rPr>
+        <w:lastRenderedPageBreak/>
         <w:t>Problemática</w:t>
       </w:r>
     </w:p>
@@ -2644,7 +2650,7 @@
           <w:b/>
           <w:bCs/>
         </w:rPr>
-        <w:t xml:space="preserve">&lt; </w:t>
+        <w:t xml:space="preserve">“ </w:t>
       </w:r>
       <w:r>
         <w:rPr>
@@ -2660,7 +2666,7 @@
           <w:b/>
           <w:bCs/>
         </w:rPr>
-        <w:t xml:space="preserve"> &gt;</w:t>
+        <w:t xml:space="preserve"> ”</w:t>
       </w:r>
     </w:p>
     <w:p>
@@ -2759,6 +2765,7 @@
           <w:sz w:val="28"/>
           <w:szCs w:val="40"/>
         </w:rPr>
+        <w:lastRenderedPageBreak/>
         <w:t>Objetivos</w:t>
       </w:r>
     </w:p>
@@ -2925,6 +2932,7 @@
         <w:rPr>
           <w:rFonts w:cs="Arial"/>
         </w:rPr>
+        <w:lastRenderedPageBreak/>
         <w:t>Justificativa</w:t>
       </w:r>
     </w:p>
@@ -3169,6 +3177,7 @@
         <w:rPr>
           <w:lang w:val="pt-AO"/>
         </w:rPr>
+        <w:lastRenderedPageBreak/>
         <w:t>1.1 Conceito de Sistema</w:t>
       </w:r>
     </w:p>
@@ -3333,6 +3342,7 @@
           <w:rFonts w:cs="Arial"/>
           <w:lang w:val="pt-AO"/>
         </w:rPr>
+        <w:lastRenderedPageBreak/>
         <w:t>Esse processo envolve a tomada de decisões estratégicas e operacionais que orientam as atividades institucionais, promovendo a utilização adequada dos recursos humanos, financeiros e tecnológicos disponíveis (Maximiano, 2017).</w:t>
       </w:r>
     </w:p>
@@ -3504,6 +3514,7 @@
         <w:rPr>
           <w:lang w:val="pt-AO"/>
         </w:rPr>
+        <w:lastRenderedPageBreak/>
         <w:t>1.6 Gestão de Declarações Escolares</w:t>
       </w:r>
     </w:p>
@@ -3668,7 +3679,15 @@
           <w:rFonts w:cs="Arial"/>
           <w:lang w:val="pt-AO"/>
         </w:rPr>
-        <w:t>No contexto das instituições de ensino, a automação permite a otimização de tarefas como o registro de dados, a emissão de documentos e o controle de solicitações, reduzindo o tempo de resposta e minimizando a ocorrência de erros humanos (Stair &amp; Reynolds, 2018).</w:t>
+        <w:t xml:space="preserve">No contexto das instituições de ensino, a automação permite a otimização de tarefas como o registro de dados, a emissão de documentos e o controle de </w:t>
+      </w:r>
+      <w:r>
+        <w:rPr>
+          <w:rFonts w:cs="Arial"/>
+          <w:lang w:val="pt-AO"/>
+        </w:rPr>
+        <w:lastRenderedPageBreak/>
+        <w:t>solicitações, reduzindo o tempo de resposta e minimizando a ocorrência de erros humanos (Stair &amp; Reynolds, 2018).</w:t>
       </w:r>
     </w:p>
     <w:p>
@@ -3850,7 +3869,20 @@
         <w:rPr>
           <w:lang w:val="pt-AO"/>
         </w:rPr>
-        <w:t xml:space="preserve">1.10. </w:t>
+        <w:lastRenderedPageBreak/>
+        <w:t>1.1</w:t>
+      </w:r>
+      <w:r>
+        <w:rPr>
+          <w:lang w:val="pt-AO"/>
+        </w:rPr>
+        <w:t>1</w:t>
+      </w:r>
+      <w:r>
+        <w:rPr>
+          <w:lang w:val="pt-AO"/>
+        </w:rPr>
+        <w:t xml:space="preserve">. </w:t>
       </w:r>
       <w:r>
         <w:rPr>
@@ -3861,28 +3893,31 @@
     </w:p>
     <w:p>
       <w:pPr>
-        <w:ind w:firstLine="0"/>
-        <w:rPr>
-          <w:rFonts w:cs="Arial"/>
-          <w:b/>
-          <w:bCs/>
-          <w:lang w:val="pt-AO"/>
-        </w:rPr>
-      </w:pPr>
-      <w:r>
-        <w:rPr>
-          <w:rFonts w:cs="Arial"/>
-          <w:b/>
-          <w:bCs/>
-          <w:lang w:val="pt-AO"/>
-        </w:rPr>
-        <w:t xml:space="preserve">1.10.1 </w:t>
-      </w:r>
-      <w:r>
-        <w:rPr>
-          <w:rFonts w:cs="Arial"/>
-          <w:b/>
-          <w:bCs/>
+        <w:pStyle w:val="Heading3"/>
+        <w:rPr>
+          <w:lang w:val="pt-AO"/>
+        </w:rPr>
+      </w:pPr>
+      <w:r>
+        <w:rPr>
+          <w:lang w:val="pt-AO"/>
+        </w:rPr>
+        <w:t>1.1</w:t>
+      </w:r>
+      <w:r>
+        <w:rPr>
+          <w:lang w:val="pt-AO"/>
+        </w:rPr>
+        <w:t>1</w:t>
+      </w:r>
+      <w:r>
+        <w:rPr>
+          <w:lang w:val="pt-AO"/>
+        </w:rPr>
+        <w:t xml:space="preserve">.1 </w:t>
+      </w:r>
+      <w:r>
+        <w:rPr>
           <w:lang w:val="pt-AO"/>
         </w:rPr>
         <w:t>React (Biblioteca JavaScript para Front-end)</w:t>
@@ -3900,547 +3935,454 @@
           <w:rFonts w:cs="Arial"/>
           <w:lang w:val="pt-AO"/>
         </w:rPr>
-        <w:t xml:space="preserve">O React é uma biblioteca JavaScript de código aberto desenvolvida para a construção de interfaces de usuário baseadas em componentes reutilizáveis e na atualização eficiente da interface por meio do conceito de DOM virtual. Essa abordagem permite maior desempenho e organização do código, especialmente em aplicações web de média e grande complexidade </w:t>
-      </w:r>
-      <w:r>
-        <w:rPr>
-          <w:rFonts w:cs="Arial"/>
-          <w:b/>
-          <w:bCs/>
-          <w:lang w:val="pt-AO"/>
-        </w:rPr>
-        <w:t>(Facebook Open Source, 2023)</w:t>
-      </w:r>
-      <w:r>
-        <w:rPr>
-          <w:rFonts w:cs="Arial"/>
+        <w:t>O React é uma biblioteca JavaScript de código aberto desenvolvida para a construção de interfaces de usuário baseadas em componentes reutilizáveis e na atualização eficiente da interface por meio do conceito de DOM virtual. Essa abordagem permite maior desempenho e organização do código, especialmente em aplicações web de média e grande complexidad</w:t>
+      </w:r>
+      <w:r>
+        <w:rPr>
+          <w:rFonts w:cs="Arial"/>
+          <w:lang w:val="pt-AO"/>
+        </w:rPr>
+        <w:t>e (Facebook Open Source, 2023).</w:t>
+      </w:r>
+    </w:p>
+    <w:p>
+      <w:pPr>
+        <w:rPr>
+          <w:rFonts w:cs="Arial"/>
+          <w:lang w:val="pt-AO"/>
+        </w:rPr>
+      </w:pPr>
+      <w:r>
+        <w:rPr>
+          <w:rFonts w:cs="Arial"/>
+          <w:lang w:val="pt-AO"/>
+        </w:rPr>
+        <w:t>No presente trabalho, o React foi utilizado para o desenvolvimento da camada de apresentação do sistema, sendo responsável pela interação entre o usuário e as funcionalidades de solicitação, visualização e gestão das declarações escolares.</w:t>
+      </w:r>
+    </w:p>
+    <w:p>
+      <w:pPr>
+        <w:pStyle w:val="Heading3"/>
+        <w:rPr>
+          <w:lang w:val="pt-AO"/>
+        </w:rPr>
+      </w:pPr>
+      <w:r>
+        <w:rPr>
+          <w:lang w:val="pt-AO"/>
+        </w:rPr>
+        <w:t>1.1</w:t>
+      </w:r>
+      <w:r>
+        <w:rPr>
+          <w:lang w:val="pt-AO"/>
+        </w:rPr>
+        <w:t>1</w:t>
+      </w:r>
+      <w:r>
+        <w:rPr>
+          <w:lang w:val="pt-AO"/>
+        </w:rPr>
+        <w:t xml:space="preserve">.2 </w:t>
+      </w:r>
+      <w:r>
+        <w:rPr>
+          <w:lang w:val="pt-AO"/>
+        </w:rPr>
+        <w:t>HTML e JavaScript</w:t>
+      </w:r>
+    </w:p>
+    <w:p>
+      <w:pPr>
+        <w:rPr>
+          <w:rFonts w:cs="Arial"/>
+          <w:lang w:val="pt-AO"/>
+        </w:rPr>
+      </w:pPr>
+      <w:r>
+        <w:rPr>
+          <w:rFonts w:cs="Arial"/>
+          <w:lang w:val="pt-AO"/>
+        </w:rPr>
+        <w:t xml:space="preserve">O HTML (HyperText Markup Language) é a linguagem padrão para a estruturação do conteúdo em aplicações web, enquanto o JavaScript é uma linguagem de programação responsável por proporcionar dinamismo e interatividade às páginas e sistemas baseados na web </w:t>
+      </w:r>
+      <w:r>
+        <w:rPr>
+          <w:rFonts w:cs="Arial"/>
+          <w:lang w:val="pt-AO"/>
+        </w:rPr>
+        <w:t>(Mozilla Developer Network, 2023).</w:t>
+      </w:r>
+    </w:p>
+    <w:p>
+      <w:pPr>
+        <w:rPr>
+          <w:rFonts w:cs="Arial"/>
+          <w:lang w:val="pt-AO"/>
+        </w:rPr>
+      </w:pPr>
+      <w:r>
+        <w:rPr>
+          <w:rFonts w:cs="Arial"/>
+          <w:lang w:val="pt-AO"/>
+        </w:rPr>
+        <w:t>No contexto do uso do React, essas tecnologias são integradas por meio da sintaxe JSX, que permite a combinação de estruturas HTML com lógica JavaScript, facilitando a criação de componentes e o gerenciamento do estado da aplicação.</w:t>
+      </w:r>
+    </w:p>
+    <w:p>
+      <w:pPr>
+        <w:pStyle w:val="Heading3"/>
+        <w:rPr>
+          <w:lang w:val="pt-AO"/>
+        </w:rPr>
+      </w:pPr>
+      <w:r>
+        <w:rPr>
+          <w:lang w:val="pt-AO"/>
+        </w:rPr>
+        <w:t>1.1</w:t>
+      </w:r>
+      <w:r>
+        <w:rPr>
+          <w:lang w:val="pt-AO"/>
+        </w:rPr>
+        <w:t>1</w:t>
+      </w:r>
+      <w:r>
+        <w:rPr>
+          <w:lang w:val="pt-AO"/>
+        </w:rPr>
+        <w:t xml:space="preserve">.3 </w:t>
+      </w:r>
+      <w:r>
+        <w:rPr>
+          <w:lang w:val="pt-AO"/>
+        </w:rPr>
+        <w:t>CSS e Tailwind CSS</w:t>
+      </w:r>
+    </w:p>
+    <w:p>
+      <w:pPr>
+        <w:rPr>
+          <w:rFonts w:cs="Arial"/>
+          <w:lang w:val="pt-AO"/>
+        </w:rPr>
+      </w:pPr>
+      <w:r>
+        <w:rPr>
+          <w:rFonts w:cs="Arial"/>
+          <w:lang w:val="pt-AO"/>
+        </w:rPr>
+        <w:t xml:space="preserve">O CSS (Cascading Style Sheets) é a tecnologia utilizada para a definição da apresentação visual e do layout de páginas web, permitindo a personalização </w:t>
+      </w:r>
+      <w:r>
+        <w:rPr>
+          <w:rFonts w:cs="Arial"/>
+          <w:lang w:val="pt-AO"/>
+        </w:rPr>
+        <w:t>de cores, tipografia e organização dos elementos gráficos da interface (W3C, 2023).</w:t>
+      </w:r>
+    </w:p>
+    <w:p>
+      <w:pPr>
+        <w:rPr>
+          <w:rFonts w:cs="Arial"/>
+          <w:lang w:val="pt-AO"/>
+        </w:rPr>
+      </w:pPr>
+      <w:r>
+        <w:rPr>
+          <w:rFonts w:cs="Arial"/>
+          <w:lang w:val="pt-AO"/>
+        </w:rPr>
+        <w:t>O Tailwind CSS é um framework utilitário baseado em classes que facilita a estilização rápida e padronizada das interfaces, promovendo maior produtividade no desenvolvimento e consistência visual no sistema (Tailwind Labs, 2023).</w:t>
+      </w:r>
+    </w:p>
+    <w:p>
+      <w:pPr>
+        <w:pStyle w:val="Heading3"/>
+        <w:rPr>
+          <w:lang w:val="pt-AO"/>
+        </w:rPr>
+      </w:pPr>
+      <w:r>
+        <w:rPr>
+          <w:lang w:val="pt-AO"/>
+        </w:rPr>
+        <w:t>1.1</w:t>
+      </w:r>
+      <w:r>
+        <w:rPr>
+          <w:lang w:val="pt-AO"/>
+        </w:rPr>
+        <w:t>1</w:t>
+      </w:r>
+      <w:r>
+        <w:rPr>
+          <w:lang w:val="pt-AO"/>
+        </w:rPr>
+        <w:t xml:space="preserve">.4 </w:t>
+      </w:r>
+      <w:r>
+        <w:rPr>
+          <w:lang w:val="pt-AO"/>
+        </w:rPr>
+        <w:t>Python, Django e Django REST Framework</w:t>
+      </w:r>
+    </w:p>
+    <w:p>
+      <w:pPr>
+        <w:rPr>
+          <w:rFonts w:cs="Arial"/>
+          <w:lang w:val="pt-AO"/>
+        </w:rPr>
+      </w:pPr>
+      <w:r>
+        <w:rPr>
+          <w:rFonts w:cs="Arial"/>
+          <w:lang w:val="pt-AO"/>
+        </w:rPr>
+        <w:t xml:space="preserve">O Python é uma linguagem de programação de alto nível amplamente utilizada no desenvolvimento de aplicações web, especialmente em ambientes que </w:t>
+      </w:r>
+      <w:r>
+        <w:rPr>
+          <w:rFonts w:cs="Arial"/>
+          <w:lang w:val="pt-AO"/>
+        </w:rPr>
+        <w:t>demandam rapidez na implementação e clareza na estrutura do código (Van Rossum &amp; Drake, 2009).</w:t>
+      </w:r>
+    </w:p>
+    <w:p>
+      <w:pPr>
+        <w:rPr>
+          <w:rFonts w:cs="Arial"/>
+          <w:lang w:val="pt-AO"/>
+        </w:rPr>
+      </w:pPr>
+      <w:r>
+        <w:rPr>
+          <w:rFonts w:cs="Arial"/>
+          <w:lang w:val="pt-AO"/>
+        </w:rPr>
+        <w:t>O Django é um framework web baseado em Python que adota o padrão arquitetural Model-View-Template (MVT), oferecendo recursos integrados para segurança, gerenciamento de banco de dados e organização modular do sistema (Holovaty &amp; Kaplan-Moss, 2009).</w:t>
+      </w:r>
+    </w:p>
+    <w:p>
+      <w:pPr>
+        <w:rPr>
+          <w:rFonts w:cs="Arial"/>
+          <w:lang w:val="pt-AO"/>
+        </w:rPr>
+      </w:pPr>
+      <w:r>
+        <w:rPr>
+          <w:rFonts w:cs="Arial"/>
+          <w:lang w:val="pt-AO"/>
+        </w:rPr>
+        <w:lastRenderedPageBreak/>
+        <w:t>O Django REST Framework é uma extensão do Django voltada para a construção de interfaces de programação de aplicações (APIs) no padrão REST, permitindo a comunicação entre o front-end desenvolvido em React e o back-end responsável pelo processamento e persistência dos dados.</w:t>
+      </w:r>
+    </w:p>
+    <w:p>
+      <w:pPr>
+        <w:pStyle w:val="Heading3"/>
+        <w:rPr>
+          <w:lang w:val="pt-AO"/>
+        </w:rPr>
+      </w:pPr>
+      <w:r>
+        <w:rPr>
+          <w:lang w:val="pt-AO"/>
+        </w:rPr>
+        <w:t>1.1</w:t>
+      </w:r>
+      <w:r>
+        <w:rPr>
+          <w:lang w:val="pt-AO"/>
+        </w:rPr>
+        <w:t>1</w:t>
+      </w:r>
+      <w:r>
+        <w:rPr>
+          <w:lang w:val="pt-AO"/>
+        </w:rPr>
+        <w:t xml:space="preserve">.5 </w:t>
+      </w:r>
+      <w:r>
+        <w:rPr>
+          <w:lang w:val="pt-AO"/>
+        </w:rPr>
+        <w:t>PostgreSQL (Sistema de Gerenciamento de Banco de Dados)</w:t>
+      </w:r>
+    </w:p>
+    <w:p>
+      <w:pPr>
+        <w:rPr>
+          <w:rFonts w:cs="Arial"/>
+          <w:lang w:val="pt-AO"/>
+        </w:rPr>
+      </w:pPr>
+      <w:r>
+        <w:rPr>
+          <w:rFonts w:cs="Arial"/>
+          <w:lang w:val="pt-AO"/>
+        </w:rPr>
+        <w:t xml:space="preserve">O PostgreSQL é um sistema de gerenciamento de banco de dados relacional e de código aberto, reconhecido por sua robustez, confiabilidade e suporte a padrões SQL avançados, sendo amplamente utilizado em sistemas que demandam integridade e consistência </w:t>
+      </w:r>
+      <w:r>
+        <w:rPr>
+          <w:rFonts w:cs="Arial"/>
+          <w:lang w:val="pt-AO"/>
+        </w:rPr>
+        <w:t>dos dados (PostgreSQL Global Development Group, 2023).</w:t>
+      </w:r>
+    </w:p>
+    <w:p>
+      <w:pPr>
+        <w:rPr>
+          <w:rFonts w:cs="Arial"/>
+          <w:lang w:val="pt-AO"/>
+        </w:rPr>
+      </w:pPr>
+      <w:r>
+        <w:rPr>
+          <w:rFonts w:cs="Arial"/>
+          <w:lang w:val="pt-AO"/>
+        </w:rPr>
+        <w:t>Neste projeto, o PostgreSQL foi utilizado para o armazenamento das informações acadêmicas, registros de solicitações e dados administrativos relacionados à gestão das declarações escolares.</w:t>
+      </w:r>
+    </w:p>
+    <w:p>
+      <w:pPr>
+        <w:pStyle w:val="Heading3"/>
+        <w:rPr>
+          <w:lang w:val="pt-AO"/>
+        </w:rPr>
+      </w:pPr>
+      <w:r>
+        <w:rPr>
+          <w:lang w:val="pt-AO"/>
+        </w:rPr>
+        <w:t>1.1</w:t>
+      </w:r>
+      <w:r>
+        <w:rPr>
+          <w:lang w:val="pt-AO"/>
+        </w:rPr>
+        <w:t>1</w:t>
+      </w:r>
+      <w:r>
+        <w:rPr>
+          <w:lang w:val="pt-AO"/>
+        </w:rPr>
+        <w:t xml:space="preserve">.6 </w:t>
+      </w:r>
+      <w:r>
+        <w:rPr>
+          <w:lang w:val="pt-AO"/>
+        </w:rPr>
+        <w:t>Ferramentas de Desenvolvimento e Ambiente</w:t>
+      </w:r>
+    </w:p>
+    <w:p>
+      <w:pPr>
+        <w:rPr>
+          <w:rFonts w:cs="Arial"/>
+          <w:lang w:val="pt-AO"/>
+        </w:rPr>
+      </w:pPr>
+      <w:r>
+        <w:rPr>
+          <w:rFonts w:cs="Arial"/>
+          <w:lang w:val="pt-AO"/>
+        </w:rPr>
+        <w:t xml:space="preserve">O Visual Studio Code é um editor de código-fonte multiplataforma que oferece suporte a diversas linguagens de programação, extensões e ferramentas de depuração, contribuindo para a produtividade no desenvolvimento de aplicações web </w:t>
+      </w:r>
+      <w:r>
+        <w:rPr>
+          <w:rFonts w:cs="Arial"/>
+          <w:lang w:val="pt-AO"/>
+        </w:rPr>
+        <w:t>(Microsoft, 2023).</w:t>
+      </w:r>
+    </w:p>
+    <w:p>
+      <w:pPr>
+        <w:rPr>
+          <w:rFonts w:cs="Arial"/>
+          <w:lang w:val="pt-AO"/>
+        </w:rPr>
+      </w:pPr>
+      <w:r>
+        <w:rPr>
+          <w:rFonts w:cs="Arial"/>
+          <w:lang w:val="pt-AO"/>
+        </w:rPr>
+        <w:t>Os navegadores Google Chrome e Microsoft Edge foram utilizados para a realização de testes e validação do funcionamento do sistema em ambiente web, assegurando a compatibilidade e o desempenho da interface em diferentes plataformas.</w:t>
+      </w:r>
+    </w:p>
+    <w:p>
+      <w:pPr>
+        <w:rPr>
+          <w:rFonts w:cs="Arial"/>
+          <w:lang w:val="pt-AO"/>
+        </w:rPr>
+      </w:pPr>
+      <w:r>
+        <w:rPr>
+          <w:rFonts w:cs="Arial"/>
+          <w:lang w:val="pt-AO"/>
+        </w:rPr>
+        <w:t>O uso do terminal de comandos permitiu a execução de tarefas relacionadas à instalação de dependências, gerenciamento de servidores locais e controle de versões durante o processo de desenvolvimento do sistema.</w:t>
+      </w:r>
+    </w:p>
+    <w:p>
+      <w:pPr>
+        <w:pStyle w:val="Heading2"/>
+        <w:rPr>
+          <w:lang w:val="pt-AO"/>
+        </w:rPr>
+      </w:pPr>
+      <w:r>
+        <w:rPr>
+          <w:lang w:val="pt-AO"/>
+        </w:rPr>
+        <w:t xml:space="preserve">1.12 </w:t>
+      </w:r>
+      <w:r>
+        <w:rPr>
+          <w:lang w:val="pt-AO"/>
+        </w:rPr>
+        <w:t>Arquitetura do Sistema</w:t>
+      </w:r>
+    </w:p>
+    <w:p>
+      <w:pPr>
+        <w:pStyle w:val="Heading3"/>
+        <w:rPr>
+          <w:lang w:val="pt-AO"/>
+        </w:rPr>
+      </w:pPr>
+      <w:r>
+        <w:rPr>
+          <w:lang w:val="pt-AO"/>
+        </w:rPr>
+        <w:t>1</w:t>
+      </w:r>
+      <w:r>
+        <w:rPr>
           <w:lang w:val="pt-AO"/>
         </w:rPr>
         <w:t>.</w:t>
       </w:r>
-    </w:p>
-    <w:p>
-      <w:pPr>
-        <w:rPr>
-          <w:rFonts w:cs="Arial"/>
-          <w:lang w:val="pt-AO"/>
-        </w:rPr>
-      </w:pPr>
-      <w:r>
-        <w:rPr>
-          <w:rFonts w:cs="Arial"/>
-          <w:lang w:val="pt-AO"/>
-        </w:rPr>
-        <w:t>No presente trabalho, o React foi utilizado para o desenvolvimento da camada de apresentação do sistema, sendo responsável pela interação entre o usuário e as funcionalidades de solicitação, visualização e gestão das declarações escolares.</w:t>
-      </w:r>
-    </w:p>
-    <w:p>
-      <w:pPr>
-        <w:ind w:firstLine="0"/>
-        <w:rPr>
-          <w:rFonts w:cs="Arial"/>
-          <w:b/>
-          <w:bCs/>
-          <w:lang w:val="pt-AO"/>
-        </w:rPr>
-      </w:pPr>
-      <w:r>
-        <w:rPr>
-          <w:rFonts w:cs="Arial"/>
-          <w:b/>
-          <w:bCs/>
-          <w:lang w:val="pt-AO"/>
-        </w:rPr>
-        <w:t xml:space="preserve">1.10.2 </w:t>
-      </w:r>
-      <w:r>
-        <w:rPr>
-          <w:rFonts w:cs="Arial"/>
-          <w:b/>
-          <w:bCs/>
-          <w:lang w:val="pt-AO"/>
-        </w:rPr>
-        <w:t>HTML e JavaScript</w:t>
-      </w:r>
-    </w:p>
-    <w:p>
-      <w:pPr>
-        <w:rPr>
-          <w:rFonts w:cs="Arial"/>
-          <w:lang w:val="pt-AO"/>
-        </w:rPr>
-      </w:pPr>
-      <w:r>
-        <w:rPr>
-          <w:rFonts w:cs="Arial"/>
-          <w:lang w:val="pt-AO"/>
-        </w:rPr>
-        <w:t xml:space="preserve">O HTML (HyperText Markup Language) é a linguagem padrão para a estruturação do conteúdo em aplicações web, enquanto o JavaScript é uma linguagem de programação responsável por proporcionar dinamismo e interatividade às páginas e sistemas baseados na web </w:t>
-      </w:r>
-      <w:r>
-        <w:rPr>
-          <w:rFonts w:cs="Arial"/>
-          <w:b/>
-          <w:bCs/>
-          <w:lang w:val="pt-AO"/>
-        </w:rPr>
-        <w:t>(Mozilla Developer Network, 2023)</w:t>
-      </w:r>
-      <w:r>
-        <w:rPr>
-          <w:rFonts w:cs="Arial"/>
-          <w:lang w:val="pt-AO"/>
-        </w:rPr>
-        <w:t>.</w:t>
-      </w:r>
-    </w:p>
-    <w:p>
-      <w:pPr>
-        <w:rPr>
-          <w:rFonts w:cs="Arial"/>
-          <w:lang w:val="pt-AO"/>
-        </w:rPr>
-      </w:pPr>
-      <w:r>
-        <w:rPr>
-          <w:rFonts w:cs="Arial"/>
-          <w:lang w:val="pt-AO"/>
-        </w:rPr>
-        <w:t>No contexto do uso do React, essas tecnologias são integradas por meio da sintaxe JSX, que permite a combinação de estruturas HTML com lógica JavaScript, facilitando a criação de componentes e o gerenciamento do estado da aplicação.</w:t>
-      </w:r>
-    </w:p>
-    <w:p>
-      <w:pPr>
-        <w:ind w:firstLine="0"/>
-        <w:rPr>
-          <w:rFonts w:cs="Arial"/>
-          <w:b/>
-          <w:bCs/>
-          <w:lang w:val="pt-AO"/>
-        </w:rPr>
-      </w:pPr>
-      <w:r>
-        <w:rPr>
-          <w:rFonts w:cs="Arial"/>
-          <w:b/>
-          <w:bCs/>
-          <w:lang w:val="pt-AO"/>
-        </w:rPr>
-        <w:t xml:space="preserve">1.10.3 </w:t>
-      </w:r>
-      <w:r>
-        <w:rPr>
-          <w:rFonts w:cs="Arial"/>
-          <w:b/>
-          <w:bCs/>
-          <w:lang w:val="pt-AO"/>
-        </w:rPr>
-        <w:t>CSS e Tailwind CSS</w:t>
-      </w:r>
-    </w:p>
-    <w:p>
-      <w:pPr>
-        <w:rPr>
-          <w:rFonts w:cs="Arial"/>
-          <w:lang w:val="pt-AO"/>
-        </w:rPr>
-      </w:pPr>
-      <w:r>
-        <w:rPr>
-          <w:rFonts w:cs="Arial"/>
-          <w:lang w:val="pt-AO"/>
-        </w:rPr>
-        <w:t xml:space="preserve">O CSS (Cascading Style Sheets) é a tecnologia utilizada para a definição da apresentação visual e do layout de páginas web, permitindo a personalização de cores, tipografia e organização dos elementos gráficos da interface </w:t>
-      </w:r>
-      <w:r>
-        <w:rPr>
-          <w:rFonts w:cs="Arial"/>
-          <w:b/>
-          <w:bCs/>
-          <w:lang w:val="pt-AO"/>
-        </w:rPr>
-        <w:t>(W3C, 2023)</w:t>
-      </w:r>
-      <w:r>
-        <w:rPr>
-          <w:rFonts w:cs="Arial"/>
-          <w:lang w:val="pt-AO"/>
-        </w:rPr>
-        <w:t>.</w:t>
-      </w:r>
-    </w:p>
-    <w:p>
-      <w:pPr>
-        <w:rPr>
-          <w:rFonts w:cs="Arial"/>
-          <w:lang w:val="pt-AO"/>
-        </w:rPr>
-      </w:pPr>
-      <w:r>
-        <w:rPr>
-          <w:rFonts w:cs="Arial"/>
-          <w:lang w:val="pt-AO"/>
-        </w:rPr>
-        <w:t xml:space="preserve">O Tailwind CSS é um framework utilitário baseado em classes que facilita a estilização rápida e padronizada das interfaces, promovendo maior produtividade no desenvolvimento e consistência visual no sistema </w:t>
-      </w:r>
-      <w:r>
-        <w:rPr>
-          <w:rFonts w:cs="Arial"/>
-          <w:b/>
-          <w:bCs/>
-          <w:lang w:val="pt-AO"/>
-        </w:rPr>
-        <w:t>(Tailwind Labs, 2023)</w:t>
-      </w:r>
-      <w:r>
-        <w:rPr>
-          <w:rFonts w:cs="Arial"/>
-          <w:lang w:val="pt-AO"/>
-        </w:rPr>
-        <w:t>.</w:t>
-      </w:r>
-    </w:p>
-    <w:p>
-      <w:pPr>
-        <w:ind w:firstLine="0"/>
-        <w:rPr>
-          <w:rFonts w:cs="Arial"/>
-          <w:b/>
-          <w:bCs/>
-          <w:lang w:val="pt-AO"/>
-        </w:rPr>
-      </w:pPr>
-      <w:r>
-        <w:rPr>
-          <w:rFonts w:cs="Arial"/>
-          <w:b/>
-          <w:bCs/>
-          <w:lang w:val="pt-AO"/>
-        </w:rPr>
-        <w:t xml:space="preserve">1.10.4 </w:t>
-      </w:r>
-      <w:r>
-        <w:rPr>
-          <w:rFonts w:cs="Arial"/>
-          <w:b/>
-          <w:bCs/>
-          <w:lang w:val="pt-AO"/>
-        </w:rPr>
-        <w:t>Python, Django e Django REST Framework</w:t>
-      </w:r>
-    </w:p>
-    <w:p>
-      <w:pPr>
-        <w:rPr>
-          <w:rFonts w:cs="Arial"/>
-          <w:lang w:val="pt-AO"/>
-        </w:rPr>
-      </w:pPr>
-      <w:r>
-        <w:rPr>
-          <w:rFonts w:cs="Arial"/>
-          <w:lang w:val="pt-AO"/>
-        </w:rPr>
-        <w:t xml:space="preserve">O Python é uma linguagem de programação de alto nível amplamente utilizada no desenvolvimento de aplicações web, especialmente em ambientes que demandam rapidez na implementação e clareza na estrutura do código </w:t>
-      </w:r>
-      <w:r>
-        <w:rPr>
-          <w:rFonts w:cs="Arial"/>
-          <w:b/>
-          <w:bCs/>
-          <w:lang w:val="pt-AO"/>
-        </w:rPr>
-        <w:t>(Van Rossum &amp; Drake, 2009)</w:t>
-      </w:r>
-      <w:r>
-        <w:rPr>
-          <w:rFonts w:cs="Arial"/>
-          <w:lang w:val="pt-AO"/>
-        </w:rPr>
-        <w:t>.</w:t>
-      </w:r>
-    </w:p>
-    <w:p>
-      <w:pPr>
-        <w:rPr>
-          <w:rFonts w:cs="Arial"/>
-          <w:lang w:val="pt-AO"/>
-        </w:rPr>
-      </w:pPr>
-      <w:r>
-        <w:rPr>
-          <w:rFonts w:cs="Arial"/>
-          <w:lang w:val="pt-AO"/>
-        </w:rPr>
-        <w:t xml:space="preserve">O Django é um framework web baseado em Python que adota o padrão arquitetural Model-View-Template (MVT), oferecendo recursos integrados para segurança, gerenciamento de banco de dados e organização modular do sistema </w:t>
-      </w:r>
-      <w:r>
-        <w:rPr>
-          <w:rFonts w:cs="Arial"/>
-          <w:b/>
-          <w:bCs/>
-          <w:lang w:val="pt-AO"/>
-        </w:rPr>
-        <w:t>(Holovaty &amp; Kaplan-Moss, 2009)</w:t>
-      </w:r>
-      <w:r>
-        <w:rPr>
-          <w:rFonts w:cs="Arial"/>
-          <w:lang w:val="pt-AO"/>
-        </w:rPr>
-        <w:t>.</w:t>
-      </w:r>
-    </w:p>
-    <w:p>
-      <w:pPr>
-        <w:rPr>
-          <w:rFonts w:cs="Arial"/>
-          <w:lang w:val="pt-AO"/>
-        </w:rPr>
-      </w:pPr>
-      <w:r>
-        <w:rPr>
-          <w:rFonts w:cs="Arial"/>
-          <w:lang w:val="pt-AO"/>
-        </w:rPr>
-        <w:t>O Django REST Framework é uma extensão do Django voltada para a construção de interfaces de programação de aplicações (APIs) no padrão REST, permitindo a comunicação entre o front-end desenvolvido em React e o back-end responsável pelo processamento e persistência dos dados.</w:t>
-      </w:r>
-    </w:p>
-    <w:p>
-      <w:pPr>
-        <w:ind w:firstLine="0"/>
-        <w:rPr>
-          <w:rFonts w:cs="Arial"/>
-          <w:b/>
-          <w:bCs/>
-          <w:lang w:val="pt-AO"/>
-        </w:rPr>
-      </w:pPr>
-      <w:r>
-        <w:rPr>
-          <w:rFonts w:cs="Arial"/>
-          <w:b/>
-          <w:bCs/>
-          <w:lang w:val="pt-AO"/>
-        </w:rPr>
-        <w:t xml:space="preserve">1.10.5 </w:t>
-      </w:r>
-      <w:r>
-        <w:rPr>
-          <w:rFonts w:cs="Arial"/>
-          <w:b/>
-          <w:bCs/>
-          <w:lang w:val="pt-AO"/>
-        </w:rPr>
-        <w:t>PostgreSQL (Sistema de Gerenciamento de Banco de Dados)</w:t>
-      </w:r>
-    </w:p>
-    <w:p>
-      <w:pPr>
-        <w:rPr>
-          <w:rFonts w:cs="Arial"/>
-          <w:lang w:val="pt-AO"/>
-        </w:rPr>
-      </w:pPr>
-      <w:r>
-        <w:rPr>
-          <w:rFonts w:cs="Arial"/>
-          <w:lang w:val="pt-AO"/>
-        </w:rPr>
-        <w:t xml:space="preserve">O PostgreSQL é um sistema de gerenciamento de banco de dados relacional e de código aberto, reconhecido por sua robustez, confiabilidade e suporte a padrões SQL avançados, sendo amplamente utilizado em sistemas que demandam integridade e consistência dos dados </w:t>
-      </w:r>
-      <w:r>
-        <w:rPr>
-          <w:rFonts w:cs="Arial"/>
-          <w:b/>
-          <w:bCs/>
-          <w:lang w:val="pt-AO"/>
-        </w:rPr>
-        <w:t>(PostgreSQL Global Development Group, 2023)</w:t>
-      </w:r>
-      <w:r>
-        <w:rPr>
-          <w:rFonts w:cs="Arial"/>
-          <w:lang w:val="pt-AO"/>
-        </w:rPr>
-        <w:t>.</w:t>
-      </w:r>
-    </w:p>
-    <w:p>
-      <w:pPr>
-        <w:rPr>
-          <w:rFonts w:cs="Arial"/>
-          <w:lang w:val="pt-AO"/>
-        </w:rPr>
-      </w:pPr>
-      <w:r>
-        <w:rPr>
-          <w:rFonts w:cs="Arial"/>
-          <w:lang w:val="pt-AO"/>
-        </w:rPr>
-        <w:t>Neste projeto, o PostgreSQL foi utilizado para o armazenamento das informações acadêmicas, registros de solicitações e dados administrativos relacionados à gestão das declarações escolares.</w:t>
-      </w:r>
-    </w:p>
-    <w:p>
-      <w:pPr>
-        <w:ind w:firstLine="0"/>
-        <w:rPr>
-          <w:rFonts w:cs="Arial"/>
-          <w:b/>
-          <w:bCs/>
-          <w:lang w:val="pt-AO"/>
-        </w:rPr>
-      </w:pPr>
-      <w:r>
-        <w:rPr>
-          <w:rFonts w:cs="Arial"/>
-          <w:b/>
-          <w:bCs/>
-          <w:lang w:val="pt-AO"/>
-        </w:rPr>
-        <w:t xml:space="preserve">1.10.6 </w:t>
-      </w:r>
-      <w:r>
-        <w:rPr>
-          <w:rFonts w:cs="Arial"/>
-          <w:b/>
-          <w:bCs/>
-          <w:lang w:val="pt-AO"/>
-        </w:rPr>
-        <w:t>Ferramentas de Desenvolvimento e Ambiente</w:t>
-      </w:r>
-    </w:p>
-    <w:p>
-      <w:pPr>
-        <w:rPr>
-          <w:rFonts w:cs="Arial"/>
-          <w:lang w:val="pt-AO"/>
-        </w:rPr>
-      </w:pPr>
-      <w:r>
-        <w:rPr>
-          <w:rFonts w:cs="Arial"/>
-          <w:lang w:val="pt-AO"/>
-        </w:rPr>
-        <w:t xml:space="preserve">O Visual Studio Code é um editor de código-fonte multiplataforma que oferece suporte a diversas linguagens de programação, extensões e ferramentas de depuração, contribuindo para a produtividade no desenvolvimento de aplicações web </w:t>
-      </w:r>
-      <w:r>
-        <w:rPr>
-          <w:rFonts w:cs="Arial"/>
-          <w:b/>
-          <w:bCs/>
-          <w:lang w:val="pt-AO"/>
-        </w:rPr>
-        <w:t>(Microsoft, 2023)</w:t>
-      </w:r>
-      <w:r>
-        <w:rPr>
-          <w:rFonts w:cs="Arial"/>
-          <w:lang w:val="pt-AO"/>
-        </w:rPr>
-        <w:t>.</w:t>
-      </w:r>
-    </w:p>
-    <w:p>
-      <w:pPr>
-        <w:rPr>
-          <w:rFonts w:cs="Arial"/>
-          <w:lang w:val="pt-AO"/>
-        </w:rPr>
-      </w:pPr>
-      <w:r>
-        <w:rPr>
-          <w:rFonts w:cs="Arial"/>
-          <w:lang w:val="pt-AO"/>
-        </w:rPr>
-        <w:t>Os navegadores Google Chrome e Microsoft Edge foram utilizados para a realização de testes e validação do funcionamento do sistema em ambiente web, assegurando a compatibilidade e o desempenho da interface em diferentes plataformas.</w:t>
-      </w:r>
-    </w:p>
-    <w:p>
-      <w:pPr>
-        <w:rPr>
-          <w:rFonts w:cs="Arial"/>
-          <w:lang w:val="pt-AO"/>
-        </w:rPr>
-      </w:pPr>
-      <w:r>
-        <w:rPr>
-          <w:rFonts w:cs="Arial"/>
-          <w:lang w:val="pt-AO"/>
-        </w:rPr>
-        <w:t>O uso do terminal de comandos permitiu a execução de tarefas relacionadas à instalação de dependências, gerenciamento de servidores locais e controle de versões durante o processo de desenvolvimento do sistema.</w:t>
-      </w:r>
-    </w:p>
-    <w:p>
-      <w:pPr>
-        <w:ind w:firstLine="0"/>
-        <w:rPr>
-          <w:rFonts w:cs="Arial"/>
-          <w:b/>
-          <w:bCs/>
-          <w:lang w:val="pt-AO"/>
-        </w:rPr>
-      </w:pPr>
-      <w:r>
-        <w:rPr>
-          <w:rFonts w:cs="Arial"/>
-          <w:b/>
-          <w:bCs/>
-          <w:lang w:val="pt-AO"/>
-        </w:rPr>
-        <w:t xml:space="preserve">1.12 </w:t>
-      </w:r>
-      <w:r>
-        <w:rPr>
-          <w:rFonts w:cs="Arial"/>
-          <w:b/>
-          <w:bCs/>
-          <w:lang w:val="pt-AO"/>
-        </w:rPr>
-        <w:t>Arquitetura do Sistema</w:t>
-      </w:r>
-    </w:p>
-    <w:p>
-      <w:pPr>
-        <w:rPr>
-          <w:rFonts w:cs="Arial"/>
-          <w:b/>
-          <w:bCs/>
-          <w:lang w:val="pt-AO"/>
-        </w:rPr>
-      </w:pPr>
-      <w:r>
-        <w:rPr>
-          <w:rFonts w:cs="Arial"/>
-          <w:b/>
-          <w:bCs/>
-          <w:lang w:val="pt-AO"/>
-        </w:rPr>
-        <w:t>1</w:t>
-      </w:r>
-      <w:r>
-        <w:rPr>
-          <w:rFonts w:cs="Arial"/>
-          <w:b/>
-          <w:bCs/>
-          <w:lang w:val="pt-AO"/>
-        </w:rPr>
-        <w:t>.</w:t>
-      </w:r>
-      <w:r>
-        <w:rPr>
-          <w:rFonts w:cs="Arial"/>
-          <w:b/>
-          <w:bCs/>
+      <w:r>
+        <w:rPr>
           <w:lang w:val="pt-AO"/>
         </w:rPr>
         <w:t>12.1</w:t>
       </w:r>
       <w:r>
         <w:rPr>
-          <w:rFonts w:cs="Arial"/>
-          <w:b/>
-          <w:bCs/>
           <w:lang w:val="pt-AO"/>
         </w:rPr>
         <w:t xml:space="preserve"> Definição de Arquitetura de Sistema</w:t>
@@ -4478,45 +4420,31 @@
     </w:p>
     <w:p>
       <w:pPr>
-        <w:rPr>
-          <w:rFonts w:cs="Arial"/>
-          <w:b/>
-          <w:bCs/>
-          <w:lang w:val="pt-AO"/>
-        </w:rPr>
-      </w:pPr>
-      <w:r>
-        <w:rPr>
-          <w:rFonts w:cs="Arial"/>
-          <w:b/>
-          <w:bCs/>
+        <w:pStyle w:val="Heading3"/>
+        <w:rPr>
+          <w:lang w:val="pt-AO"/>
+        </w:rPr>
+      </w:pPr>
+      <w:r>
+        <w:rPr>
           <w:lang w:val="pt-AO"/>
         </w:rPr>
         <w:t>1.12.</w:t>
       </w:r>
       <w:r>
         <w:rPr>
-          <w:rFonts w:cs="Arial"/>
-          <w:b/>
-          <w:bCs/>
           <w:lang w:val="pt-AO"/>
         </w:rPr>
         <w:t>2</w:t>
       </w:r>
       <w:r>
         <w:rPr>
-          <w:rFonts w:cs="Arial"/>
-          <w:b/>
-          <w:bCs/>
           <w:lang w:val="pt-AO"/>
         </w:rPr>
         <w:t xml:space="preserve"> </w:t>
       </w:r>
       <w:r>
         <w:rPr>
-          <w:rFonts w:cs="Arial"/>
-          <w:b/>
-          <w:bCs/>
           <w:lang w:val="pt-AO"/>
         </w:rPr>
         <w:t>Arquitetura Geral do Sistema</w:t>
@@ -4534,7 +4462,15 @@
           <w:rFonts w:cs="Arial"/>
           <w:lang w:val="pt-AO"/>
         </w:rPr>
-        <w:t>O sistema de gestão de declarações escolares foi desenvolvido com base em uma arquitetura em camadas, na qual as funcionalidades são distribuídas em três níveis principais: camada de apresentação, camada de aplicação e camada de dados.</w:t>
+        <w:t xml:space="preserve">O sistema de gestão de declarações escolares foi desenvolvido com base em uma arquitetura em camadas, na qual as funcionalidades são distribuídas em </w:t>
+      </w:r>
+      <w:r>
+        <w:rPr>
+          <w:rFonts w:cs="Arial"/>
+          <w:lang w:val="pt-AO"/>
+        </w:rPr>
+        <w:lastRenderedPageBreak/>
+        <w:t>três níveis principais: camada de apresentação, camada de aplicação e camada de dados.</w:t>
       </w:r>
     </w:p>
     <w:p>
@@ -4584,27 +4520,19 @@
     </w:p>
     <w:p>
       <w:pPr>
-        <w:rPr>
-          <w:rFonts w:cs="Arial"/>
-          <w:b/>
-          <w:bCs/>
-          <w:lang w:val="pt-AO"/>
-        </w:rPr>
-      </w:pPr>
-      <w:r>
-        <w:rPr>
-          <w:rFonts w:cs="Arial"/>
-          <w:b/>
-          <w:bCs/>
+        <w:pStyle w:val="Heading3"/>
+        <w:rPr>
+          <w:lang w:val="pt-AO"/>
+        </w:rPr>
+      </w:pPr>
+      <w:r>
+        <w:rPr>
           <w:lang w:val="pt-AO"/>
         </w:rPr>
         <w:t>1.12.</w:t>
       </w:r>
       <w:r>
         <w:rPr>
-          <w:rFonts w:cs="Arial"/>
-          <w:b/>
-          <w:bCs/>
           <w:lang w:val="pt-AO"/>
         </w:rPr>
         <w:t>3 Arquitetura Cliente–Servidor</w:t>
@@ -4657,27 +4585,19 @@
     </w:p>
     <w:p>
       <w:pPr>
-        <w:rPr>
-          <w:rFonts w:cs="Arial"/>
-          <w:b/>
-          <w:bCs/>
-          <w:lang w:val="pt-AO"/>
-        </w:rPr>
-      </w:pPr>
-      <w:r>
-        <w:rPr>
-          <w:rFonts w:cs="Arial"/>
-          <w:b/>
-          <w:bCs/>
+        <w:pStyle w:val="Heading3"/>
+        <w:rPr>
+          <w:lang w:val="pt-AO"/>
+        </w:rPr>
+      </w:pPr>
+      <w:r>
+        <w:rPr>
           <w:lang w:val="pt-AO"/>
         </w:rPr>
         <w:t>1.12.4</w:t>
       </w:r>
       <w:r>
         <w:rPr>
-          <w:rFonts w:cs="Arial"/>
-          <w:b/>
-          <w:bCs/>
           <w:lang w:val="pt-AO"/>
         </w:rPr>
         <w:t xml:space="preserve"> Arquitetura Interna do Back-end (Padrão MVT)</w:t>
@@ -4740,89 +4660,9 @@
           <w:rFonts w:cs="Arial"/>
           <w:lang w:val="pt-AO"/>
         </w:rPr>
+        <w:lastRenderedPageBreak/>
         <w:t>O componente Template é responsável pela apresentação das informações, organizando a forma como os dados são exibidos ao usuário. No contexto deste sistema, a maior parte da camada de apresentação é gerenciada pelo front-end, sendo o Template utilizado principalmente para fins administrativos e estruturais.</w:t>
       </w:r>
-    </w:p>
-    <w:p>
-      <w:pPr>
-        <w:rPr>
-          <w:rFonts w:cs="Arial"/>
-          <w:b/>
-          <w:bCs/>
-          <w:color w:val="FF0000"/>
-          <w:lang w:val="pt-AO"/>
-        </w:rPr>
-      </w:pPr>
-      <w:r>
-        <w:rPr>
-          <w:rFonts w:cs="Arial"/>
-          <w:b/>
-          <w:bCs/>
-          <w:color w:val="FF0000"/>
-          <w:lang w:val="pt-AO"/>
-        </w:rPr>
-        <w:t>[</w:t>
-      </w:r>
-      <w:r>
-        <w:rPr>
-          <w:rFonts w:cs="Arial"/>
-          <w:b/>
-          <w:bCs/>
-          <w:color w:val="FF0000"/>
-          <w:lang w:val="pt-AO"/>
-        </w:rPr>
-        <w:t>5. Comunicação entre os Componentes</w:t>
-      </w:r>
-    </w:p>
-    <w:p>
-      <w:pPr>
-        <w:rPr>
-          <w:rFonts w:cs="Arial"/>
-          <w:color w:val="FF0000"/>
-          <w:lang w:val="pt-AO"/>
-        </w:rPr>
-      </w:pPr>
-      <w:r>
-        <w:rPr>
-          <w:rFonts w:cs="Arial"/>
-          <w:color w:val="FF0000"/>
-          <w:lang w:val="pt-AO"/>
-        </w:rPr>
-        <w:t>A comunicação entre a camada de apresentação e a camada de aplicação é realizada por meio de interfaces de programação de aplicações, que permitem a troca de dados em formato estruturado. Essa abordagem possibilita a integração entre diferentes tecnologias, mantendo a independência entre o front-end e o back-end.</w:t>
-      </w:r>
-    </w:p>
-    <w:p>
-      <w:pPr>
-        <w:rPr>
-          <w:rFonts w:cs="Arial"/>
-          <w:color w:val="FF0000"/>
-          <w:lang w:val="pt-AO"/>
-        </w:rPr>
-      </w:pPr>
-      <w:r>
-        <w:rPr>
-          <w:rFonts w:cs="Arial"/>
-          <w:color w:val="FF0000"/>
-          <w:lang w:val="pt-AO"/>
-        </w:rPr>
-        <w:t>A camada de aplicação, por sua vez, comunica-se diretamente com a camada de dados para realizar operações de inserção, consulta, atualização e exclusão de informações, assegurando que os registros permaneçam consistentes e alinhados com as regras definidas pelo sistema.</w:t>
-      </w:r>
-      <w:r>
-        <w:rPr>
-          <w:rFonts w:cs="Arial"/>
-          <w:color w:val="FF0000"/>
-          <w:lang w:val="pt-AO"/>
-        </w:rPr>
-        <w:t>]</w:t>
-      </w:r>
-    </w:p>
-    <w:p>
-      <w:pPr>
-        <w:rPr>
-          <w:rFonts w:cs="Arial"/>
-          <w:lang w:val="pt-AO"/>
-        </w:rPr>
-      </w:pPr>
     </w:p>
     <w:p>
       <w:pPr>
@@ -4909,30 +4749,20 @@
     </w:p>
     <w:p>
       <w:pPr>
-        <w:jc w:val="center"/>
-        <w:rPr>
-          <w:rFonts w:eastAsiaTheme="majorEastAsia" w:cs="Arial"/>
-          <w:b/>
-          <w:color w:val="0D0D0D" w:themeColor="text1" w:themeTint="F2"/>
-          <w:sz w:val="28"/>
-          <w:szCs w:val="40"/>
-          <w:lang w:val="pt-AO"/>
-        </w:rPr>
-      </w:pPr>
-      <w:r>
-        <w:rPr>
-          <w:rFonts w:eastAsiaTheme="majorEastAsia" w:cs="Arial"/>
-          <w:b/>
-          <w:color w:val="0D0D0D" w:themeColor="text1" w:themeTint="F2"/>
-          <w:sz w:val="28"/>
-          <w:szCs w:val="40"/>
-          <w:lang w:val="pt-AO"/>
-        </w:rPr>
+        <w:pStyle w:val="Heading1"/>
+        <w:rPr>
+          <w:lang w:val="pt-AO"/>
+        </w:rPr>
+      </w:pPr>
+      <w:r>
+        <w:rPr>
+          <w:lang w:val="pt-AO"/>
+        </w:rPr>
+        <w:lastRenderedPageBreak/>
         <w:t>CAPITULO II. METODOLOGIA DE PESQUISA</w:t>
       </w:r>
       <w:r>
         <w:rPr>
-          <w:rFonts w:cs="Arial"/>
           <w:lang w:val="pt-AO"/>
         </w:rPr>
         <w:br w:type="page"/>
@@ -4951,6 +4781,7 @@
           <w:rFonts w:cs="Arial"/>
           <w:lang w:val="pt-AO"/>
         </w:rPr>
+        <w:lastRenderedPageBreak/>
         <w:t xml:space="preserve">A metodologia de pesquisa é a parte do trabalho científico que descreve os caminhos e procedimentos utilizados para alcançar os objetivos propostos. Neste capítulo são apresentados os métodos aplicados para a recolha de dados, o tipo de pesquisa adotado, o local do estudo, os participantes envolvidos e as etapas para o desenvolvimento do Sistema de Gestão de </w:t>
       </w:r>
       <w:r>
@@ -5210,7 +5041,14 @@
         <w:rPr>
           <w:rFonts w:cs="Arial"/>
         </w:rPr>
-        <w:t xml:space="preserve"> questionários estruturados aplicados à secretária da instituição. As entrevistas buscaram compreender de forma detalhada as dificuldades e limitações dos processos manuais, enquanto os questionários possibilitaram quantificar aspectos como atrasos, erros e dificuldades de controle. Os dados coletados foram posteriormente analisados de forma qualitativa, categorizando os principais problemas, e quantitativa, permitindo medir a frequência dos desafios identificados.</w:t>
+        <w:t xml:space="preserve"> questionários estruturados aplicados à secretária da instituição. As entrevistas buscaram compreender de forma detalhada as dificuldades e limitações dos processos manuais, enquanto os questionários possibilitaram quantificar aspectos como atrasos, erros e dificuldades de controle. Os dados coletados foram posteriormente analisados de forma qualitativa, categorizando os principais </w:t>
+      </w:r>
+      <w:r>
+        <w:rPr>
+          <w:rFonts w:cs="Arial"/>
+        </w:rPr>
+        <w:lastRenderedPageBreak/>
+        <w:t>problemas, e quantitativa, permitindo medir a frequência dos desafios identificados.</w:t>
       </w:r>
     </w:p>
     <w:p>
@@ -5264,11 +5102,12 @@
     </w:p>
     <w:p>
       <w:pPr>
-        <w:pStyle w:val="Heading2"/>
+        <w:ind w:firstLine="0"/>
+        <w:jc w:val="left"/>
         <w:rPr>
           <w:rStyle w:val="Strong"/>
           <w:rFonts w:eastAsia="Times New Roman" w:cs="Arial"/>
-          <w:color w:val="auto"/>
+          <w:b w:val="0"/>
           <w:sz w:val="28"/>
           <w:szCs w:val="27"/>
           <w:lang w:eastAsia="pt-PT"/>
@@ -5278,23 +5117,30 @@
         <w:rPr>
           <w:rStyle w:val="Strong"/>
           <w:rFonts w:eastAsia="Times New Roman" w:cs="Arial"/>
-          <w:color w:val="auto"/>
           <w:sz w:val="28"/>
           <w:szCs w:val="27"/>
           <w:lang w:eastAsia="pt-PT"/>
         </w:rPr>
-        <w:t xml:space="preserve">2.4 </w:t>
-      </w:r>
-      <w:r>
+        <w:br w:type="page"/>
+      </w:r>
+    </w:p>
+    <w:p>
+      <w:pPr>
+        <w:pStyle w:val="Heading2"/>
         <w:rPr>
           <w:rStyle w:val="Strong"/>
-          <w:rFonts w:eastAsia="Times New Roman" w:cs="Arial"/>
-          <w:color w:val="auto"/>
-          <w:sz w:val="28"/>
-          <w:szCs w:val="27"/>
-          <w:lang w:eastAsia="pt-PT"/>
-        </w:rPr>
-        <w:t>Metodologia de Desenvolvimento do Sistema</w:t>
+          <w:b/>
+          <w:bCs w:val="0"/>
+        </w:rPr>
+      </w:pPr>
+      <w:r>
+        <w:rPr>
+          <w:rStyle w:val="Strong"/>
+          <w:b/>
+          <w:bCs w:val="0"/>
+        </w:rPr>
+        <w:lastRenderedPageBreak/>
+        <w:t>2 Metodologia de Desenvolvimento do Sistema</w:t>
       </w:r>
     </w:p>
     <w:p>
@@ -5328,26 +5174,12 @@
     </w:p>
     <w:p>
       <w:pPr>
-        <w:pStyle w:val="NormalWeb"/>
-        <w:spacing w:line="360" w:lineRule="auto"/>
-        <w:jc w:val="both"/>
-        <w:rPr>
-          <w:rFonts w:ascii="Arial" w:hAnsi="Arial" w:cs="Arial"/>
-          <w:b/>
-        </w:rPr>
-      </w:pPr>
-      <w:r>
-        <w:rPr>
-          <w:rFonts w:ascii="Arial" w:hAnsi="Arial" w:cs="Arial"/>
-          <w:b/>
-        </w:rPr>
+        <w:pStyle w:val="Heading3"/>
+      </w:pPr>
+      <w:r>
         <w:t>Análise</w:t>
       </w:r>
       <w:r>
-        <w:rPr>
-          <w:rFonts w:ascii="Arial" w:hAnsi="Arial" w:cs="Arial"/>
-          <w:b/>
-        </w:rPr>
         <w:t xml:space="preserve"> e Levantamento de Requisitos</w:t>
       </w:r>
     </w:p>
@@ -5430,6 +5262,14 @@
     </w:p>
     <w:p>
       <w:pPr>
+        <w:pStyle w:val="Heading3"/>
+      </w:pPr>
+      <w:r>
+        <w:t>Modelagem dos Dados</w:t>
+      </w:r>
+    </w:p>
+    <w:p>
+      <w:pPr>
         <w:pStyle w:val="NormalWeb"/>
         <w:spacing w:line="360" w:lineRule="auto"/>
         <w:ind w:firstLine="708"/>
@@ -5442,7 +5282,18 @@
         <w:rPr>
           <w:rFonts w:ascii="Arial" w:hAnsi="Arial" w:cs="Arial"/>
         </w:rPr>
-        <w:t>Modelagem dos Dados</w:t>
+        <w:t>Foi nesta fase que se realizou a modelagem do banco de dados do sistema e teste para saber se o banco de dados consegue suprir as necessidades do sistema.</w:t>
+      </w:r>
+    </w:p>
+    <w:p>
+      <w:pPr>
+        <w:pStyle w:val="Heading3"/>
+      </w:pPr>
+      <w:r>
+        <w:t>Desenvolvimento</w:t>
+      </w:r>
+      <w:r>
+        <w:t xml:space="preserve"> Backend</w:t>
       </w:r>
     </w:p>
     <w:p>
@@ -5459,7 +5310,18 @@
         <w:rPr>
           <w:rFonts w:ascii="Arial" w:hAnsi="Arial" w:cs="Arial"/>
         </w:rPr>
-        <w:t>Foi nesta fase que se realizou a modelagem do banco de dados do sistema e teste para saber se o banco de dados consegue suprir as necessidades do sistema.</w:t>
+        <w:t>Nesta fase realizou-se o desenvolvimento do sistema, criação da lógica, da API, e integração do backend com o banco de dados.</w:t>
+      </w:r>
+    </w:p>
+    <w:p>
+      <w:pPr>
+        <w:pStyle w:val="Heading3"/>
+      </w:pPr>
+      <w:r>
+        <w:t>Desenvolvimento</w:t>
+      </w:r>
+      <w:r>
+        <w:t xml:space="preserve"> Frontend</w:t>
       </w:r>
     </w:p>
     <w:p>
@@ -5470,75 +5332,6 @@
         <w:jc w:val="both"/>
         <w:rPr>
           <w:rFonts w:ascii="Arial" w:hAnsi="Arial" w:cs="Arial"/>
-          <w:b/>
-        </w:rPr>
-      </w:pPr>
-      <w:r>
-        <w:rPr>
-          <w:rFonts w:ascii="Arial" w:hAnsi="Arial" w:cs="Arial"/>
-          <w:b/>
-        </w:rPr>
-        <w:t>Desenvolvimento</w:t>
-      </w:r>
-      <w:r>
-        <w:rPr>
-          <w:rFonts w:ascii="Arial" w:hAnsi="Arial" w:cs="Arial"/>
-          <w:b/>
-        </w:rPr>
-        <w:t xml:space="preserve"> Backend</w:t>
-      </w:r>
-    </w:p>
-    <w:p>
-      <w:pPr>
-        <w:pStyle w:val="NormalWeb"/>
-        <w:spacing w:line="360" w:lineRule="auto"/>
-        <w:ind w:firstLine="708"/>
-        <w:jc w:val="both"/>
-        <w:rPr>
-          <w:rFonts w:ascii="Arial" w:hAnsi="Arial" w:cs="Arial"/>
-        </w:rPr>
-      </w:pPr>
-      <w:r>
-        <w:rPr>
-          <w:rFonts w:ascii="Arial" w:hAnsi="Arial" w:cs="Arial"/>
-        </w:rPr>
-        <w:t>Nesta fase realizou-se o desenvolvimento do sistema, criação da lógica, da API, e integração do backend com o banco de dados.</w:t>
-      </w:r>
-    </w:p>
-    <w:p>
-      <w:pPr>
-        <w:pStyle w:val="NormalWeb"/>
-        <w:spacing w:line="360" w:lineRule="auto"/>
-        <w:ind w:firstLine="708"/>
-        <w:jc w:val="both"/>
-        <w:rPr>
-          <w:rFonts w:ascii="Arial" w:hAnsi="Arial" w:cs="Arial"/>
-          <w:b/>
-        </w:rPr>
-      </w:pPr>
-      <w:r>
-        <w:rPr>
-          <w:rFonts w:ascii="Arial" w:hAnsi="Arial" w:cs="Arial"/>
-          <w:b/>
-        </w:rPr>
-        <w:t>Desenvolvimento</w:t>
-      </w:r>
-      <w:r>
-        <w:rPr>
-          <w:rFonts w:ascii="Arial" w:hAnsi="Arial" w:cs="Arial"/>
-          <w:b/>
-        </w:rPr>
-        <w:t xml:space="preserve"> Frontend</w:t>
-      </w:r>
-    </w:p>
-    <w:p>
-      <w:pPr>
-        <w:pStyle w:val="NormalWeb"/>
-        <w:spacing w:line="360" w:lineRule="auto"/>
-        <w:ind w:firstLine="708"/>
-        <w:jc w:val="both"/>
-        <w:rPr>
-          <w:rFonts w:ascii="Arial" w:hAnsi="Arial" w:cs="Arial"/>
         </w:rPr>
       </w:pPr>
       <w:r>
@@ -5581,24 +5374,16 @@
     </w:p>
     <w:p>
       <w:pPr>
-        <w:rPr>
-          <w:rFonts w:eastAsiaTheme="majorEastAsia" w:cs="Arial"/>
-          <w:b/>
-          <w:color w:val="0D0D0D" w:themeColor="text1" w:themeTint="F2"/>
-          <w:sz w:val="28"/>
-          <w:szCs w:val="40"/>
-          <w:lang w:val="pt-AO"/>
-        </w:rPr>
-      </w:pPr>
-      <w:r>
-        <w:rPr>
-          <w:rFonts w:eastAsiaTheme="majorEastAsia" w:cs="Arial"/>
-          <w:b/>
-          <w:color w:val="0D0D0D" w:themeColor="text1" w:themeTint="F2"/>
-          <w:sz w:val="28"/>
-          <w:szCs w:val="40"/>
-          <w:lang w:val="pt-AO"/>
-        </w:rPr>
+        <w:pStyle w:val="Heading1"/>
+        <w:rPr>
+          <w:lang w:val="pt-AO"/>
+        </w:rPr>
+      </w:pPr>
+      <w:r>
+        <w:rPr>
+          <w:lang w:val="pt-AO"/>
+        </w:rPr>
+        <w:lastRenderedPageBreak/>
         <w:t>CAPITULO III- DESENVOLVIMENTO DO SISTEMA</w:t>
       </w:r>
     </w:p>
@@ -5621,14 +5406,20 @@
     </w:p>
     <w:p>
       <w:pPr>
-        <w:rPr>
-          <w:rFonts w:cs="Arial"/>
-          <w:lang w:val="pt-AO"/>
-        </w:rPr>
-      </w:pPr>
-      <w:r>
-        <w:rPr>
-          <w:rFonts w:cs="Arial"/>
+        <w:pStyle w:val="Heading2"/>
+        <w:rPr>
+          <w:lang w:val="pt-AO"/>
+        </w:rPr>
+      </w:pPr>
+      <w:r>
+        <w:rPr>
+          <w:lang w:val="pt-AO"/>
+        </w:rPr>
+        <w:lastRenderedPageBreak/>
+        <w:t xml:space="preserve">3.1. </w:t>
+      </w:r>
+      <w:r>
+        <w:rPr>
           <w:lang w:val="pt-AO"/>
         </w:rPr>
         <w:t>APRESENTACAO DO SISTEMA</w:t>
@@ -5637,13 +5428,11 @@
     <w:p>
       <w:pPr>
         <w:rPr>
-          <w:rFonts w:cs="Arial"/>
-          <w:lang w:val="pt-AO"/>
-        </w:rPr>
-      </w:pPr>
-      <w:r>
-        <w:rPr>
-          <w:rFonts w:cs="Arial"/>
+          <w:lang w:val="pt-AO"/>
+        </w:rPr>
+      </w:pPr>
+      <w:r>
+        <w:rPr>
           <w:lang w:val="pt-AO"/>
         </w:rPr>
         <w:t>O sistema de Gestão de Declarações escolares é um software web desenvolvido com o intuito de aprimorar a eficiência nos processos de solicitações de declarações ao instituto, o sistema foi desenvolvido com base em uma stack muito forte, garantindo segurança performance e robustez.</w:t>
@@ -5652,13 +5441,11 @@
     <w:p>
       <w:pPr>
         <w:rPr>
-          <w:rFonts w:cs="Arial"/>
-          <w:lang w:val="pt-AO"/>
-        </w:rPr>
-      </w:pPr>
-      <w:r>
-        <w:rPr>
-          <w:rFonts w:cs="Arial"/>
+          <w:lang w:val="pt-AO"/>
+        </w:rPr>
+      </w:pPr>
+      <w:r>
+        <w:rPr>
           <w:lang w:val="pt-AO"/>
         </w:rPr>
         <w:t>O sistema possui três niveis de acesso, garantido organização, segurança e estabilidade:</w:t>
@@ -5667,13 +5454,11 @@
     <w:p>
       <w:pPr>
         <w:rPr>
-          <w:rFonts w:cs="Arial"/>
-          <w:lang w:val="pt-AO"/>
-        </w:rPr>
-      </w:pPr>
-      <w:r>
-        <w:rPr>
-          <w:rFonts w:cs="Arial"/>
+          <w:lang w:val="pt-AO"/>
+        </w:rPr>
+      </w:pPr>
+      <w:r>
+        <w:rPr>
           <w:lang w:val="pt-AO"/>
         </w:rPr>
         <w:t>Alunos: o seu acesso limita-se em visualizar seu dados, realizar solicitações, acessesar aos seus documentos</w:t>
@@ -5682,48 +5467,41 @@
     <w:p>
       <w:pPr>
         <w:rPr>
-          <w:rFonts w:cs="Arial"/>
-          <w:lang w:val="pt-AO"/>
-        </w:rPr>
-      </w:pPr>
-      <w:r>
-        <w:rPr>
-          <w:rFonts w:cs="Arial"/>
+          <w:lang w:val="pt-AO"/>
+        </w:rPr>
+      </w:pPr>
+      <w:r>
+        <w:rPr>
           <w:lang w:val="pt-AO"/>
         </w:rPr>
         <w:t>Encarregados: seu nível de acesso permite monitorar seus educandos</w:t>
       </w:r>
       <w:r>
         <w:rPr>
-          <w:rFonts w:cs="Arial"/>
           <w:lang w:val="pt-AO"/>
         </w:rPr>
         <w:t xml:space="preserve">  acompanhando seu  desempenho academico</w:t>
       </w:r>
       <w:r>
         <w:rPr>
-          <w:rFonts w:cs="Arial"/>
           <w:lang w:val="pt-AO"/>
         </w:rPr>
         <w:t xml:space="preserve"> </w:t>
       </w:r>
       <w:r>
         <w:rPr>
-          <w:rFonts w:cs="Arial"/>
           <w:lang w:val="pt-AO"/>
         </w:rPr>
         <w:t xml:space="preserve">e </w:t>
       </w:r>
       <w:r>
         <w:rPr>
-          <w:rFonts w:cs="Arial"/>
           <w:lang w:val="pt-AO"/>
         </w:rPr>
         <w:t>realizar soli</w:t>
       </w:r>
       <w:r>
         <w:rPr>
-          <w:rFonts w:cs="Arial"/>
           <w:lang w:val="pt-AO"/>
         </w:rPr>
         <w:t>citações por parte dos seus educandos.</w:t>
@@ -5732,20 +5510,17 @@
     <w:p>
       <w:pPr>
         <w:rPr>
-          <w:rFonts w:cs="Arial"/>
-          <w:lang w:val="pt-AO"/>
-        </w:rPr>
-      </w:pPr>
-      <w:r>
-        <w:rPr>
-          <w:rFonts w:cs="Arial"/>
+          <w:lang w:val="pt-AO"/>
+        </w:rPr>
+      </w:pPr>
+      <w:r>
+        <w:rPr>
           <w:lang w:val="pt-AO"/>
         </w:rPr>
         <w:t>Administradores (Secretário, Direitores)</w:t>
       </w:r>
       <w:r>
         <w:rPr>
-          <w:rFonts w:cs="Arial"/>
           <w:lang w:val="pt-AO"/>
         </w:rPr>
         <w:t>: responsáveis pelo gerenciamento dos dados que circulam pelo sistema, e pelo monitoramento das actividades dos usuarios, podendo também realizar solicitações a pedido de alunos ou encarregados.</w:t>
@@ -5771,42 +5546,39 @@
     </w:p>
     <w:p>
       <w:pPr>
-        <w:ind w:firstLine="0"/>
-        <w:rPr>
-          <w:rFonts w:cs="Arial"/>
-          <w:lang w:val="pt-AO"/>
-        </w:rPr>
-      </w:pPr>
-      <w:r>
-        <w:rPr>
-          <w:rFonts w:cs="Arial"/>
-          <w:b/>
-          <w:bCs/>
-          <w:lang w:val="pt-AO"/>
-        </w:rPr>
-        <w:t>Requisistos do sisitem</w:t>
-      </w:r>
-      <w:r>
-        <w:rPr>
-          <w:rFonts w:cs="Arial"/>
-          <w:b/>
-          <w:bCs/>
-          <w:lang w:val="pt-AO"/>
-        </w:rPr>
-        <w:t>a</w:t>
-      </w:r>
-    </w:p>
-    <w:p>
-      <w:pPr>
-        <w:ind w:firstLine="0"/>
-        <w:rPr>
-          <w:rFonts w:cs="Arial"/>
-          <w:lang w:val="pt-AO"/>
-        </w:rPr>
-      </w:pPr>
-      <w:r>
-        <w:rPr>
-          <w:rFonts w:cs="Arial"/>
+        <w:pStyle w:val="Heading2"/>
+        <w:rPr>
+          <w:lang w:val="pt-AO"/>
+        </w:rPr>
+      </w:pPr>
+      <w:r>
+        <w:rPr>
+          <w:lang w:val="pt-AO"/>
+        </w:rPr>
+        <w:t xml:space="preserve">3.2. </w:t>
+      </w:r>
+      <w:r>
+        <w:rPr>
+          <w:lang w:val="pt-AO"/>
+        </w:rPr>
+        <w:t>REQUISISTOS DO SISITEMA</w:t>
+      </w:r>
+    </w:p>
+    <w:p>
+      <w:pPr>
+        <w:pStyle w:val="Heading3"/>
+        <w:rPr>
+          <w:lang w:val="pt-AO"/>
+        </w:rPr>
+      </w:pPr>
+      <w:r>
+        <w:rPr>
+          <w:lang w:val="pt-AO"/>
+        </w:rPr>
+        <w:t xml:space="preserve">3.2.1 </w:t>
+      </w:r>
+      <w:r>
+        <w:rPr>
           <w:lang w:val="pt-AO"/>
         </w:rPr>
         <w:t>Funcionais</w:t>
@@ -5814,7 +5586,11 @@
     </w:p>
     <w:p>
       <w:pPr>
-        <w:ind w:firstLine="0"/>
+        <w:pStyle w:val="ListParagraph"/>
+        <w:numPr>
+          <w:ilvl w:val="0"/>
+          <w:numId w:val="4"/>
+        </w:numPr>
         <w:rPr>
           <w:rFonts w:cs="Arial"/>
           <w:lang w:val="pt-AO"/>
@@ -5830,16 +5606,11 @@
     </w:p>
     <w:p>
       <w:pPr>
-        <w:ind w:firstLine="0"/>
-        <w:rPr>
-          <w:rFonts w:cs="Arial"/>
-          <w:lang w:val="pt-AO"/>
-        </w:rPr>
-      </w:pPr>
-    </w:p>
-    <w:p>
-      <w:pPr>
-        <w:ind w:firstLine="0"/>
+        <w:pStyle w:val="ListParagraph"/>
+        <w:numPr>
+          <w:ilvl w:val="0"/>
+          <w:numId w:val="4"/>
+        </w:numPr>
         <w:rPr>
           <w:rFonts w:cs="Arial"/>
           <w:lang w:val="pt-AO"/>
@@ -5855,16 +5626,11 @@
     </w:p>
     <w:p>
       <w:pPr>
-        <w:ind w:firstLine="0"/>
-        <w:rPr>
-          <w:rFonts w:cs="Arial"/>
-          <w:lang w:val="pt-AO"/>
-        </w:rPr>
-      </w:pPr>
-    </w:p>
-    <w:p>
-      <w:pPr>
-        <w:ind w:firstLine="0"/>
+        <w:pStyle w:val="ListParagraph"/>
+        <w:numPr>
+          <w:ilvl w:val="0"/>
+          <w:numId w:val="4"/>
+        </w:numPr>
         <w:rPr>
           <w:rFonts w:cs="Arial"/>
           <w:lang w:val="pt-AO"/>
@@ -5880,16 +5646,11 @@
     </w:p>
     <w:p>
       <w:pPr>
-        <w:ind w:firstLine="0"/>
-        <w:rPr>
-          <w:rFonts w:cs="Arial"/>
-          <w:lang w:val="pt-AO"/>
-        </w:rPr>
-      </w:pPr>
-    </w:p>
-    <w:p>
-      <w:pPr>
-        <w:ind w:firstLine="0"/>
+        <w:pStyle w:val="ListParagraph"/>
+        <w:numPr>
+          <w:ilvl w:val="0"/>
+          <w:numId w:val="4"/>
+        </w:numPr>
         <w:rPr>
           <w:rFonts w:cs="Arial"/>
           <w:lang w:val="pt-AO"/>
@@ -5905,16 +5666,11 @@
     </w:p>
     <w:p>
       <w:pPr>
-        <w:ind w:firstLine="0"/>
-        <w:rPr>
-          <w:rFonts w:cs="Arial"/>
-          <w:lang w:val="pt-AO"/>
-        </w:rPr>
-      </w:pPr>
-    </w:p>
-    <w:p>
-      <w:pPr>
-        <w:ind w:firstLine="0"/>
+        <w:pStyle w:val="ListParagraph"/>
+        <w:numPr>
+          <w:ilvl w:val="0"/>
+          <w:numId w:val="4"/>
+        </w:numPr>
         <w:rPr>
           <w:rFonts w:cs="Arial"/>
           <w:lang w:val="pt-AO"/>
@@ -5930,16 +5686,11 @@
     </w:p>
     <w:p>
       <w:pPr>
-        <w:ind w:firstLine="0"/>
-        <w:rPr>
-          <w:rFonts w:cs="Arial"/>
-          <w:lang w:val="pt-AO"/>
-        </w:rPr>
-      </w:pPr>
-    </w:p>
-    <w:p>
-      <w:pPr>
-        <w:ind w:firstLine="0"/>
+        <w:pStyle w:val="ListParagraph"/>
+        <w:numPr>
+          <w:ilvl w:val="0"/>
+          <w:numId w:val="4"/>
+        </w:numPr>
         <w:rPr>
           <w:rFonts w:cs="Arial"/>
           <w:lang w:val="pt-AO"/>
@@ -5955,16 +5706,11 @@
     </w:p>
     <w:p>
       <w:pPr>
-        <w:ind w:firstLine="0"/>
-        <w:rPr>
-          <w:rFonts w:cs="Arial"/>
-          <w:lang w:val="pt-AO"/>
-        </w:rPr>
-      </w:pPr>
-    </w:p>
-    <w:p>
-      <w:pPr>
-        <w:ind w:firstLine="0"/>
+        <w:pStyle w:val="ListParagraph"/>
+        <w:numPr>
+          <w:ilvl w:val="0"/>
+          <w:numId w:val="4"/>
+        </w:numPr>
         <w:rPr>
           <w:rFonts w:cs="Arial"/>
           <w:lang w:val="pt-AO"/>
@@ -5980,16 +5726,11 @@
     </w:p>
     <w:p>
       <w:pPr>
-        <w:ind w:firstLine="0"/>
-        <w:rPr>
-          <w:rFonts w:cs="Arial"/>
-          <w:lang w:val="pt-AO"/>
-        </w:rPr>
-      </w:pPr>
-    </w:p>
-    <w:p>
-      <w:pPr>
-        <w:ind w:firstLine="0"/>
+        <w:pStyle w:val="ListParagraph"/>
+        <w:numPr>
+          <w:ilvl w:val="0"/>
+          <w:numId w:val="4"/>
+        </w:numPr>
         <w:rPr>
           <w:rFonts w:cs="Arial"/>
           <w:lang w:val="pt-AO"/>
@@ -6005,16 +5746,11 @@
     </w:p>
     <w:p>
       <w:pPr>
-        <w:ind w:firstLine="0"/>
-        <w:rPr>
-          <w:rFonts w:cs="Arial"/>
-          <w:lang w:val="pt-AO"/>
-        </w:rPr>
-      </w:pPr>
-    </w:p>
-    <w:p>
-      <w:pPr>
-        <w:ind w:firstLine="0"/>
+        <w:pStyle w:val="ListParagraph"/>
+        <w:numPr>
+          <w:ilvl w:val="0"/>
+          <w:numId w:val="4"/>
+        </w:numPr>
         <w:rPr>
           <w:rFonts w:cs="Arial"/>
           <w:lang w:val="pt-AO"/>
@@ -6030,16 +5766,11 @@
     </w:p>
     <w:p>
       <w:pPr>
-        <w:ind w:firstLine="0"/>
-        <w:rPr>
-          <w:rFonts w:cs="Arial"/>
-          <w:lang w:val="pt-AO"/>
-        </w:rPr>
-      </w:pPr>
-    </w:p>
-    <w:p>
-      <w:pPr>
-        <w:ind w:firstLine="0"/>
+        <w:pStyle w:val="ListParagraph"/>
+        <w:numPr>
+          <w:ilvl w:val="0"/>
+          <w:numId w:val="4"/>
+        </w:numPr>
         <w:rPr>
           <w:rFonts w:cs="Arial"/>
           <w:lang w:val="pt-AO"/>
@@ -6055,16 +5786,11 @@
     </w:p>
     <w:p>
       <w:pPr>
-        <w:ind w:firstLine="0"/>
-        <w:rPr>
-          <w:rFonts w:cs="Arial"/>
-          <w:lang w:val="pt-AO"/>
-        </w:rPr>
-      </w:pPr>
-    </w:p>
-    <w:p>
-      <w:pPr>
-        <w:ind w:firstLine="0"/>
+        <w:pStyle w:val="ListParagraph"/>
+        <w:numPr>
+          <w:ilvl w:val="0"/>
+          <w:numId w:val="4"/>
+        </w:numPr>
         <w:rPr>
           <w:rFonts w:cs="Arial"/>
           <w:lang w:val="pt-AO"/>
@@ -6080,16 +5806,11 @@
     </w:p>
     <w:p>
       <w:pPr>
-        <w:ind w:firstLine="0"/>
-        <w:rPr>
-          <w:rFonts w:cs="Arial"/>
-          <w:lang w:val="pt-AO"/>
-        </w:rPr>
-      </w:pPr>
-    </w:p>
-    <w:p>
-      <w:pPr>
-        <w:ind w:firstLine="0"/>
+        <w:pStyle w:val="ListParagraph"/>
+        <w:numPr>
+          <w:ilvl w:val="0"/>
+          <w:numId w:val="4"/>
+        </w:numPr>
         <w:rPr>
           <w:rFonts w:cs="Arial"/>
           <w:lang w:val="pt-AO"/>
@@ -6105,16 +5826,11 @@
     </w:p>
     <w:p>
       <w:pPr>
-        <w:ind w:firstLine="0"/>
-        <w:rPr>
-          <w:rFonts w:cs="Arial"/>
-          <w:lang w:val="pt-AO"/>
-        </w:rPr>
-      </w:pPr>
-    </w:p>
-    <w:p>
-      <w:pPr>
-        <w:ind w:firstLine="0"/>
+        <w:pStyle w:val="ListParagraph"/>
+        <w:numPr>
+          <w:ilvl w:val="0"/>
+          <w:numId w:val="4"/>
+        </w:numPr>
         <w:rPr>
           <w:rFonts w:cs="Arial"/>
           <w:lang w:val="pt-AO"/>
@@ -6130,41 +5846,32 @@
     </w:p>
     <w:p>
       <w:pPr>
-        <w:ind w:firstLine="0"/>
-        <w:rPr>
-          <w:rFonts w:cs="Arial"/>
-          <w:lang w:val="pt-AO"/>
-        </w:rPr>
-      </w:pPr>
-    </w:p>
-    <w:p>
-      <w:pPr>
-        <w:ind w:firstLine="0"/>
-        <w:rPr>
-          <w:rFonts w:cs="Arial"/>
-          <w:lang w:val="pt-AO"/>
-        </w:rPr>
-      </w:pPr>
-      <w:r>
-        <w:rPr>
-          <w:rFonts w:cs="Arial"/>
-          <w:lang w:val="pt-AO"/>
-        </w:rPr>
+        <w:pStyle w:val="ListParagraph"/>
+        <w:numPr>
+          <w:ilvl w:val="0"/>
+          <w:numId w:val="4"/>
+        </w:numPr>
+        <w:rPr>
+          <w:rFonts w:cs="Arial"/>
+          <w:lang w:val="pt-AO"/>
+        </w:rPr>
+      </w:pPr>
+      <w:r>
+        <w:rPr>
+          <w:rFonts w:cs="Arial"/>
+          <w:lang w:val="pt-AO"/>
+        </w:rPr>
+        <w:lastRenderedPageBreak/>
         <w:t>Registrar todos os logins e logouts, além das ações críticas realizadas no sistema, como emissão de documentos e alterações de cadastro.</w:t>
       </w:r>
     </w:p>
     <w:p>
       <w:pPr>
-        <w:ind w:firstLine="0"/>
-        <w:rPr>
-          <w:rFonts w:cs="Arial"/>
-          <w:lang w:val="pt-AO"/>
-        </w:rPr>
-      </w:pPr>
-    </w:p>
-    <w:p>
-      <w:pPr>
-        <w:ind w:firstLine="0"/>
+        <w:pStyle w:val="ListParagraph"/>
+        <w:numPr>
+          <w:ilvl w:val="0"/>
+          <w:numId w:val="4"/>
+        </w:numPr>
         <w:rPr>
           <w:rFonts w:cs="Arial"/>
           <w:lang w:val="pt-AO"/>
@@ -6180,16 +5887,11 @@
     </w:p>
     <w:p>
       <w:pPr>
-        <w:ind w:firstLine="0"/>
-        <w:rPr>
-          <w:rFonts w:cs="Arial"/>
-          <w:lang w:val="pt-AO"/>
-        </w:rPr>
-      </w:pPr>
-    </w:p>
-    <w:p>
-      <w:pPr>
-        <w:ind w:firstLine="0"/>
+        <w:pStyle w:val="ListParagraph"/>
+        <w:numPr>
+          <w:ilvl w:val="0"/>
+          <w:numId w:val="4"/>
+        </w:numPr>
         <w:rPr>
           <w:rFonts w:cs="Arial"/>
           <w:lang w:val="pt-AO"/>
@@ -6205,16 +5907,11 @@
     </w:p>
     <w:p>
       <w:pPr>
-        <w:ind w:firstLine="0"/>
-        <w:rPr>
-          <w:rFonts w:cs="Arial"/>
-          <w:lang w:val="pt-AO"/>
-        </w:rPr>
-      </w:pPr>
-    </w:p>
-    <w:p>
-      <w:pPr>
-        <w:ind w:firstLine="0"/>
+        <w:pStyle w:val="ListParagraph"/>
+        <w:numPr>
+          <w:ilvl w:val="0"/>
+          <w:numId w:val="4"/>
+        </w:numPr>
         <w:rPr>
           <w:rFonts w:cs="Arial"/>
           <w:lang w:val="pt-AO"/>
@@ -6230,16 +5927,11 @@
     </w:p>
     <w:p>
       <w:pPr>
-        <w:ind w:firstLine="0"/>
-        <w:rPr>
-          <w:rFonts w:cs="Arial"/>
-          <w:lang w:val="pt-AO"/>
-        </w:rPr>
-      </w:pPr>
-    </w:p>
-    <w:p>
-      <w:pPr>
-        <w:ind w:firstLine="0"/>
+        <w:pStyle w:val="ListParagraph"/>
+        <w:numPr>
+          <w:ilvl w:val="0"/>
+          <w:numId w:val="4"/>
+        </w:numPr>
         <w:rPr>
           <w:rFonts w:cs="Arial"/>
           <w:lang w:val="pt-AO"/>
@@ -6255,16 +5947,11 @@
     </w:p>
     <w:p>
       <w:pPr>
-        <w:ind w:firstLine="0"/>
-        <w:rPr>
-          <w:rFonts w:cs="Arial"/>
-          <w:lang w:val="pt-AO"/>
-        </w:rPr>
-      </w:pPr>
-    </w:p>
-    <w:p>
-      <w:pPr>
-        <w:ind w:firstLine="0"/>
+        <w:pStyle w:val="ListParagraph"/>
+        <w:numPr>
+          <w:ilvl w:val="0"/>
+          <w:numId w:val="4"/>
+        </w:numPr>
         <w:rPr>
           <w:rFonts w:cs="Arial"/>
           <w:lang w:val="pt-AO"/>
@@ -6280,16 +5967,11 @@
     </w:p>
     <w:p>
       <w:pPr>
-        <w:ind w:firstLine="0"/>
-        <w:rPr>
-          <w:rFonts w:cs="Arial"/>
-          <w:lang w:val="pt-AO"/>
-        </w:rPr>
-      </w:pPr>
-    </w:p>
-    <w:p>
-      <w:pPr>
-        <w:ind w:firstLine="0"/>
+        <w:pStyle w:val="ListParagraph"/>
+        <w:numPr>
+          <w:ilvl w:val="0"/>
+          <w:numId w:val="4"/>
+        </w:numPr>
         <w:rPr>
           <w:rFonts w:cs="Arial"/>
           <w:lang w:val="pt-AO"/>
@@ -6305,16 +5987,11 @@
     </w:p>
     <w:p>
       <w:pPr>
-        <w:ind w:firstLine="0"/>
-        <w:rPr>
-          <w:rFonts w:cs="Arial"/>
-          <w:lang w:val="pt-AO"/>
-        </w:rPr>
-      </w:pPr>
-    </w:p>
-    <w:p>
-      <w:pPr>
-        <w:ind w:firstLine="0"/>
+        <w:pStyle w:val="ListParagraph"/>
+        <w:numPr>
+          <w:ilvl w:val="0"/>
+          <w:numId w:val="4"/>
+        </w:numPr>
         <w:rPr>
           <w:rFonts w:cs="Arial"/>
           <w:lang w:val="pt-AO"/>
@@ -6330,16 +6007,11 @@
     </w:p>
     <w:p>
       <w:pPr>
-        <w:ind w:firstLine="0"/>
-        <w:rPr>
-          <w:rFonts w:cs="Arial"/>
-          <w:lang w:val="pt-AO"/>
-        </w:rPr>
-      </w:pPr>
-    </w:p>
-    <w:p>
-      <w:pPr>
-        <w:ind w:firstLine="0"/>
+        <w:pStyle w:val="ListParagraph"/>
+        <w:numPr>
+          <w:ilvl w:val="0"/>
+          <w:numId w:val="4"/>
+        </w:numPr>
         <w:rPr>
           <w:rFonts w:cs="Arial"/>
           <w:lang w:val="pt-AO"/>
@@ -6355,16 +6027,11 @@
     </w:p>
     <w:p>
       <w:pPr>
-        <w:ind w:firstLine="0"/>
-        <w:rPr>
-          <w:rFonts w:cs="Arial"/>
-          <w:lang w:val="pt-AO"/>
-        </w:rPr>
-      </w:pPr>
-    </w:p>
-    <w:p>
-      <w:pPr>
-        <w:ind w:firstLine="0"/>
+        <w:pStyle w:val="ListParagraph"/>
+        <w:numPr>
+          <w:ilvl w:val="0"/>
+          <w:numId w:val="4"/>
+        </w:numPr>
         <w:rPr>
           <w:rFonts w:cs="Arial"/>
           <w:lang w:val="pt-AO"/>
@@ -6380,16 +6047,11 @@
     </w:p>
     <w:p>
       <w:pPr>
-        <w:ind w:firstLine="0"/>
-        <w:rPr>
-          <w:rFonts w:cs="Arial"/>
-          <w:lang w:val="pt-AO"/>
-        </w:rPr>
-      </w:pPr>
-    </w:p>
-    <w:p>
-      <w:pPr>
-        <w:ind w:firstLine="0"/>
+        <w:pStyle w:val="ListParagraph"/>
+        <w:numPr>
+          <w:ilvl w:val="0"/>
+          <w:numId w:val="4"/>
+        </w:numPr>
         <w:rPr>
           <w:rFonts w:cs="Arial"/>
           <w:lang w:val="pt-AO"/>
@@ -6405,16 +6067,11 @@
     </w:p>
     <w:p>
       <w:pPr>
-        <w:ind w:firstLine="0"/>
-        <w:rPr>
-          <w:rFonts w:cs="Arial"/>
-          <w:lang w:val="pt-AO"/>
-        </w:rPr>
-      </w:pPr>
-    </w:p>
-    <w:p>
-      <w:pPr>
-        <w:ind w:firstLine="0"/>
+        <w:pStyle w:val="ListParagraph"/>
+        <w:numPr>
+          <w:ilvl w:val="0"/>
+          <w:numId w:val="4"/>
+        </w:numPr>
         <w:rPr>
           <w:rFonts w:cs="Arial"/>
           <w:lang w:val="pt-AO"/>
@@ -6430,16 +6087,11 @@
     </w:p>
     <w:p>
       <w:pPr>
-        <w:ind w:firstLine="0"/>
-        <w:rPr>
-          <w:rFonts w:cs="Arial"/>
-          <w:lang w:val="pt-AO"/>
-        </w:rPr>
-      </w:pPr>
-    </w:p>
-    <w:p>
-      <w:pPr>
-        <w:ind w:firstLine="0"/>
+        <w:pStyle w:val="ListParagraph"/>
+        <w:numPr>
+          <w:ilvl w:val="0"/>
+          <w:numId w:val="4"/>
+        </w:numPr>
         <w:rPr>
           <w:rFonts w:cs="Arial"/>
           <w:lang w:val="pt-AO"/>
@@ -6455,16 +6107,11 @@
     </w:p>
     <w:p>
       <w:pPr>
-        <w:ind w:firstLine="0"/>
-        <w:rPr>
-          <w:rFonts w:cs="Arial"/>
-          <w:lang w:val="pt-AO"/>
-        </w:rPr>
-      </w:pPr>
-    </w:p>
-    <w:p>
-      <w:pPr>
-        <w:ind w:firstLine="0"/>
+        <w:pStyle w:val="ListParagraph"/>
+        <w:numPr>
+          <w:ilvl w:val="0"/>
+          <w:numId w:val="4"/>
+        </w:numPr>
         <w:rPr>
           <w:rFonts w:cs="Arial"/>
           <w:lang w:val="pt-AO"/>
@@ -6480,16 +6127,11 @@
     </w:p>
     <w:p>
       <w:pPr>
-        <w:ind w:firstLine="0"/>
-        <w:rPr>
-          <w:rFonts w:cs="Arial"/>
-          <w:lang w:val="pt-AO"/>
-        </w:rPr>
-      </w:pPr>
-    </w:p>
-    <w:p>
-      <w:pPr>
-        <w:ind w:firstLine="0"/>
+        <w:pStyle w:val="ListParagraph"/>
+        <w:numPr>
+          <w:ilvl w:val="0"/>
+          <w:numId w:val="4"/>
+        </w:numPr>
         <w:rPr>
           <w:rFonts w:cs="Arial"/>
           <w:lang w:val="pt-AO"/>
@@ -6505,16 +6147,11 @@
     </w:p>
     <w:p>
       <w:pPr>
-        <w:ind w:firstLine="0"/>
-        <w:rPr>
-          <w:rFonts w:cs="Arial"/>
-          <w:lang w:val="pt-AO"/>
-        </w:rPr>
-      </w:pPr>
-    </w:p>
-    <w:p>
-      <w:pPr>
-        <w:ind w:firstLine="0"/>
+        <w:pStyle w:val="ListParagraph"/>
+        <w:numPr>
+          <w:ilvl w:val="0"/>
+          <w:numId w:val="4"/>
+        </w:numPr>
         <w:rPr>
           <w:rFonts w:cs="Arial"/>
           <w:lang w:val="pt-AO"/>
@@ -6530,16 +6167,11 @@
     </w:p>
     <w:p>
       <w:pPr>
-        <w:ind w:firstLine="0"/>
-        <w:rPr>
-          <w:rFonts w:cs="Arial"/>
-          <w:lang w:val="pt-AO"/>
-        </w:rPr>
-      </w:pPr>
-    </w:p>
-    <w:p>
-      <w:pPr>
-        <w:ind w:firstLine="0"/>
+        <w:pStyle w:val="ListParagraph"/>
+        <w:numPr>
+          <w:ilvl w:val="0"/>
+          <w:numId w:val="4"/>
+        </w:numPr>
         <w:rPr>
           <w:rFonts w:cs="Arial"/>
           <w:lang w:val="pt-AO"/>
@@ -6555,16 +6187,11 @@
     </w:p>
     <w:p>
       <w:pPr>
-        <w:ind w:firstLine="0"/>
-        <w:rPr>
-          <w:rFonts w:cs="Arial"/>
-          <w:lang w:val="pt-AO"/>
-        </w:rPr>
-      </w:pPr>
-    </w:p>
-    <w:p>
-      <w:pPr>
-        <w:ind w:firstLine="0"/>
+        <w:pStyle w:val="ListParagraph"/>
+        <w:numPr>
+          <w:ilvl w:val="0"/>
+          <w:numId w:val="4"/>
+        </w:numPr>
         <w:rPr>
           <w:rFonts w:cs="Arial"/>
           <w:lang w:val="pt-AO"/>
@@ -6580,16 +6207,11 @@
     </w:p>
     <w:p>
       <w:pPr>
-        <w:ind w:firstLine="0"/>
-        <w:rPr>
-          <w:rFonts w:cs="Arial"/>
-          <w:lang w:val="pt-AO"/>
-        </w:rPr>
-      </w:pPr>
-    </w:p>
-    <w:p>
-      <w:pPr>
-        <w:ind w:firstLine="0"/>
+        <w:pStyle w:val="ListParagraph"/>
+        <w:numPr>
+          <w:ilvl w:val="0"/>
+          <w:numId w:val="4"/>
+        </w:numPr>
         <w:rPr>
           <w:rFonts w:cs="Arial"/>
           <w:lang w:val="pt-AO"/>
@@ -6605,16 +6227,11 @@
     </w:p>
     <w:p>
       <w:pPr>
-        <w:ind w:firstLine="0"/>
-        <w:rPr>
-          <w:rFonts w:cs="Arial"/>
-          <w:lang w:val="pt-AO"/>
-        </w:rPr>
-      </w:pPr>
-    </w:p>
-    <w:p>
-      <w:pPr>
-        <w:ind w:firstLine="0"/>
+        <w:pStyle w:val="ListParagraph"/>
+        <w:numPr>
+          <w:ilvl w:val="0"/>
+          <w:numId w:val="4"/>
+        </w:numPr>
         <w:rPr>
           <w:rFonts w:cs="Arial"/>
           <w:lang w:val="pt-AO"/>
@@ -6630,16 +6247,11 @@
     </w:p>
     <w:p>
       <w:pPr>
-        <w:ind w:firstLine="0"/>
-        <w:rPr>
-          <w:rFonts w:cs="Arial"/>
-          <w:lang w:val="pt-AO"/>
-        </w:rPr>
-      </w:pPr>
-    </w:p>
-    <w:p>
-      <w:pPr>
-        <w:ind w:firstLine="0"/>
+        <w:pStyle w:val="ListParagraph"/>
+        <w:numPr>
+          <w:ilvl w:val="0"/>
+          <w:numId w:val="4"/>
+        </w:numPr>
         <w:rPr>
           <w:rFonts w:cs="Arial"/>
           <w:lang w:val="pt-AO"/>
@@ -6655,16 +6267,11 @@
     </w:p>
     <w:p>
       <w:pPr>
-        <w:ind w:firstLine="0"/>
-        <w:rPr>
-          <w:rFonts w:cs="Arial"/>
-          <w:lang w:val="pt-AO"/>
-        </w:rPr>
-      </w:pPr>
-    </w:p>
-    <w:p>
-      <w:pPr>
-        <w:ind w:firstLine="0"/>
+        <w:pStyle w:val="ListParagraph"/>
+        <w:numPr>
+          <w:ilvl w:val="0"/>
+          <w:numId w:val="4"/>
+        </w:numPr>
         <w:rPr>
           <w:rFonts w:cs="Arial"/>
           <w:lang w:val="pt-AO"/>
@@ -6680,16 +6287,11 @@
     </w:p>
     <w:p>
       <w:pPr>
-        <w:ind w:firstLine="0"/>
-        <w:rPr>
-          <w:rFonts w:cs="Arial"/>
-          <w:lang w:val="pt-AO"/>
-        </w:rPr>
-      </w:pPr>
-    </w:p>
-    <w:p>
-      <w:pPr>
-        <w:ind w:firstLine="0"/>
+        <w:pStyle w:val="ListParagraph"/>
+        <w:numPr>
+          <w:ilvl w:val="0"/>
+          <w:numId w:val="4"/>
+        </w:numPr>
         <w:rPr>
           <w:rFonts w:cs="Arial"/>
           <w:lang w:val="pt-AO"/>
@@ -6705,16 +6307,11 @@
     </w:p>
     <w:p>
       <w:pPr>
-        <w:ind w:firstLine="0"/>
-        <w:rPr>
-          <w:rFonts w:cs="Arial"/>
-          <w:lang w:val="pt-AO"/>
-        </w:rPr>
-      </w:pPr>
-    </w:p>
-    <w:p>
-      <w:pPr>
-        <w:ind w:firstLine="0"/>
+        <w:pStyle w:val="ListParagraph"/>
+        <w:numPr>
+          <w:ilvl w:val="0"/>
+          <w:numId w:val="4"/>
+        </w:numPr>
         <w:rPr>
           <w:rFonts w:cs="Arial"/>
           <w:lang w:val="pt-AO"/>
@@ -6730,16 +6327,11 @@
     </w:p>
     <w:p>
       <w:pPr>
-        <w:ind w:firstLine="0"/>
-        <w:rPr>
-          <w:rFonts w:cs="Arial"/>
-          <w:lang w:val="pt-AO"/>
-        </w:rPr>
-      </w:pPr>
-    </w:p>
-    <w:p>
-      <w:pPr>
-        <w:ind w:firstLine="0"/>
+        <w:pStyle w:val="ListParagraph"/>
+        <w:numPr>
+          <w:ilvl w:val="0"/>
+          <w:numId w:val="4"/>
+        </w:numPr>
         <w:rPr>
           <w:rFonts w:cs="Arial"/>
           <w:lang w:val="pt-AO"/>
@@ -6755,16 +6347,11 @@
     </w:p>
     <w:p>
       <w:pPr>
-        <w:ind w:firstLine="0"/>
-        <w:rPr>
-          <w:rFonts w:cs="Arial"/>
-          <w:lang w:val="pt-AO"/>
-        </w:rPr>
-      </w:pPr>
-    </w:p>
-    <w:p>
-      <w:pPr>
-        <w:ind w:firstLine="0"/>
+        <w:pStyle w:val="ListParagraph"/>
+        <w:numPr>
+          <w:ilvl w:val="0"/>
+          <w:numId w:val="4"/>
+        </w:numPr>
         <w:rPr>
           <w:rFonts w:cs="Arial"/>
           <w:lang w:val="pt-AO"/>
@@ -6780,7 +6367,35 @@
     </w:p>
     <w:p>
       <w:pPr>
+        <w:pStyle w:val="Heading3"/>
+        <w:rPr>
+          <w:rFonts w:eastAsiaTheme="minorHAnsi"/>
+          <w:lang w:val="pt-AO"/>
+        </w:rPr>
+      </w:pPr>
+      <w:r>
+        <w:rPr>
+          <w:rFonts w:eastAsiaTheme="minorHAnsi"/>
+          <w:lang w:val="pt-AO"/>
+        </w:rPr>
+        <w:lastRenderedPageBreak/>
+        <w:t xml:space="preserve">3.2.2 </w:t>
+      </w:r>
+      <w:r>
+        <w:rPr>
+          <w:rFonts w:eastAsiaTheme="minorHAnsi"/>
+          <w:lang w:val="pt-AO"/>
+        </w:rPr>
+        <w:t>Não Funcionais</w:t>
+      </w:r>
+    </w:p>
+    <w:p>
+      <w:pPr>
         <w:pStyle w:val="NormalWeb"/>
+        <w:numPr>
+          <w:ilvl w:val="0"/>
+          <w:numId w:val="5"/>
+        </w:numPr>
         <w:spacing w:line="360" w:lineRule="auto"/>
         <w:rPr>
           <w:rFonts w:ascii="Arial" w:eastAsiaTheme="minorHAnsi" w:hAnsi="Arial" w:cs="Arial"/>
@@ -6798,12 +6413,16 @@
           <w:lang w:val="pt-AO" w:eastAsia="en-US"/>
           <w14:ligatures w14:val="standardContextual"/>
         </w:rPr>
-        <w:t>Não Funcionais</w:t>
+        <w:t>Usabilidade: O sistema deve ser fácil de usar, com interface clara e intuitiva, permitindo que qualquer usuário se familiarize rapidamente com suas funcionalidades, reduzindo dúvidas e erros no uso.</w:t>
       </w:r>
     </w:p>
     <w:p>
       <w:pPr>
         <w:pStyle w:val="NormalWeb"/>
+        <w:numPr>
+          <w:ilvl w:val="0"/>
+          <w:numId w:val="5"/>
+        </w:numPr>
         <w:spacing w:line="360" w:lineRule="auto"/>
         <w:rPr>
           <w:rFonts w:ascii="Arial" w:eastAsiaTheme="minorHAnsi" w:hAnsi="Arial" w:cs="Arial"/>
@@ -6813,11 +6432,7 @@
           <w14:ligatures w14:val="standardContextual"/>
         </w:rPr>
       </w:pPr>
-    </w:p>
-    <w:p>
-      <w:pPr>
-        <w:pStyle w:val="NormalWeb"/>
-        <w:spacing w:line="360" w:lineRule="auto"/>
+      <w:r>
         <w:rPr>
           <w:rFonts w:ascii="Arial" w:eastAsiaTheme="minorHAnsi" w:hAnsi="Arial" w:cs="Arial"/>
           <w:kern w:val="2"/>
@@ -6825,8 +6440,17 @@
           <w:lang w:val="pt-AO" w:eastAsia="en-US"/>
           <w14:ligatures w14:val="standardContextual"/>
         </w:rPr>
-      </w:pPr>
-      <w:r>
+        <w:t>Escalabilidade: A arquitetura modular do sistema permite a expansão com novos módulos sem comprometer sua estabilidade e funcionamento.</w:t>
+      </w:r>
+    </w:p>
+    <w:p>
+      <w:pPr>
+        <w:pStyle w:val="NormalWeb"/>
+        <w:numPr>
+          <w:ilvl w:val="0"/>
+          <w:numId w:val="5"/>
+        </w:numPr>
+        <w:spacing w:line="360" w:lineRule="auto"/>
         <w:rPr>
           <w:rFonts w:ascii="Arial" w:eastAsiaTheme="minorHAnsi" w:hAnsi="Arial" w:cs="Arial"/>
           <w:kern w:val="2"/>
@@ -6834,13 +6458,8 @@
           <w:lang w:val="pt-AO" w:eastAsia="en-US"/>
           <w14:ligatures w14:val="standardContextual"/>
         </w:rPr>
-        <w:t>Usabilidade: O sistema deve ser fácil de usar, com interface clara e intuitiva, permitindo que qualquer usuário se familiarize rapidamente com suas funcionalidades, reduzindo dúvidas e erros no uso.</w:t>
-      </w:r>
-    </w:p>
-    <w:p>
-      <w:pPr>
-        <w:pStyle w:val="NormalWeb"/>
-        <w:spacing w:line="360" w:lineRule="auto"/>
+      </w:pPr>
+      <w:r>
         <w:rPr>
           <w:rFonts w:ascii="Arial" w:eastAsiaTheme="minorHAnsi" w:hAnsi="Arial" w:cs="Arial"/>
           <w:kern w:val="2"/>
@@ -6848,12 +6467,25 @@
           <w:lang w:val="pt-AO" w:eastAsia="en-US"/>
           <w14:ligatures w14:val="standardContextual"/>
         </w:rPr>
-      </w:pPr>
+        <w:t>Desempenho: O sistema deve apresentar processamento rápido e eficiente, com código otimizado para garantir alta performance.</w:t>
+      </w:r>
     </w:p>
     <w:p>
       <w:pPr>
         <w:pStyle w:val="NormalWeb"/>
+        <w:numPr>
+          <w:ilvl w:val="0"/>
+          <w:numId w:val="5"/>
+        </w:numPr>
         <w:spacing w:line="360" w:lineRule="auto"/>
+        <w:jc w:val="both"/>
+        <w:rPr>
+          <w:rFonts w:ascii="Arial" w:hAnsi="Arial" w:cs="Arial"/>
+          <w:bCs/>
+          <w:lang w:val="pt-AO"/>
+        </w:rPr>
+      </w:pPr>
+      <w:r>
         <w:rPr>
           <w:rFonts w:ascii="Arial" w:eastAsiaTheme="minorHAnsi" w:hAnsi="Arial" w:cs="Arial"/>
           <w:kern w:val="2"/>
@@ -6861,86 +6493,6 @@
           <w:lang w:val="pt-AO" w:eastAsia="en-US"/>
           <w14:ligatures w14:val="standardContextual"/>
         </w:rPr>
-      </w:pPr>
-      <w:r>
-        <w:rPr>
-          <w:rFonts w:ascii="Arial" w:eastAsiaTheme="minorHAnsi" w:hAnsi="Arial" w:cs="Arial"/>
-          <w:kern w:val="2"/>
-          <w:szCs w:val="22"/>
-          <w:lang w:val="pt-AO" w:eastAsia="en-US"/>
-          <w14:ligatures w14:val="standardContextual"/>
-        </w:rPr>
-        <w:t>Escalabilidade: A arquitetura modular do sistema permite a expansão com novos módulos sem comprometer sua estabilidade e funcionamento.</w:t>
-      </w:r>
-    </w:p>
-    <w:p>
-      <w:pPr>
-        <w:pStyle w:val="NormalWeb"/>
-        <w:spacing w:line="360" w:lineRule="auto"/>
-        <w:rPr>
-          <w:rFonts w:ascii="Arial" w:eastAsiaTheme="minorHAnsi" w:hAnsi="Arial" w:cs="Arial"/>
-          <w:kern w:val="2"/>
-          <w:szCs w:val="22"/>
-          <w:lang w:val="pt-AO" w:eastAsia="en-US"/>
-          <w14:ligatures w14:val="standardContextual"/>
-        </w:rPr>
-      </w:pPr>
-    </w:p>
-    <w:p>
-      <w:pPr>
-        <w:pStyle w:val="NormalWeb"/>
-        <w:spacing w:line="360" w:lineRule="auto"/>
-        <w:rPr>
-          <w:rFonts w:ascii="Arial" w:eastAsiaTheme="minorHAnsi" w:hAnsi="Arial" w:cs="Arial"/>
-          <w:kern w:val="2"/>
-          <w:szCs w:val="22"/>
-          <w:lang w:val="pt-AO" w:eastAsia="en-US"/>
-          <w14:ligatures w14:val="standardContextual"/>
-        </w:rPr>
-      </w:pPr>
-      <w:r>
-        <w:rPr>
-          <w:rFonts w:ascii="Arial" w:eastAsiaTheme="minorHAnsi" w:hAnsi="Arial" w:cs="Arial"/>
-          <w:kern w:val="2"/>
-          <w:szCs w:val="22"/>
-          <w:lang w:val="pt-AO" w:eastAsia="en-US"/>
-          <w14:ligatures w14:val="standardContextual"/>
-        </w:rPr>
-        <w:t>Desempenho: O sistema deve apresentar processamento rápido e eficiente, com código otimizado para garantir alta performance.</w:t>
-      </w:r>
-    </w:p>
-    <w:p>
-      <w:pPr>
-        <w:pStyle w:val="NormalWeb"/>
-        <w:spacing w:line="360" w:lineRule="auto"/>
-        <w:rPr>
-          <w:rFonts w:ascii="Arial" w:eastAsiaTheme="minorHAnsi" w:hAnsi="Arial" w:cs="Arial"/>
-          <w:kern w:val="2"/>
-          <w:szCs w:val="22"/>
-          <w:lang w:val="pt-AO" w:eastAsia="en-US"/>
-          <w14:ligatures w14:val="standardContextual"/>
-        </w:rPr>
-      </w:pPr>
-    </w:p>
-    <w:p>
-      <w:pPr>
-        <w:pStyle w:val="NormalWeb"/>
-        <w:spacing w:line="360" w:lineRule="auto"/>
-        <w:jc w:val="both"/>
-        <w:rPr>
-          <w:rFonts w:ascii="Arial" w:hAnsi="Arial" w:cs="Arial"/>
-          <w:bCs/>
-          <w:lang w:val="pt-AO"/>
-        </w:rPr>
-      </w:pPr>
-      <w:r>
-        <w:rPr>
-          <w:rFonts w:ascii="Arial" w:eastAsiaTheme="minorHAnsi" w:hAnsi="Arial" w:cs="Arial"/>
-          <w:kern w:val="2"/>
-          <w:szCs w:val="22"/>
-          <w:lang w:val="pt-AO" w:eastAsia="en-US"/>
-          <w14:ligatures w14:val="standardContextual"/>
-        </w:rPr>
         <w:t>Segurança: O sistema deve ser seguro e robusto, garantindo a integridade dos dados e acesso restrito a usuários autorizados.</w:t>
       </w:r>
     </w:p>
@@ -6965,20 +6517,68 @@
     </w:p>
     <w:p>
       <w:pPr>
-        <w:jc w:val="center"/>
-        <w:rPr>
-          <w:rFonts w:cs="Arial"/>
-          <w:b/>
-          <w:sz w:val="32"/>
-        </w:rPr>
-      </w:pPr>
-      <w:r>
-        <w:rPr>
-          <w:rFonts w:cs="Arial"/>
-          <w:b/>
-          <w:sz w:val="32"/>
-        </w:rPr>
+        <w:pStyle w:val="Heading1"/>
+      </w:pPr>
+      <w:r>
+        <w:lastRenderedPageBreak/>
         <w:t>CAPÍTULO IV – RESULTADOS E DISCUSSÃO</w:t>
+      </w:r>
+    </w:p>
+    <w:p>
+      <w:pPr>
+        <w:ind w:firstLine="0"/>
+        <w:rPr>
+          <w:rFonts w:cs="Arial"/>
+        </w:rPr>
+      </w:pPr>
+      <w:r>
+        <w:rPr>
+          <w:rFonts w:cs="Arial"/>
+        </w:rPr>
+        <w:t>[RASCUNHOS]</w:t>
+      </w:r>
+    </w:p>
+    <w:p>
+      <w:pPr>
+        <w:ind w:firstLine="0"/>
+        <w:rPr>
+          <w:rFonts w:cs="Arial"/>
+        </w:rPr>
+      </w:pPr>
+      <w:r>
+        <w:rPr>
+          <w:rFonts w:cs="Arial"/>
+        </w:rPr>
+        <w:t>Rapidez na geração de documentos, o que levava quase 3 dias agora leva apenas 1 minuto</w:t>
+      </w:r>
+    </w:p>
+    <w:p>
+      <w:pPr>
+        <w:ind w:firstLine="0"/>
+        <w:rPr>
+          <w:rFonts w:cs="Arial"/>
+        </w:rPr>
+      </w:pPr>
+      <w:r>
+        <w:rPr>
+          <w:rFonts w:cs="Arial"/>
+        </w:rPr>
+        <w:t>Resução dos erros e troca de dados</w:t>
+      </w:r>
+    </w:p>
+    <w:p>
+      <w:pPr>
+        <w:ind w:firstLine="0"/>
+        <w:jc w:val="left"/>
+        <w:rPr>
+          <w:rFonts w:cs="Arial"/>
+        </w:rPr>
+      </w:pPr>
+      <w:r>
+        <w:rPr>
+          <w:rFonts w:cs="Arial"/>
+        </w:rPr>
+        <w:br w:type="page"/>
       </w:r>
     </w:p>
     <w:p>
@@ -7022,6 +6622,7 @@
           <w:rFonts w:cs="Arial"/>
           <w:lang w:val="pt-AO"/>
         </w:rPr>
+        <w:lastRenderedPageBreak/>
         <w:t>3 CONCLUSÃO</w:t>
       </w:r>
     </w:p>
@@ -7035,7 +6636,7 @@
         <w:rPr>
           <w:lang w:val="pt-AO"/>
         </w:rPr>
-        <w:t>O presente trabalho apresentou a concepção, o desenvolvimento e a fundamentação teórica de um sistema informatizado para a gestão de declarações escolares no Instituto Politécnico do Maiombe. A análise do contexto institucional evidenciou problemas relacionados à gestão manual de documentos, como atrasos na emissão, inconsistências nos dados e dificuldade de rastreabilidade, comprometendo a eficiência administrativa e a satisfação dos usuários.</w:t>
+        <w:t>O presente trabalho apresentou a concepção, o desenvolvimento de um sistema informatizado para a gestão de declarações escolares no Instituto Politécnico do Maiombe. A análise do contexto institucional evidenciou problemas relacionados à gestão manual de documentos, como atrasos na emissão, inconsistências nos dados e dificuldade de rastreabilidade, comprometendo a eficiência administrativa e a satisfação dos usuários.</w:t>
       </w:r>
     </w:p>
     <w:p>
@@ -7096,6 +6697,7 @@
           <w:rFonts w:cs="Arial"/>
           <w:lang w:val="pt-AO"/>
         </w:rPr>
+        <w:lastRenderedPageBreak/>
         <w:t>REFERÊNCIAS</w:t>
       </w:r>
     </w:p>
@@ -7480,6 +7082,7 @@
           <w:rFonts w:cs="Arial"/>
           <w:lang w:val="pt-AO"/>
         </w:rPr>
+        <w:lastRenderedPageBreak/>
         <w:t>GLOSSÁRIO</w:t>
       </w:r>
     </w:p>
@@ -7515,6 +7118,7 @@
           <w:rFonts w:cs="Arial"/>
           <w:lang w:val="pt-AO"/>
         </w:rPr>
+        <w:lastRenderedPageBreak/>
         <w:t>APÊNDICES</w:t>
       </w:r>
     </w:p>
@@ -7550,6 +7154,7 @@
           <w:rFonts w:cs="Arial"/>
           <w:lang w:val="pt-AO"/>
         </w:rPr>
+        <w:lastRenderedPageBreak/>
         <w:t>ANEXOS</w:t>
       </w:r>
     </w:p>
@@ -7605,102 +7210,16 @@
 <file path=word/numbering.xml><?xml version="1.0" encoding="utf-8"?>
 <w:numbering xmlns:wpc="http://schemas.microsoft.com/office/word/2010/wordprocessingCanvas" xmlns:cx="http://schemas.microsoft.com/office/drawing/2014/chartex" xmlns:cx1="http://schemas.microsoft.com/office/drawing/2015/9/8/chartex" xmlns:cx2="http://schemas.microsoft.com/office/drawing/2015/10/21/chartex" xmlns:cx3="http://schemas.microsoft.com/office/drawing/2016/5/9/chartex" xmlns:cx4="http://schemas.microsoft.com/office/drawing/2016/5/10/chartex" xmlns:cx5="http://schemas.microsoft.com/office/drawing/2016/5/11/chartex" xmlns:cx6="http://schemas.microsoft.com/office/drawing/2016/5/12/chartex" xmlns:cx7="http://schemas.microsoft.com/office/drawing/2016/5/13/chartex" xmlns:cx8="http://schemas.microsoft.com/office/drawing/2016/5/14/chartex" xmlns:mc="http://schemas.openxmlformats.org/markup-compatibility/2006" xmlns:aink="http://schemas.microsoft.com/office/drawing/2016/ink" xmlns:am3d="http://schemas.microsoft.com/office/drawing/2017/model3d" xmlns:o="urn:schemas-microsoft-com:office:office" xmlns:oel="http://schemas.microsoft.com/office/2019/extlst" xmlns:r="http://schemas.openxmlformats.org/officeDocument/2006/relationships" xmlns:m="http://schemas.openxmlformats.org/officeDocument/2006/math" xmlns:v="urn:schemas-microsoft-com:vml" xmlns:wp14="http://schemas.microsoft.com/office/word/2010/wordprocessingDrawing" xmlns:wp="http://schemas.openxmlformats.org/drawingml/2006/wordprocessingDrawing" xmlns:w10="urn:schemas-microsoft-com:office:word" xmlns:w="http://schemas.openxmlformats.org/wordprocessingml/2006/main" xmlns:w14="http://schemas.microsoft.com/office/word/2010/wordml" xmlns:w15="http://schemas.microsoft.com/office/word/2012/wordml" xmlns:w16cex="http://schemas.microsoft.com/office/word/2018/wordml/cex" xmlns:w16cid="http://schemas.microsoft.com/office/word/2016/wordml/cid" xmlns:w16="http://schemas.microsoft.com/office/word/2018/wordml" xmlns:w16du="http://schemas.microsoft.com/office/word/2023/wordml/word16du" xmlns:w16sdtdh="http://schemas.microsoft.com/office/word/2020/wordml/sdtdatahash" xmlns:w16sdtfl="http://schemas.microsoft.com/office/word/2024/wordml/sdtformatlock" xmlns:w16se="http://schemas.microsoft.com/office/word/2015/wordml/symex" xmlns:wpg="http://schemas.microsoft.com/office/word/2010/wordprocessingGroup" xmlns:wpi="http://schemas.microsoft.com/office/word/2010/wordprocessingInk" xmlns:wne="http://schemas.microsoft.com/office/word/2006/wordml" xmlns:wps="http://schemas.microsoft.com/office/word/2010/wordprocessingShape" mc:Ignorable="w14 w15 w16se w16cid w16 w16cex w16sdtdh w16sdtfl w16du wp14">
   <w:abstractNum w:abstractNumId="0" w15:restartNumberingAfterBreak="0">
-    <w:nsid w:val="45E3649F"/>
+    <w:nsid w:val="08E97504"/>
     <w:multiLevelType w:val="hybridMultilevel"/>
-    <w:tmpl w:val="018EEFA8"/>
-    <w:lvl w:ilvl="0" w:tplc="0C00000F">
-      <w:start w:val="1"/>
-      <w:numFmt w:val="decimal"/>
-      <w:lvlText w:val="%1."/>
-      <w:lvlJc w:val="left"/>
-      <w:pPr>
-        <w:ind w:left="1429" w:hanging="360"/>
-      </w:pPr>
-    </w:lvl>
-    <w:lvl w:ilvl="1" w:tplc="0C000019" w:tentative="1">
-      <w:start w:val="1"/>
-      <w:numFmt w:val="lowerLetter"/>
-      <w:lvlText w:val="%2."/>
-      <w:lvlJc w:val="left"/>
-      <w:pPr>
-        <w:ind w:left="2149" w:hanging="360"/>
-      </w:pPr>
-    </w:lvl>
-    <w:lvl w:ilvl="2" w:tplc="0C00001B" w:tentative="1">
-      <w:start w:val="1"/>
-      <w:numFmt w:val="lowerRoman"/>
-      <w:lvlText w:val="%3."/>
-      <w:lvlJc w:val="right"/>
-      <w:pPr>
-        <w:ind w:left="2869" w:hanging="180"/>
-      </w:pPr>
-    </w:lvl>
-    <w:lvl w:ilvl="3" w:tplc="0C00000F" w:tentative="1">
-      <w:start w:val="1"/>
-      <w:numFmt w:val="decimal"/>
-      <w:lvlText w:val="%4."/>
-      <w:lvlJc w:val="left"/>
-      <w:pPr>
-        <w:ind w:left="3589" w:hanging="360"/>
-      </w:pPr>
-    </w:lvl>
-    <w:lvl w:ilvl="4" w:tplc="0C000019" w:tentative="1">
-      <w:start w:val="1"/>
-      <w:numFmt w:val="lowerLetter"/>
-      <w:lvlText w:val="%5."/>
-      <w:lvlJc w:val="left"/>
-      <w:pPr>
-        <w:ind w:left="4309" w:hanging="360"/>
-      </w:pPr>
-    </w:lvl>
-    <w:lvl w:ilvl="5" w:tplc="0C00001B" w:tentative="1">
-      <w:start w:val="1"/>
-      <w:numFmt w:val="lowerRoman"/>
-      <w:lvlText w:val="%6."/>
-      <w:lvlJc w:val="right"/>
-      <w:pPr>
-        <w:ind w:left="5029" w:hanging="180"/>
-      </w:pPr>
-    </w:lvl>
-    <w:lvl w:ilvl="6" w:tplc="0C00000F" w:tentative="1">
-      <w:start w:val="1"/>
-      <w:numFmt w:val="decimal"/>
-      <w:lvlText w:val="%7."/>
-      <w:lvlJc w:val="left"/>
-      <w:pPr>
-        <w:ind w:left="5749" w:hanging="360"/>
-      </w:pPr>
-    </w:lvl>
-    <w:lvl w:ilvl="7" w:tplc="0C000019" w:tentative="1">
-      <w:start w:val="1"/>
-      <w:numFmt w:val="lowerLetter"/>
-      <w:lvlText w:val="%8."/>
-      <w:lvlJc w:val="left"/>
-      <w:pPr>
-        <w:ind w:left="6469" w:hanging="360"/>
-      </w:pPr>
-    </w:lvl>
-    <w:lvl w:ilvl="8" w:tplc="0C00001B" w:tentative="1">
-      <w:start w:val="1"/>
-      <w:numFmt w:val="lowerRoman"/>
-      <w:lvlText w:val="%9."/>
-      <w:lvlJc w:val="right"/>
-      <w:pPr>
-        <w:ind w:left="7189" w:hanging="180"/>
-      </w:pPr>
-    </w:lvl>
-  </w:abstractNum>
-  <w:abstractNum w:abstractNumId="1" w15:restartNumberingAfterBreak="0">
-    <w:nsid w:val="4F791AA1"/>
-    <w:multiLevelType w:val="hybridMultilevel"/>
-    <w:tmpl w:val="77043C60"/>
+    <w:tmpl w:val="BC20B8F4"/>
     <w:lvl w:ilvl="0" w:tplc="0816000B">
       <w:start w:val="1"/>
       <w:numFmt w:val="bullet"/>
       <w:lvlText w:val=""/>
       <w:lvlJc w:val="left"/>
       <w:pPr>
-        <w:ind w:left="1429" w:hanging="360"/>
+        <w:ind w:left="720" w:hanging="360"/>
       </w:pPr>
       <w:rPr>
         <w:rFonts w:ascii="Wingdings" w:hAnsi="Wingdings" w:hint="default"/>
@@ -7712,7 +7231,7 @@
       <w:lvlText w:val="o"/>
       <w:lvlJc w:val="left"/>
       <w:pPr>
-        <w:ind w:left="2149" w:hanging="360"/>
+        <w:ind w:left="1440" w:hanging="360"/>
       </w:pPr>
       <w:rPr>
         <w:rFonts w:ascii="Courier New" w:hAnsi="Courier New" w:cs="Courier New" w:hint="default"/>
@@ -7724,7 +7243,7 @@
       <w:lvlText w:val=""/>
       <w:lvlJc w:val="left"/>
       <w:pPr>
-        <w:ind w:left="2869" w:hanging="360"/>
+        <w:ind w:left="2160" w:hanging="360"/>
       </w:pPr>
       <w:rPr>
         <w:rFonts w:ascii="Wingdings" w:hAnsi="Wingdings" w:hint="default"/>
@@ -7736,7 +7255,7 @@
       <w:lvlText w:val=""/>
       <w:lvlJc w:val="left"/>
       <w:pPr>
-        <w:ind w:left="3589" w:hanging="360"/>
+        <w:ind w:left="2880" w:hanging="360"/>
       </w:pPr>
       <w:rPr>
         <w:rFonts w:ascii="Symbol" w:hAnsi="Symbol" w:hint="default"/>
@@ -7748,7 +7267,7 @@
       <w:lvlText w:val="o"/>
       <w:lvlJc w:val="left"/>
       <w:pPr>
-        <w:ind w:left="4309" w:hanging="360"/>
+        <w:ind w:left="3600" w:hanging="360"/>
       </w:pPr>
       <w:rPr>
         <w:rFonts w:ascii="Courier New" w:hAnsi="Courier New" w:cs="Courier New" w:hint="default"/>
@@ -7760,7 +7279,7 @@
       <w:lvlText w:val=""/>
       <w:lvlJc w:val="left"/>
       <w:pPr>
-        <w:ind w:left="5029" w:hanging="360"/>
+        <w:ind w:left="4320" w:hanging="360"/>
       </w:pPr>
       <w:rPr>
         <w:rFonts w:ascii="Wingdings" w:hAnsi="Wingdings" w:hint="default"/>
@@ -7772,7 +7291,7 @@
       <w:lvlText w:val=""/>
       <w:lvlJc w:val="left"/>
       <w:pPr>
-        <w:ind w:left="5749" w:hanging="360"/>
+        <w:ind w:left="5040" w:hanging="360"/>
       </w:pPr>
       <w:rPr>
         <w:rFonts w:ascii="Symbol" w:hAnsi="Symbol" w:hint="default"/>
@@ -7784,7 +7303,7 @@
       <w:lvlText w:val="o"/>
       <w:lvlJc w:val="left"/>
       <w:pPr>
-        <w:ind w:left="6469" w:hanging="360"/>
+        <w:ind w:left="5760" w:hanging="360"/>
       </w:pPr>
       <w:rPr>
         <w:rFonts w:ascii="Courier New" w:hAnsi="Courier New" w:cs="Courier New" w:hint="default"/>
@@ -7796,7 +7315,120 @@
       <w:lvlText w:val=""/>
       <w:lvlJc w:val="left"/>
       <w:pPr>
-        <w:ind w:left="7189" w:hanging="360"/>
+        <w:ind w:left="6480" w:hanging="360"/>
+      </w:pPr>
+      <w:rPr>
+        <w:rFonts w:ascii="Wingdings" w:hAnsi="Wingdings" w:hint="default"/>
+      </w:rPr>
+    </w:lvl>
+  </w:abstractNum>
+  <w:abstractNum w:abstractNumId="1" w15:restartNumberingAfterBreak="0">
+    <w:nsid w:val="385F63C3"/>
+    <w:multiLevelType w:val="hybridMultilevel"/>
+    <w:tmpl w:val="D4D0CCCC"/>
+    <w:lvl w:ilvl="0" w:tplc="0816000B">
+      <w:start w:val="1"/>
+      <w:numFmt w:val="bullet"/>
+      <w:lvlText w:val=""/>
+      <w:lvlJc w:val="left"/>
+      <w:pPr>
+        <w:ind w:left="720" w:hanging="360"/>
+      </w:pPr>
+      <w:rPr>
+        <w:rFonts w:ascii="Wingdings" w:hAnsi="Wingdings" w:hint="default"/>
+      </w:rPr>
+    </w:lvl>
+    <w:lvl w:ilvl="1" w:tplc="0C000003" w:tentative="1">
+      <w:start w:val="1"/>
+      <w:numFmt w:val="bullet"/>
+      <w:lvlText w:val="o"/>
+      <w:lvlJc w:val="left"/>
+      <w:pPr>
+        <w:ind w:left="1440" w:hanging="360"/>
+      </w:pPr>
+      <w:rPr>
+        <w:rFonts w:ascii="Courier New" w:hAnsi="Courier New" w:cs="Courier New" w:hint="default"/>
+      </w:rPr>
+    </w:lvl>
+    <w:lvl w:ilvl="2" w:tplc="0C000005" w:tentative="1">
+      <w:start w:val="1"/>
+      <w:numFmt w:val="bullet"/>
+      <w:lvlText w:val=""/>
+      <w:lvlJc w:val="left"/>
+      <w:pPr>
+        <w:ind w:left="2160" w:hanging="360"/>
+      </w:pPr>
+      <w:rPr>
+        <w:rFonts w:ascii="Wingdings" w:hAnsi="Wingdings" w:hint="default"/>
+      </w:rPr>
+    </w:lvl>
+    <w:lvl w:ilvl="3" w:tplc="0C000001" w:tentative="1">
+      <w:start w:val="1"/>
+      <w:numFmt w:val="bullet"/>
+      <w:lvlText w:val=""/>
+      <w:lvlJc w:val="left"/>
+      <w:pPr>
+        <w:ind w:left="2880" w:hanging="360"/>
+      </w:pPr>
+      <w:rPr>
+        <w:rFonts w:ascii="Symbol" w:hAnsi="Symbol" w:hint="default"/>
+      </w:rPr>
+    </w:lvl>
+    <w:lvl w:ilvl="4" w:tplc="0C000003" w:tentative="1">
+      <w:start w:val="1"/>
+      <w:numFmt w:val="bullet"/>
+      <w:lvlText w:val="o"/>
+      <w:lvlJc w:val="left"/>
+      <w:pPr>
+        <w:ind w:left="3600" w:hanging="360"/>
+      </w:pPr>
+      <w:rPr>
+        <w:rFonts w:ascii="Courier New" w:hAnsi="Courier New" w:cs="Courier New" w:hint="default"/>
+      </w:rPr>
+    </w:lvl>
+    <w:lvl w:ilvl="5" w:tplc="0C000005" w:tentative="1">
+      <w:start w:val="1"/>
+      <w:numFmt w:val="bullet"/>
+      <w:lvlText w:val=""/>
+      <w:lvlJc w:val="left"/>
+      <w:pPr>
+        <w:ind w:left="4320" w:hanging="360"/>
+      </w:pPr>
+      <w:rPr>
+        <w:rFonts w:ascii="Wingdings" w:hAnsi="Wingdings" w:hint="default"/>
+      </w:rPr>
+    </w:lvl>
+    <w:lvl w:ilvl="6" w:tplc="0C000001" w:tentative="1">
+      <w:start w:val="1"/>
+      <w:numFmt w:val="bullet"/>
+      <w:lvlText w:val=""/>
+      <w:lvlJc w:val="left"/>
+      <w:pPr>
+        <w:ind w:left="5040" w:hanging="360"/>
+      </w:pPr>
+      <w:rPr>
+        <w:rFonts w:ascii="Symbol" w:hAnsi="Symbol" w:hint="default"/>
+      </w:rPr>
+    </w:lvl>
+    <w:lvl w:ilvl="7" w:tplc="0C000003" w:tentative="1">
+      <w:start w:val="1"/>
+      <w:numFmt w:val="bullet"/>
+      <w:lvlText w:val="o"/>
+      <w:lvlJc w:val="left"/>
+      <w:pPr>
+        <w:ind w:left="5760" w:hanging="360"/>
+      </w:pPr>
+      <w:rPr>
+        <w:rFonts w:ascii="Courier New" w:hAnsi="Courier New" w:cs="Courier New" w:hint="default"/>
+      </w:rPr>
+    </w:lvl>
+    <w:lvl w:ilvl="8" w:tplc="0C000005" w:tentative="1">
+      <w:start w:val="1"/>
+      <w:numFmt w:val="bullet"/>
+      <w:lvlText w:val=""/>
+      <w:lvlJc w:val="left"/>
+      <w:pPr>
+        <w:ind w:left="6480" w:hanging="360"/>
       </w:pPr>
       <w:rPr>
         <w:rFonts w:ascii="Wingdings" w:hAnsi="Wingdings" w:hint="default"/>
@@ -7804,6 +7436,205 @@
     </w:lvl>
   </w:abstractNum>
   <w:abstractNum w:abstractNumId="2" w15:restartNumberingAfterBreak="0">
+    <w:nsid w:val="45E3649F"/>
+    <w:multiLevelType w:val="hybridMultilevel"/>
+    <w:tmpl w:val="018EEFA8"/>
+    <w:lvl w:ilvl="0" w:tplc="0C00000F">
+      <w:start w:val="1"/>
+      <w:numFmt w:val="decimal"/>
+      <w:lvlText w:val="%1."/>
+      <w:lvlJc w:val="left"/>
+      <w:pPr>
+        <w:ind w:left="1429" w:hanging="360"/>
+      </w:pPr>
+    </w:lvl>
+    <w:lvl w:ilvl="1" w:tplc="0C000019" w:tentative="1">
+      <w:start w:val="1"/>
+      <w:numFmt w:val="lowerLetter"/>
+      <w:lvlText w:val="%2."/>
+      <w:lvlJc w:val="left"/>
+      <w:pPr>
+        <w:ind w:left="2149" w:hanging="360"/>
+      </w:pPr>
+    </w:lvl>
+    <w:lvl w:ilvl="2" w:tplc="0C00001B" w:tentative="1">
+      <w:start w:val="1"/>
+      <w:numFmt w:val="lowerRoman"/>
+      <w:lvlText w:val="%3."/>
+      <w:lvlJc w:val="right"/>
+      <w:pPr>
+        <w:ind w:left="2869" w:hanging="180"/>
+      </w:pPr>
+    </w:lvl>
+    <w:lvl w:ilvl="3" w:tplc="0C00000F" w:tentative="1">
+      <w:start w:val="1"/>
+      <w:numFmt w:val="decimal"/>
+      <w:lvlText w:val="%4."/>
+      <w:lvlJc w:val="left"/>
+      <w:pPr>
+        <w:ind w:left="3589" w:hanging="360"/>
+      </w:pPr>
+    </w:lvl>
+    <w:lvl w:ilvl="4" w:tplc="0C000019" w:tentative="1">
+      <w:start w:val="1"/>
+      <w:numFmt w:val="lowerLetter"/>
+      <w:lvlText w:val="%5."/>
+      <w:lvlJc w:val="left"/>
+      <w:pPr>
+        <w:ind w:left="4309" w:hanging="360"/>
+      </w:pPr>
+    </w:lvl>
+    <w:lvl w:ilvl="5" w:tplc="0C00001B" w:tentative="1">
+      <w:start w:val="1"/>
+      <w:numFmt w:val="lowerRoman"/>
+      <w:lvlText w:val="%6."/>
+      <w:lvlJc w:val="right"/>
+      <w:pPr>
+        <w:ind w:left="5029" w:hanging="180"/>
+      </w:pPr>
+    </w:lvl>
+    <w:lvl w:ilvl="6" w:tplc="0C00000F" w:tentative="1">
+      <w:start w:val="1"/>
+      <w:numFmt w:val="decimal"/>
+      <w:lvlText w:val="%7."/>
+      <w:lvlJc w:val="left"/>
+      <w:pPr>
+        <w:ind w:left="5749" w:hanging="360"/>
+      </w:pPr>
+    </w:lvl>
+    <w:lvl w:ilvl="7" w:tplc="0C000019" w:tentative="1">
+      <w:start w:val="1"/>
+      <w:numFmt w:val="lowerLetter"/>
+      <w:lvlText w:val="%8."/>
+      <w:lvlJc w:val="left"/>
+      <w:pPr>
+        <w:ind w:left="6469" w:hanging="360"/>
+      </w:pPr>
+    </w:lvl>
+    <w:lvl w:ilvl="8" w:tplc="0C00001B" w:tentative="1">
+      <w:start w:val="1"/>
+      <w:numFmt w:val="lowerRoman"/>
+      <w:lvlText w:val="%9."/>
+      <w:lvlJc w:val="right"/>
+      <w:pPr>
+        <w:ind w:left="7189" w:hanging="180"/>
+      </w:pPr>
+    </w:lvl>
+  </w:abstractNum>
+  <w:abstractNum w:abstractNumId="3" w15:restartNumberingAfterBreak="0">
+    <w:nsid w:val="4F791AA1"/>
+    <w:multiLevelType w:val="hybridMultilevel"/>
+    <w:tmpl w:val="77043C60"/>
+    <w:lvl w:ilvl="0" w:tplc="0816000B">
+      <w:start w:val="1"/>
+      <w:numFmt w:val="bullet"/>
+      <w:lvlText w:val=""/>
+      <w:lvlJc w:val="left"/>
+      <w:pPr>
+        <w:ind w:left="1429" w:hanging="360"/>
+      </w:pPr>
+      <w:rPr>
+        <w:rFonts w:ascii="Wingdings" w:hAnsi="Wingdings" w:hint="default"/>
+      </w:rPr>
+    </w:lvl>
+    <w:lvl w:ilvl="1" w:tplc="0C000003" w:tentative="1">
+      <w:start w:val="1"/>
+      <w:numFmt w:val="bullet"/>
+      <w:lvlText w:val="o"/>
+      <w:lvlJc w:val="left"/>
+      <w:pPr>
+        <w:ind w:left="2149" w:hanging="360"/>
+      </w:pPr>
+      <w:rPr>
+        <w:rFonts w:ascii="Courier New" w:hAnsi="Courier New" w:cs="Courier New" w:hint="default"/>
+      </w:rPr>
+    </w:lvl>
+    <w:lvl w:ilvl="2" w:tplc="0C000005" w:tentative="1">
+      <w:start w:val="1"/>
+      <w:numFmt w:val="bullet"/>
+      <w:lvlText w:val=""/>
+      <w:lvlJc w:val="left"/>
+      <w:pPr>
+        <w:ind w:left="2869" w:hanging="360"/>
+      </w:pPr>
+      <w:rPr>
+        <w:rFonts w:ascii="Wingdings" w:hAnsi="Wingdings" w:hint="default"/>
+      </w:rPr>
+    </w:lvl>
+    <w:lvl w:ilvl="3" w:tplc="0C000001" w:tentative="1">
+      <w:start w:val="1"/>
+      <w:numFmt w:val="bullet"/>
+      <w:lvlText w:val=""/>
+      <w:lvlJc w:val="left"/>
+      <w:pPr>
+        <w:ind w:left="3589" w:hanging="360"/>
+      </w:pPr>
+      <w:rPr>
+        <w:rFonts w:ascii="Symbol" w:hAnsi="Symbol" w:hint="default"/>
+      </w:rPr>
+    </w:lvl>
+    <w:lvl w:ilvl="4" w:tplc="0C000003" w:tentative="1">
+      <w:start w:val="1"/>
+      <w:numFmt w:val="bullet"/>
+      <w:lvlText w:val="o"/>
+      <w:lvlJc w:val="left"/>
+      <w:pPr>
+        <w:ind w:left="4309" w:hanging="360"/>
+      </w:pPr>
+      <w:rPr>
+        <w:rFonts w:ascii="Courier New" w:hAnsi="Courier New" w:cs="Courier New" w:hint="default"/>
+      </w:rPr>
+    </w:lvl>
+    <w:lvl w:ilvl="5" w:tplc="0C000005" w:tentative="1">
+      <w:start w:val="1"/>
+      <w:numFmt w:val="bullet"/>
+      <w:lvlText w:val=""/>
+      <w:lvlJc w:val="left"/>
+      <w:pPr>
+        <w:ind w:left="5029" w:hanging="360"/>
+      </w:pPr>
+      <w:rPr>
+        <w:rFonts w:ascii="Wingdings" w:hAnsi="Wingdings" w:hint="default"/>
+      </w:rPr>
+    </w:lvl>
+    <w:lvl w:ilvl="6" w:tplc="0C000001" w:tentative="1">
+      <w:start w:val="1"/>
+      <w:numFmt w:val="bullet"/>
+      <w:lvlText w:val=""/>
+      <w:lvlJc w:val="left"/>
+      <w:pPr>
+        <w:ind w:left="5749" w:hanging="360"/>
+      </w:pPr>
+      <w:rPr>
+        <w:rFonts w:ascii="Symbol" w:hAnsi="Symbol" w:hint="default"/>
+      </w:rPr>
+    </w:lvl>
+    <w:lvl w:ilvl="7" w:tplc="0C000003" w:tentative="1">
+      <w:start w:val="1"/>
+      <w:numFmt w:val="bullet"/>
+      <w:lvlText w:val="o"/>
+      <w:lvlJc w:val="left"/>
+      <w:pPr>
+        <w:ind w:left="6469" w:hanging="360"/>
+      </w:pPr>
+      <w:rPr>
+        <w:rFonts w:ascii="Courier New" w:hAnsi="Courier New" w:cs="Courier New" w:hint="default"/>
+      </w:rPr>
+    </w:lvl>
+    <w:lvl w:ilvl="8" w:tplc="0C000005" w:tentative="1">
+      <w:start w:val="1"/>
+      <w:numFmt w:val="bullet"/>
+      <w:lvlText w:val=""/>
+      <w:lvlJc w:val="left"/>
+      <w:pPr>
+        <w:ind w:left="7189" w:hanging="360"/>
+      </w:pPr>
+      <w:rPr>
+        <w:rFonts w:ascii="Wingdings" w:hAnsi="Wingdings" w:hint="default"/>
+      </w:rPr>
+    </w:lvl>
+  </w:abstractNum>
+  <w:abstractNum w:abstractNumId="4" w15:restartNumberingAfterBreak="0">
     <w:nsid w:val="6C9B4E4D"/>
     <w:multiLevelType w:val="hybridMultilevel"/>
     <w:tmpl w:val="2E1EBA7C"/>
@@ -7917,13 +7748,19 @@
     </w:lvl>
   </w:abstractNum>
   <w:num w:numId="1" w16cid:durableId="948661166">
+    <w:abstractNumId w:val="2"/>
+  </w:num>
+  <w:num w:numId="2" w16cid:durableId="599027378">
+    <w:abstractNumId w:val="3"/>
+  </w:num>
+  <w:num w:numId="3" w16cid:durableId="145166325">
+    <w:abstractNumId w:val="4"/>
+  </w:num>
+  <w:num w:numId="4" w16cid:durableId="190847828">
     <w:abstractNumId w:val="0"/>
   </w:num>
-  <w:num w:numId="2" w16cid:durableId="599027378">
+  <w:num w:numId="5" w16cid:durableId="2008828710">
     <w:abstractNumId w:val="1"/>
-  </w:num>
-  <w:num w:numId="3" w16cid:durableId="145166325">
-    <w:abstractNumId w:val="2"/>
   </w:num>
 </w:numbering>
 </file>
@@ -8398,10 +8235,9 @@
     <w:next w:val="Normal"/>
     <w:link w:val="Heading3Char"/>
     <w:uiPriority w:val="9"/>
-    <w:semiHidden/>
     <w:unhideWhenUsed/>
     <w:qFormat/>
-    <w:rsid w:val="00B25BB3"/>
+    <w:rsid w:val="00BF19C8"/>
     <w:pPr>
       <w:keepNext/>
       <w:keepLines/>
@@ -8410,8 +8246,8 @@
     </w:pPr>
     <w:rPr>
       <w:rFonts w:eastAsiaTheme="majorEastAsia" w:cstheme="majorBidi"/>
-      <w:color w:val="A5A5A5" w:themeColor="accent1" w:themeShade="BF"/>
-      <w:sz w:val="28"/>
+      <w:b/>
+      <w:color w:val="0D0D0D" w:themeColor="text1" w:themeTint="F2"/>
       <w:szCs w:val="28"/>
     </w:rPr>
   </w:style>
@@ -8550,6 +8386,7 @@
   <w:style w:type="character" w:default="1" w:styleId="DefaultParagraphFont">
     <w:name w:val="Default Paragraph Font"/>
     <w:uiPriority w:val="1"/>
+    <w:semiHidden/>
     <w:unhideWhenUsed/>
   </w:style>
   <w:style w:type="table" w:default="1" w:styleId="TableNormal">
@@ -8617,12 +8454,12 @@
     <w:basedOn w:val="DefaultParagraphFont"/>
     <w:link w:val="Heading3"/>
     <w:uiPriority w:val="9"/>
-    <w:semiHidden/>
-    <w:rsid w:val="00B25BB3"/>
+    <w:rsid w:val="00BF19C8"/>
     <w:rPr>
-      <w:rFonts w:eastAsiaTheme="majorEastAsia" w:cstheme="majorBidi"/>
-      <w:color w:val="A5A5A5" w:themeColor="accent1" w:themeShade="BF"/>
-      <w:sz w:val="28"/>
+      <w:rFonts w:ascii="Arial" w:eastAsiaTheme="majorEastAsia" w:hAnsi="Arial" w:cstheme="majorBidi"/>
+      <w:b/>
+      <w:color w:val="0D0D0D" w:themeColor="text1" w:themeTint="F2"/>
+      <w:sz w:val="24"/>
       <w:szCs w:val="28"/>
     </w:rPr>
   </w:style>
@@ -8965,6 +8802,79 @@
       <w14:ligatures w14:val="none"/>
     </w:rPr>
   </w:style>
+  <w:style w:type="paragraph" w:styleId="TOCHeading">
+    <w:name w:val="TOC Heading"/>
+    <w:basedOn w:val="Heading1"/>
+    <w:next w:val="Normal"/>
+    <w:uiPriority w:val="39"/>
+    <w:unhideWhenUsed/>
+    <w:qFormat/>
+    <w:rsid w:val="001833E6"/>
+    <w:pPr>
+      <w:spacing w:before="240" w:after="0"/>
+      <w:jc w:val="left"/>
+      <w:outlineLvl w:val="9"/>
+    </w:pPr>
+    <w:rPr>
+      <w:rFonts w:asciiTheme="majorHAnsi" w:hAnsiTheme="majorHAnsi"/>
+      <w:b w:val="0"/>
+      <w:color w:val="A5A5A5" w:themeColor="accent1" w:themeShade="BF"/>
+      <w:kern w:val="0"/>
+      <w:sz w:val="32"/>
+      <w:szCs w:val="32"/>
+      <w:lang w:val="en-US"/>
+      <w14:ligatures w14:val="none"/>
+    </w:rPr>
+  </w:style>
+  <w:style w:type="paragraph" w:styleId="TOC1">
+    <w:name w:val="toc 1"/>
+    <w:basedOn w:val="Normal"/>
+    <w:next w:val="Normal"/>
+    <w:autoRedefine/>
+    <w:uiPriority w:val="39"/>
+    <w:unhideWhenUsed/>
+    <w:rsid w:val="001833E6"/>
+    <w:pPr>
+      <w:spacing w:after="100"/>
+    </w:pPr>
+  </w:style>
+  <w:style w:type="paragraph" w:styleId="TOC2">
+    <w:name w:val="toc 2"/>
+    <w:basedOn w:val="Normal"/>
+    <w:next w:val="Normal"/>
+    <w:autoRedefine/>
+    <w:uiPriority w:val="39"/>
+    <w:unhideWhenUsed/>
+    <w:rsid w:val="001833E6"/>
+    <w:pPr>
+      <w:spacing w:after="100"/>
+      <w:ind w:left="240"/>
+    </w:pPr>
+  </w:style>
+  <w:style w:type="paragraph" w:styleId="TOC3">
+    <w:name w:val="toc 3"/>
+    <w:basedOn w:val="Normal"/>
+    <w:next w:val="Normal"/>
+    <w:autoRedefine/>
+    <w:uiPriority w:val="39"/>
+    <w:unhideWhenUsed/>
+    <w:rsid w:val="001833E6"/>
+    <w:pPr>
+      <w:spacing w:after="100"/>
+      <w:ind w:left="480"/>
+    </w:pPr>
+  </w:style>
+  <w:style w:type="character" w:styleId="Hyperlink">
+    <w:name w:val="Hyperlink"/>
+    <w:basedOn w:val="DefaultParagraphFont"/>
+    <w:uiPriority w:val="99"/>
+    <w:unhideWhenUsed/>
+    <w:rsid w:val="001833E6"/>
+    <w:rPr>
+      <w:color w:val="5F5F5F" w:themeColor="hyperlink"/>
+      <w:u w:val="single"/>
+    </w:rPr>
+  </w:style>
 </w:styles>
 </file>
 
@@ -9250,4 +9160,16 @@
     </a:ext>
   </a:extLst>
 </a:theme>
+</file>
+
+<file path=customXml/item1.xml><?xml version="1.0" encoding="utf-8"?>
+<b:Sources xmlns:b="http://schemas.openxmlformats.org/officeDocument/2006/bibliography" xmlns="http://schemas.openxmlformats.org/officeDocument/2006/bibliography" SelectedStyle="\APASixthEditionOfficeOnline.xsl" StyleName="APA" Version="6"/>
+</file>
+
+<file path=customXml/itemProps1.xml><?xml version="1.0" encoding="utf-8"?>
+<ds:datastoreItem xmlns:ds="http://schemas.openxmlformats.org/officeDocument/2006/customXml" ds:itemID="{84C511B8-003F-4725-B1D3-C9767E6FCFB6}">
+  <ds:schemaRefs>
+    <ds:schemaRef ds:uri="http://schemas.openxmlformats.org/officeDocument/2006/bibliography"/>
+  </ds:schemaRefs>
+</ds:datastoreItem>
 </file>
</xml_diff>